<commit_message>
docs: replace black code block backgrounds with light grey (#EFEFEF)
</commit_message>
<xml_diff>
--- a/documentation/technical-howto.docx
+++ b/documentation/technical-howto.docx
@@ -97,7 +97,7 @@
             <w:r>
               <w:rPr>
                 <w:rFonts w:ascii="Courier New" w:cs="Courier New" w:eastAsia="Courier New" w:hAnsi="Courier New"/>
-                <w:color w:val="444444"/>
+                <w:color w:val="222222"/>
                 <w:sz w:val="18"/>
                 <w:szCs w:val="18"/>
               </w:rPr>
@@ -141,7 +141,7 @@
             <w:r>
               <w:rPr>
                 <w:rFonts w:ascii="Courier New" w:cs="Courier New" w:eastAsia="Courier New" w:hAnsi="Courier New"/>
-                <w:color w:val="444444"/>
+                <w:color w:val="222222"/>
                 <w:sz w:val="18"/>
                 <w:szCs w:val="18"/>
               </w:rPr>
@@ -185,7 +185,7 @@
             <w:r>
               <w:rPr>
                 <w:rFonts w:ascii="Courier New" w:cs="Courier New" w:eastAsia="Courier New" w:hAnsi="Courier New"/>
-                <w:color w:val="444444"/>
+                <w:color w:val="222222"/>
                 <w:sz w:val="18"/>
                 <w:szCs w:val="18"/>
               </w:rPr>
@@ -229,7 +229,7 @@
             <w:r>
               <w:rPr>
                 <w:rFonts w:ascii="Courier New" w:cs="Courier New" w:eastAsia="Courier New" w:hAnsi="Courier New"/>
-                <w:color w:val="444444"/>
+                <w:color w:val="222222"/>
                 <w:sz w:val="18"/>
                 <w:szCs w:val="18"/>
               </w:rPr>
@@ -273,7 +273,7 @@
             <w:r>
               <w:rPr>
                 <w:rFonts w:ascii="Courier New" w:cs="Courier New" w:eastAsia="Courier New" w:hAnsi="Courier New"/>
-                <w:color w:val="444444"/>
+                <w:color w:val="222222"/>
                 <w:sz w:val="18"/>
                 <w:szCs w:val="18"/>
               </w:rPr>
@@ -406,7 +406,7 @@
             <w:r>
               <w:rPr>
                 <w:rFonts w:ascii="Courier New" w:cs="Courier New" w:eastAsia="Courier New" w:hAnsi="Courier New"/>
-                <w:color w:val="444444"/>
+                <w:color w:val="222222"/>
                 <w:sz w:val="18"/>
                 <w:szCs w:val="18"/>
               </w:rPr>
@@ -450,7 +450,7 @@
             <w:r>
               <w:rPr>
                 <w:rFonts w:ascii="Courier New" w:cs="Courier New" w:eastAsia="Courier New" w:hAnsi="Courier New"/>
-                <w:color w:val="444444"/>
+                <w:color w:val="222222"/>
                 <w:sz w:val="18"/>
                 <w:szCs w:val="18"/>
               </w:rPr>
@@ -494,7 +494,7 @@
             <w:r>
               <w:rPr>
                 <w:rFonts w:ascii="Courier New" w:cs="Courier New" w:eastAsia="Courier New" w:hAnsi="Courier New"/>
-                <w:color w:val="444444"/>
+                <w:color w:val="222222"/>
                 <w:sz w:val="18"/>
                 <w:szCs w:val="18"/>
               </w:rPr>
@@ -538,7 +538,7 @@
             <w:r>
               <w:rPr>
                 <w:rFonts w:ascii="Courier New" w:cs="Courier New" w:eastAsia="Courier New" w:hAnsi="Courier New"/>
-                <w:color w:val="444444"/>
+                <w:color w:val="222222"/>
                 <w:sz w:val="18"/>
                 <w:szCs w:val="18"/>
               </w:rPr>
@@ -582,7 +582,7 @@
             <w:r>
               <w:rPr>
                 <w:rFonts w:ascii="Courier New" w:cs="Courier New" w:eastAsia="Courier New" w:hAnsi="Courier New"/>
-                <w:color w:val="444444"/>
+                <w:color w:val="222222"/>
                 <w:sz w:val="18"/>
                 <w:szCs w:val="18"/>
               </w:rPr>
@@ -626,7 +626,7 @@
             <w:r>
               <w:rPr>
                 <w:rFonts w:ascii="Courier New" w:cs="Courier New" w:eastAsia="Courier New" w:hAnsi="Courier New"/>
-                <w:color w:val="444444"/>
+                <w:color w:val="222222"/>
                 <w:sz w:val="18"/>
                 <w:szCs w:val="18"/>
               </w:rPr>
@@ -670,7 +670,7 @@
             <w:r>
               <w:rPr>
                 <w:rFonts w:ascii="Courier New" w:cs="Courier New" w:eastAsia="Courier New" w:hAnsi="Courier New"/>
-                <w:color w:val="444444"/>
+                <w:color w:val="222222"/>
                 <w:sz w:val="18"/>
                 <w:szCs w:val="18"/>
               </w:rPr>
@@ -714,7 +714,7 @@
             <w:r>
               <w:rPr>
                 <w:rFonts w:ascii="Courier New" w:cs="Courier New" w:eastAsia="Courier New" w:hAnsi="Courier New"/>
-                <w:color w:val="444444"/>
+                <w:color w:val="222222"/>
                 <w:sz w:val="18"/>
                 <w:szCs w:val="18"/>
               </w:rPr>
@@ -758,7 +758,7 @@
             <w:r>
               <w:rPr>
                 <w:rFonts w:ascii="Courier New" w:cs="Courier New" w:eastAsia="Courier New" w:hAnsi="Courier New"/>
-                <w:color w:val="444444"/>
+                <w:color w:val="222222"/>
                 <w:sz w:val="18"/>
                 <w:szCs w:val="18"/>
               </w:rPr>
@@ -792,20 +792,20 @@
     </w:p>
     <w:p>
       <w:pPr>
-        <w:shd w:fill="1E1E1E" w:color="1E1E1E" w:val="solid"/>
-        <w:spacing w:after="0"/>
-      </w:pPr>
-    </w:p>
-    <w:p>
-      <w:pPr>
-        <w:shd w:fill="1E1E1E" w:color="1E1E1E" w:val="solid"/>
-        <w:spacing w:after="0"/>
-        <w:ind w:left="288" w:right="288"/>
-      </w:pPr>
-      <w:r>
-        <w:rPr>
-          <w:rFonts w:ascii="Courier New" w:cs="Courier New" w:eastAsia="Courier New" w:hAnsi="Courier New"/>
-          <w:color w:val="444444"/>
+        <w:shd w:fill="EFEFEF" w:color="EFEFEF" w:val="solid"/>
+        <w:spacing w:after="0"/>
+      </w:pPr>
+    </w:p>
+    <w:p>
+      <w:pPr>
+        <w:shd w:fill="EFEFEF" w:color="EFEFEF" w:val="solid"/>
+        <w:spacing w:after="0"/>
+        <w:ind w:left="288" w:right="288"/>
+      </w:pPr>
+      <w:r>
+        <w:rPr>
+          <w:rFonts w:ascii="Courier New" w:cs="Courier New" w:eastAsia="Courier New" w:hAnsi="Courier New"/>
+          <w:color w:val="222222"/>
           <w:sz w:val="18"/>
           <w:szCs w:val="18"/>
         </w:rPr>
@@ -814,14 +814,14 @@
     </w:p>
     <w:p>
       <w:pPr>
-        <w:shd w:fill="1E1E1E" w:color="1E1E1E" w:val="solid"/>
-        <w:spacing w:after="0"/>
-        <w:ind w:left="288" w:right="288"/>
-      </w:pPr>
-      <w:r>
-        <w:rPr>
-          <w:rFonts w:ascii="Courier New" w:cs="Courier New" w:eastAsia="Courier New" w:hAnsi="Courier New"/>
-          <w:color w:val="444444"/>
+        <w:shd w:fill="EFEFEF" w:color="EFEFEF" w:val="solid"/>
+        <w:spacing w:after="0"/>
+        <w:ind w:left="288" w:right="288"/>
+      </w:pPr>
+      <w:r>
+        <w:rPr>
+          <w:rFonts w:ascii="Courier New" w:cs="Courier New" w:eastAsia="Courier New" w:hAnsi="Courier New"/>
+          <w:color w:val="222222"/>
           <w:sz w:val="18"/>
           <w:szCs w:val="18"/>
         </w:rPr>
@@ -830,14 +830,14 @@
     </w:p>
     <w:p>
       <w:pPr>
-        <w:shd w:fill="1E1E1E" w:color="1E1E1E" w:val="solid"/>
-        <w:spacing w:after="0"/>
-        <w:ind w:left="288" w:right="288"/>
-      </w:pPr>
-      <w:r>
-        <w:rPr>
-          <w:rFonts w:ascii="Courier New" w:cs="Courier New" w:eastAsia="Courier New" w:hAnsi="Courier New"/>
-          <w:color w:val="444444"/>
+        <w:shd w:fill="EFEFEF" w:color="EFEFEF" w:val="solid"/>
+        <w:spacing w:after="0"/>
+        <w:ind w:left="288" w:right="288"/>
+      </w:pPr>
+      <w:r>
+        <w:rPr>
+          <w:rFonts w:ascii="Courier New" w:cs="Courier New" w:eastAsia="Courier New" w:hAnsi="Courier New"/>
+          <w:color w:val="222222"/>
           <w:sz w:val="18"/>
           <w:szCs w:val="18"/>
         </w:rPr>
@@ -846,14 +846,14 @@
     </w:p>
     <w:p>
       <w:pPr>
-        <w:shd w:fill="1E1E1E" w:color="1E1E1E" w:val="solid"/>
-        <w:spacing w:after="0"/>
-        <w:ind w:left="288" w:right="288"/>
-      </w:pPr>
-      <w:r>
-        <w:rPr>
-          <w:rFonts w:ascii="Courier New" w:cs="Courier New" w:eastAsia="Courier New" w:hAnsi="Courier New"/>
-          <w:color w:val="444444"/>
+        <w:shd w:fill="EFEFEF" w:color="EFEFEF" w:val="solid"/>
+        <w:spacing w:after="0"/>
+        <w:ind w:left="288" w:right="288"/>
+      </w:pPr>
+      <w:r>
+        <w:rPr>
+          <w:rFonts w:ascii="Courier New" w:cs="Courier New" w:eastAsia="Courier New" w:hAnsi="Courier New"/>
+          <w:color w:val="222222"/>
           <w:sz w:val="18"/>
           <w:szCs w:val="18"/>
         </w:rPr>
@@ -862,14 +862,14 @@
     </w:p>
     <w:p>
       <w:pPr>
-        <w:shd w:fill="1E1E1E" w:color="1E1E1E" w:val="solid"/>
-        <w:spacing w:after="0"/>
-        <w:ind w:left="288" w:right="288"/>
-      </w:pPr>
-      <w:r>
-        <w:rPr>
-          <w:rFonts w:ascii="Courier New" w:cs="Courier New" w:eastAsia="Courier New" w:hAnsi="Courier New"/>
-          <w:color w:val="444444"/>
+        <w:shd w:fill="EFEFEF" w:color="EFEFEF" w:val="solid"/>
+        <w:spacing w:after="0"/>
+        <w:ind w:left="288" w:right="288"/>
+      </w:pPr>
+      <w:r>
+        <w:rPr>
+          <w:rFonts w:ascii="Courier New" w:cs="Courier New" w:eastAsia="Courier New" w:hAnsi="Courier New"/>
+          <w:color w:val="222222"/>
           <w:sz w:val="18"/>
           <w:szCs w:val="18"/>
         </w:rPr>
@@ -878,14 +878,14 @@
     </w:p>
     <w:p>
       <w:pPr>
-        <w:shd w:fill="1E1E1E" w:color="1E1E1E" w:val="solid"/>
-        <w:spacing w:after="0"/>
-        <w:ind w:left="288" w:right="288"/>
-      </w:pPr>
-      <w:r>
-        <w:rPr>
-          <w:rFonts w:ascii="Courier New" w:cs="Courier New" w:eastAsia="Courier New" w:hAnsi="Courier New"/>
-          <w:color w:val="444444"/>
+        <w:shd w:fill="EFEFEF" w:color="EFEFEF" w:val="solid"/>
+        <w:spacing w:after="0"/>
+        <w:ind w:left="288" w:right="288"/>
+      </w:pPr>
+      <w:r>
+        <w:rPr>
+          <w:rFonts w:ascii="Courier New" w:cs="Courier New" w:eastAsia="Courier New" w:hAnsi="Courier New"/>
+          <w:color w:val="222222"/>
           <w:sz w:val="18"/>
           <w:szCs w:val="18"/>
         </w:rPr>
@@ -894,14 +894,14 @@
     </w:p>
     <w:p>
       <w:pPr>
-        <w:shd w:fill="1E1E1E" w:color="1E1E1E" w:val="solid"/>
-        <w:spacing w:after="0"/>
-        <w:ind w:left="288" w:right="288"/>
-      </w:pPr>
-      <w:r>
-        <w:rPr>
-          <w:rFonts w:ascii="Courier New" w:cs="Courier New" w:eastAsia="Courier New" w:hAnsi="Courier New"/>
-          <w:color w:val="444444"/>
+        <w:shd w:fill="EFEFEF" w:color="EFEFEF" w:val="solid"/>
+        <w:spacing w:after="0"/>
+        <w:ind w:left="288" w:right="288"/>
+      </w:pPr>
+      <w:r>
+        <w:rPr>
+          <w:rFonts w:ascii="Courier New" w:cs="Courier New" w:eastAsia="Courier New" w:hAnsi="Courier New"/>
+          <w:color w:val="222222"/>
           <w:sz w:val="18"/>
           <w:szCs w:val="18"/>
         </w:rPr>
@@ -910,14 +910,14 @@
     </w:p>
     <w:p>
       <w:pPr>
-        <w:shd w:fill="1E1E1E" w:color="1E1E1E" w:val="solid"/>
-        <w:spacing w:after="0"/>
-        <w:ind w:left="288" w:right="288"/>
-      </w:pPr>
-      <w:r>
-        <w:rPr>
-          <w:rFonts w:ascii="Courier New" w:cs="Courier New" w:eastAsia="Courier New" w:hAnsi="Courier New"/>
-          <w:color w:val="444444"/>
+        <w:shd w:fill="EFEFEF" w:color="EFEFEF" w:val="solid"/>
+        <w:spacing w:after="0"/>
+        <w:ind w:left="288" w:right="288"/>
+      </w:pPr>
+      <w:r>
+        <w:rPr>
+          <w:rFonts w:ascii="Courier New" w:cs="Courier New" w:eastAsia="Courier New" w:hAnsi="Courier New"/>
+          <w:color w:val="222222"/>
           <w:sz w:val="18"/>
           <w:szCs w:val="18"/>
         </w:rPr>
@@ -926,14 +926,14 @@
     </w:p>
     <w:p>
       <w:pPr>
-        <w:shd w:fill="1E1E1E" w:color="1E1E1E" w:val="solid"/>
-        <w:spacing w:after="0"/>
-        <w:ind w:left="288" w:right="288"/>
-      </w:pPr>
-      <w:r>
-        <w:rPr>
-          <w:rFonts w:ascii="Courier New" w:cs="Courier New" w:eastAsia="Courier New" w:hAnsi="Courier New"/>
-          <w:color w:val="444444"/>
+        <w:shd w:fill="EFEFEF" w:color="EFEFEF" w:val="solid"/>
+        <w:spacing w:after="0"/>
+        <w:ind w:left="288" w:right="288"/>
+      </w:pPr>
+      <w:r>
+        <w:rPr>
+          <w:rFonts w:ascii="Courier New" w:cs="Courier New" w:eastAsia="Courier New" w:hAnsi="Courier New"/>
+          <w:color w:val="222222"/>
           <w:sz w:val="18"/>
           <w:szCs w:val="18"/>
         </w:rPr>
@@ -942,14 +942,14 @@
     </w:p>
     <w:p>
       <w:pPr>
-        <w:shd w:fill="1E1E1E" w:color="1E1E1E" w:val="solid"/>
-        <w:spacing w:after="0"/>
-        <w:ind w:left="288" w:right="288"/>
-      </w:pPr>
-      <w:r>
-        <w:rPr>
-          <w:rFonts w:ascii="Courier New" w:cs="Courier New" w:eastAsia="Courier New" w:hAnsi="Courier New"/>
-          <w:color w:val="444444"/>
+        <w:shd w:fill="EFEFEF" w:color="EFEFEF" w:val="solid"/>
+        <w:spacing w:after="0"/>
+        <w:ind w:left="288" w:right="288"/>
+      </w:pPr>
+      <w:r>
+        <w:rPr>
+          <w:rFonts w:ascii="Courier New" w:cs="Courier New" w:eastAsia="Courier New" w:hAnsi="Courier New"/>
+          <w:color w:val="222222"/>
           <w:sz w:val="18"/>
           <w:szCs w:val="18"/>
         </w:rPr>
@@ -958,14 +958,14 @@
     </w:p>
     <w:p>
       <w:pPr>
-        <w:shd w:fill="1E1E1E" w:color="1E1E1E" w:val="solid"/>
-        <w:spacing w:after="0"/>
-        <w:ind w:left="288" w:right="288"/>
-      </w:pPr>
-      <w:r>
-        <w:rPr>
-          <w:rFonts w:ascii="Courier New" w:cs="Courier New" w:eastAsia="Courier New" w:hAnsi="Courier New"/>
-          <w:color w:val="444444"/>
+        <w:shd w:fill="EFEFEF" w:color="EFEFEF" w:val="solid"/>
+        <w:spacing w:after="0"/>
+        <w:ind w:left="288" w:right="288"/>
+      </w:pPr>
+      <w:r>
+        <w:rPr>
+          <w:rFonts w:ascii="Courier New" w:cs="Courier New" w:eastAsia="Courier New" w:hAnsi="Courier New"/>
+          <w:color w:val="222222"/>
           <w:sz w:val="18"/>
           <w:szCs w:val="18"/>
         </w:rPr>
@@ -974,14 +974,14 @@
     </w:p>
     <w:p>
       <w:pPr>
-        <w:shd w:fill="1E1E1E" w:color="1E1E1E" w:val="solid"/>
-        <w:spacing w:after="0"/>
-        <w:ind w:left="288" w:right="288"/>
-      </w:pPr>
-      <w:r>
-        <w:rPr>
-          <w:rFonts w:ascii="Courier New" w:cs="Courier New" w:eastAsia="Courier New" w:hAnsi="Courier New"/>
-          <w:color w:val="444444"/>
+        <w:shd w:fill="EFEFEF" w:color="EFEFEF" w:val="solid"/>
+        <w:spacing w:after="0"/>
+        <w:ind w:left="288" w:right="288"/>
+      </w:pPr>
+      <w:r>
+        <w:rPr>
+          <w:rFonts w:ascii="Courier New" w:cs="Courier New" w:eastAsia="Courier New" w:hAnsi="Courier New"/>
+          <w:color w:val="222222"/>
           <w:sz w:val="18"/>
           <w:szCs w:val="18"/>
         </w:rPr>
@@ -990,14 +990,14 @@
     </w:p>
     <w:p>
       <w:pPr>
-        <w:shd w:fill="1E1E1E" w:color="1E1E1E" w:val="solid"/>
-        <w:spacing w:after="0"/>
-        <w:ind w:left="288" w:right="288"/>
-      </w:pPr>
-      <w:r>
-        <w:rPr>
-          <w:rFonts w:ascii="Courier New" w:cs="Courier New" w:eastAsia="Courier New" w:hAnsi="Courier New"/>
-          <w:color w:val="444444"/>
+        <w:shd w:fill="EFEFEF" w:color="EFEFEF" w:val="solid"/>
+        <w:spacing w:after="0"/>
+        <w:ind w:left="288" w:right="288"/>
+      </w:pPr>
+      <w:r>
+        <w:rPr>
+          <w:rFonts w:ascii="Courier New" w:cs="Courier New" w:eastAsia="Courier New" w:hAnsi="Courier New"/>
+          <w:color w:val="222222"/>
           <w:sz w:val="18"/>
           <w:szCs w:val="18"/>
         </w:rPr>
@@ -1006,14 +1006,14 @@
     </w:p>
     <w:p>
       <w:pPr>
-        <w:shd w:fill="1E1E1E" w:color="1E1E1E" w:val="solid"/>
-        <w:spacing w:after="0"/>
-        <w:ind w:left="288" w:right="288"/>
-      </w:pPr>
-      <w:r>
-        <w:rPr>
-          <w:rFonts w:ascii="Courier New" w:cs="Courier New" w:eastAsia="Courier New" w:hAnsi="Courier New"/>
-          <w:color w:val="444444"/>
+        <w:shd w:fill="EFEFEF" w:color="EFEFEF" w:val="solid"/>
+        <w:spacing w:after="0"/>
+        <w:ind w:left="288" w:right="288"/>
+      </w:pPr>
+      <w:r>
+        <w:rPr>
+          <w:rFonts w:ascii="Courier New" w:cs="Courier New" w:eastAsia="Courier New" w:hAnsi="Courier New"/>
+          <w:color w:val="222222"/>
           <w:sz w:val="18"/>
           <w:szCs w:val="18"/>
         </w:rPr>
@@ -1022,14 +1022,14 @@
     </w:p>
     <w:p>
       <w:pPr>
-        <w:shd w:fill="1E1E1E" w:color="1E1E1E" w:val="solid"/>
-        <w:spacing w:after="0"/>
-        <w:ind w:left="288" w:right="288"/>
-      </w:pPr>
-      <w:r>
-        <w:rPr>
-          <w:rFonts w:ascii="Courier New" w:cs="Courier New" w:eastAsia="Courier New" w:hAnsi="Courier New"/>
-          <w:color w:val="444444"/>
+        <w:shd w:fill="EFEFEF" w:color="EFEFEF" w:val="solid"/>
+        <w:spacing w:after="0"/>
+        <w:ind w:left="288" w:right="288"/>
+      </w:pPr>
+      <w:r>
+        <w:rPr>
+          <w:rFonts w:ascii="Courier New" w:cs="Courier New" w:eastAsia="Courier New" w:hAnsi="Courier New"/>
+          <w:color w:val="222222"/>
           <w:sz w:val="18"/>
           <w:szCs w:val="18"/>
         </w:rPr>
@@ -1038,14 +1038,14 @@
     </w:p>
     <w:p>
       <w:pPr>
-        <w:shd w:fill="1E1E1E" w:color="1E1E1E" w:val="solid"/>
-        <w:spacing w:after="0"/>
-        <w:ind w:left="288" w:right="288"/>
-      </w:pPr>
-      <w:r>
-        <w:rPr>
-          <w:rFonts w:ascii="Courier New" w:cs="Courier New" w:eastAsia="Courier New" w:hAnsi="Courier New"/>
-          <w:color w:val="444444"/>
+        <w:shd w:fill="EFEFEF" w:color="EFEFEF" w:val="solid"/>
+        <w:spacing w:after="0"/>
+        <w:ind w:left="288" w:right="288"/>
+      </w:pPr>
+      <w:r>
+        <w:rPr>
+          <w:rFonts w:ascii="Courier New" w:cs="Courier New" w:eastAsia="Courier New" w:hAnsi="Courier New"/>
+          <w:color w:val="222222"/>
           <w:sz w:val="18"/>
           <w:szCs w:val="18"/>
         </w:rPr>
@@ -1054,14 +1054,14 @@
     </w:p>
     <w:p>
       <w:pPr>
-        <w:shd w:fill="1E1E1E" w:color="1E1E1E" w:val="solid"/>
-        <w:spacing w:after="0"/>
-        <w:ind w:left="288" w:right="288"/>
-      </w:pPr>
-      <w:r>
-        <w:rPr>
-          <w:rFonts w:ascii="Courier New" w:cs="Courier New" w:eastAsia="Courier New" w:hAnsi="Courier New"/>
-          <w:color w:val="444444"/>
+        <w:shd w:fill="EFEFEF" w:color="EFEFEF" w:val="solid"/>
+        <w:spacing w:after="0"/>
+        <w:ind w:left="288" w:right="288"/>
+      </w:pPr>
+      <w:r>
+        <w:rPr>
+          <w:rFonts w:ascii="Courier New" w:cs="Courier New" w:eastAsia="Courier New" w:hAnsi="Courier New"/>
+          <w:color w:val="222222"/>
           <w:sz w:val="18"/>
           <w:szCs w:val="18"/>
         </w:rPr>
@@ -1070,14 +1070,14 @@
     </w:p>
     <w:p>
       <w:pPr>
-        <w:shd w:fill="1E1E1E" w:color="1E1E1E" w:val="solid"/>
-        <w:spacing w:after="0"/>
-        <w:ind w:left="288" w:right="288"/>
-      </w:pPr>
-      <w:r>
-        <w:rPr>
-          <w:rFonts w:ascii="Courier New" w:cs="Courier New" w:eastAsia="Courier New" w:hAnsi="Courier New"/>
-          <w:color w:val="444444"/>
+        <w:shd w:fill="EFEFEF" w:color="EFEFEF" w:val="solid"/>
+        <w:spacing w:after="0"/>
+        <w:ind w:left="288" w:right="288"/>
+      </w:pPr>
+      <w:r>
+        <w:rPr>
+          <w:rFonts w:ascii="Courier New" w:cs="Courier New" w:eastAsia="Courier New" w:hAnsi="Courier New"/>
+          <w:color w:val="222222"/>
           <w:sz w:val="18"/>
           <w:szCs w:val="18"/>
         </w:rPr>
@@ -1086,14 +1086,14 @@
     </w:p>
     <w:p>
       <w:pPr>
-        <w:shd w:fill="1E1E1E" w:color="1E1E1E" w:val="solid"/>
-        <w:spacing w:after="0"/>
-        <w:ind w:left="288" w:right="288"/>
-      </w:pPr>
-      <w:r>
-        <w:rPr>
-          <w:rFonts w:ascii="Courier New" w:cs="Courier New" w:eastAsia="Courier New" w:hAnsi="Courier New"/>
-          <w:color w:val="444444"/>
+        <w:shd w:fill="EFEFEF" w:color="EFEFEF" w:val="solid"/>
+        <w:spacing w:after="0"/>
+        <w:ind w:left="288" w:right="288"/>
+      </w:pPr>
+      <w:r>
+        <w:rPr>
+          <w:rFonts w:ascii="Courier New" w:cs="Courier New" w:eastAsia="Courier New" w:hAnsi="Courier New"/>
+          <w:color w:val="222222"/>
           <w:sz w:val="18"/>
           <w:szCs w:val="18"/>
         </w:rPr>
@@ -1102,14 +1102,14 @@
     </w:p>
     <w:p>
       <w:pPr>
-        <w:shd w:fill="1E1E1E" w:color="1E1E1E" w:val="solid"/>
-        <w:spacing w:after="0"/>
-        <w:ind w:left="288" w:right="288"/>
-      </w:pPr>
-      <w:r>
-        <w:rPr>
-          <w:rFonts w:ascii="Courier New" w:cs="Courier New" w:eastAsia="Courier New" w:hAnsi="Courier New"/>
-          <w:color w:val="444444"/>
+        <w:shd w:fill="EFEFEF" w:color="EFEFEF" w:val="solid"/>
+        <w:spacing w:after="0"/>
+        <w:ind w:left="288" w:right="288"/>
+      </w:pPr>
+      <w:r>
+        <w:rPr>
+          <w:rFonts w:ascii="Courier New" w:cs="Courier New" w:eastAsia="Courier New" w:hAnsi="Courier New"/>
+          <w:color w:val="222222"/>
           <w:sz w:val="18"/>
           <w:szCs w:val="18"/>
         </w:rPr>
@@ -1118,14 +1118,14 @@
     </w:p>
     <w:p>
       <w:pPr>
-        <w:shd w:fill="1E1E1E" w:color="1E1E1E" w:val="solid"/>
-        <w:spacing w:after="0"/>
-        <w:ind w:left="288" w:right="288"/>
-      </w:pPr>
-      <w:r>
-        <w:rPr>
-          <w:rFonts w:ascii="Courier New" w:cs="Courier New" w:eastAsia="Courier New" w:hAnsi="Courier New"/>
-          <w:color w:val="444444"/>
+        <w:shd w:fill="EFEFEF" w:color="EFEFEF" w:val="solid"/>
+        <w:spacing w:after="0"/>
+        <w:ind w:left="288" w:right="288"/>
+      </w:pPr>
+      <w:r>
+        <w:rPr>
+          <w:rFonts w:ascii="Courier New" w:cs="Courier New" w:eastAsia="Courier New" w:hAnsi="Courier New"/>
+          <w:color w:val="222222"/>
           <w:sz w:val="18"/>
           <w:szCs w:val="18"/>
         </w:rPr>
@@ -1134,14 +1134,14 @@
     </w:p>
     <w:p>
       <w:pPr>
-        <w:shd w:fill="1E1E1E" w:color="1E1E1E" w:val="solid"/>
-        <w:spacing w:after="0"/>
-        <w:ind w:left="288" w:right="288"/>
-      </w:pPr>
-      <w:r>
-        <w:rPr>
-          <w:rFonts w:ascii="Courier New" w:cs="Courier New" w:eastAsia="Courier New" w:hAnsi="Courier New"/>
-          <w:color w:val="444444"/>
+        <w:shd w:fill="EFEFEF" w:color="EFEFEF" w:val="solid"/>
+        <w:spacing w:after="0"/>
+        <w:ind w:left="288" w:right="288"/>
+      </w:pPr>
+      <w:r>
+        <w:rPr>
+          <w:rFonts w:ascii="Courier New" w:cs="Courier New" w:eastAsia="Courier New" w:hAnsi="Courier New"/>
+          <w:color w:val="222222"/>
           <w:sz w:val="18"/>
           <w:szCs w:val="18"/>
         </w:rPr>
@@ -1150,14 +1150,14 @@
     </w:p>
     <w:p>
       <w:pPr>
-        <w:shd w:fill="1E1E1E" w:color="1E1E1E" w:val="solid"/>
-        <w:spacing w:after="0"/>
-        <w:ind w:left="288" w:right="288"/>
-      </w:pPr>
-      <w:r>
-        <w:rPr>
-          <w:rFonts w:ascii="Courier New" w:cs="Courier New" w:eastAsia="Courier New" w:hAnsi="Courier New"/>
-          <w:color w:val="444444"/>
+        <w:shd w:fill="EFEFEF" w:color="EFEFEF" w:val="solid"/>
+        <w:spacing w:after="0"/>
+        <w:ind w:left="288" w:right="288"/>
+      </w:pPr>
+      <w:r>
+        <w:rPr>
+          <w:rFonts w:ascii="Courier New" w:cs="Courier New" w:eastAsia="Courier New" w:hAnsi="Courier New"/>
+          <w:color w:val="222222"/>
           <w:sz w:val="18"/>
           <w:szCs w:val="18"/>
         </w:rPr>
@@ -1166,14 +1166,14 @@
     </w:p>
     <w:p>
       <w:pPr>
-        <w:shd w:fill="1E1E1E" w:color="1E1E1E" w:val="solid"/>
-        <w:spacing w:after="0"/>
-        <w:ind w:left="288" w:right="288"/>
-      </w:pPr>
-      <w:r>
-        <w:rPr>
-          <w:rFonts w:ascii="Courier New" w:cs="Courier New" w:eastAsia="Courier New" w:hAnsi="Courier New"/>
-          <w:color w:val="444444"/>
+        <w:shd w:fill="EFEFEF" w:color="EFEFEF" w:val="solid"/>
+        <w:spacing w:after="0"/>
+        <w:ind w:left="288" w:right="288"/>
+      </w:pPr>
+      <w:r>
+        <w:rPr>
+          <w:rFonts w:ascii="Courier New" w:cs="Courier New" w:eastAsia="Courier New" w:hAnsi="Courier New"/>
+          <w:color w:val="222222"/>
           <w:sz w:val="18"/>
           <w:szCs w:val="18"/>
         </w:rPr>
@@ -1182,14 +1182,14 @@
     </w:p>
     <w:p>
       <w:pPr>
-        <w:shd w:fill="1E1E1E" w:color="1E1E1E" w:val="solid"/>
-        <w:spacing w:after="0"/>
-        <w:ind w:left="288" w:right="288"/>
-      </w:pPr>
-      <w:r>
-        <w:rPr>
-          <w:rFonts w:ascii="Courier New" w:cs="Courier New" w:eastAsia="Courier New" w:hAnsi="Courier New"/>
-          <w:color w:val="444444"/>
+        <w:shd w:fill="EFEFEF" w:color="EFEFEF" w:val="solid"/>
+        <w:spacing w:after="0"/>
+        <w:ind w:left="288" w:right="288"/>
+      </w:pPr>
+      <w:r>
+        <w:rPr>
+          <w:rFonts w:ascii="Courier New" w:cs="Courier New" w:eastAsia="Courier New" w:hAnsi="Courier New"/>
+          <w:color w:val="222222"/>
           <w:sz w:val="18"/>
           <w:szCs w:val="18"/>
         </w:rPr>
@@ -1198,7 +1198,7 @@
     </w:p>
     <w:p>
       <w:pPr>
-        <w:shd w:fill="1E1E1E" w:color="1E1E1E" w:val="solid"/>
+        <w:shd w:fill="EFEFEF" w:color="EFEFEF" w:val="solid"/>
         <w:spacing w:after="120"/>
       </w:pPr>
     </w:p>
@@ -1288,7 +1288,7 @@
             <w:r>
               <w:rPr>
                 <w:rFonts w:ascii="Courier New" w:cs="Courier New" w:eastAsia="Courier New" w:hAnsi="Courier New"/>
-                <w:color w:val="444444"/>
+                <w:color w:val="222222"/>
                 <w:sz w:val="18"/>
                 <w:szCs w:val="18"/>
               </w:rPr>
@@ -1332,7 +1332,7 @@
             <w:r>
               <w:rPr>
                 <w:rFonts w:ascii="Courier New" w:cs="Courier New" w:eastAsia="Courier New" w:hAnsi="Courier New"/>
-                <w:color w:val="444444"/>
+                <w:color w:val="222222"/>
                 <w:sz w:val="18"/>
                 <w:szCs w:val="18"/>
               </w:rPr>
@@ -1376,7 +1376,7 @@
             <w:r>
               <w:rPr>
                 <w:rFonts w:ascii="Courier New" w:cs="Courier New" w:eastAsia="Courier New" w:hAnsi="Courier New"/>
-                <w:color w:val="444444"/>
+                <w:color w:val="222222"/>
                 <w:sz w:val="18"/>
                 <w:szCs w:val="18"/>
               </w:rPr>
@@ -1420,7 +1420,7 @@
             <w:r>
               <w:rPr>
                 <w:rFonts w:ascii="Courier New" w:cs="Courier New" w:eastAsia="Courier New" w:hAnsi="Courier New"/>
-                <w:color w:val="444444"/>
+                <w:color w:val="222222"/>
                 <w:sz w:val="18"/>
                 <w:szCs w:val="18"/>
               </w:rPr>
@@ -1464,7 +1464,7 @@
             <w:r>
               <w:rPr>
                 <w:rFonts w:ascii="Courier New" w:cs="Courier New" w:eastAsia="Courier New" w:hAnsi="Courier New"/>
-                <w:color w:val="444444"/>
+                <w:color w:val="222222"/>
                 <w:sz w:val="18"/>
                 <w:szCs w:val="18"/>
               </w:rPr>
@@ -1508,7 +1508,7 @@
             <w:r>
               <w:rPr>
                 <w:rFonts w:ascii="Courier New" w:cs="Courier New" w:eastAsia="Courier New" w:hAnsi="Courier New"/>
-                <w:color w:val="444444"/>
+                <w:color w:val="222222"/>
                 <w:sz w:val="18"/>
                 <w:szCs w:val="18"/>
               </w:rPr>
@@ -1555,20 +1555,20 @@
     </w:p>
     <w:p>
       <w:pPr>
-        <w:shd w:fill="1E1E1E" w:color="1E1E1E" w:val="solid"/>
-        <w:spacing w:after="0"/>
-      </w:pPr>
-    </w:p>
-    <w:p>
-      <w:pPr>
-        <w:shd w:fill="1E1E1E" w:color="1E1E1E" w:val="solid"/>
-        <w:spacing w:after="0"/>
-        <w:ind w:left="288" w:right="288"/>
-      </w:pPr>
-      <w:r>
-        <w:rPr>
-          <w:rFonts w:ascii="Courier New" w:cs="Courier New" w:eastAsia="Courier New" w:hAnsi="Courier New"/>
-          <w:color w:val="444444"/>
+        <w:shd w:fill="EFEFEF" w:color="EFEFEF" w:val="solid"/>
+        <w:spacing w:after="0"/>
+      </w:pPr>
+    </w:p>
+    <w:p>
+      <w:pPr>
+        <w:shd w:fill="EFEFEF" w:color="EFEFEF" w:val="solid"/>
+        <w:spacing w:after="0"/>
+        <w:ind w:left="288" w:right="288"/>
+      </w:pPr>
+      <w:r>
+        <w:rPr>
+          <w:rFonts w:ascii="Courier New" w:cs="Courier New" w:eastAsia="Courier New" w:hAnsi="Courier New"/>
+          <w:color w:val="222222"/>
           <w:sz w:val="18"/>
           <w:szCs w:val="18"/>
         </w:rPr>
@@ -1577,14 +1577,14 @@
     </w:p>
     <w:p>
       <w:pPr>
-        <w:shd w:fill="1E1E1E" w:color="1E1E1E" w:val="solid"/>
-        <w:spacing w:after="0"/>
-        <w:ind w:left="288" w:right="288"/>
-      </w:pPr>
-      <w:r>
-        <w:rPr>
-          <w:rFonts w:ascii="Courier New" w:cs="Courier New" w:eastAsia="Courier New" w:hAnsi="Courier New"/>
-          <w:color w:val="444444"/>
+        <w:shd w:fill="EFEFEF" w:color="EFEFEF" w:val="solid"/>
+        <w:spacing w:after="0"/>
+        <w:ind w:left="288" w:right="288"/>
+      </w:pPr>
+      <w:r>
+        <w:rPr>
+          <w:rFonts w:ascii="Courier New" w:cs="Courier New" w:eastAsia="Courier New" w:hAnsi="Courier New"/>
+          <w:color w:val="222222"/>
           <w:sz w:val="18"/>
           <w:szCs w:val="18"/>
         </w:rPr>
@@ -1593,14 +1593,14 @@
     </w:p>
     <w:p>
       <w:pPr>
-        <w:shd w:fill="1E1E1E" w:color="1E1E1E" w:val="solid"/>
-        <w:spacing w:after="0"/>
-        <w:ind w:left="288" w:right="288"/>
-      </w:pPr>
-      <w:r>
-        <w:rPr>
-          <w:rFonts w:ascii="Courier New" w:cs="Courier New" w:eastAsia="Courier New" w:hAnsi="Courier New"/>
-          <w:color w:val="444444"/>
+        <w:shd w:fill="EFEFEF" w:color="EFEFEF" w:val="solid"/>
+        <w:spacing w:after="0"/>
+        <w:ind w:left="288" w:right="288"/>
+      </w:pPr>
+      <w:r>
+        <w:rPr>
+          <w:rFonts w:ascii="Courier New" w:cs="Courier New" w:eastAsia="Courier New" w:hAnsi="Courier New"/>
+          <w:color w:val="222222"/>
           <w:sz w:val="18"/>
           <w:szCs w:val="18"/>
         </w:rPr>
@@ -1609,14 +1609,14 @@
     </w:p>
     <w:p>
       <w:pPr>
-        <w:shd w:fill="1E1E1E" w:color="1E1E1E" w:val="solid"/>
-        <w:spacing w:after="0"/>
-        <w:ind w:left="288" w:right="288"/>
-      </w:pPr>
-      <w:r>
-        <w:rPr>
-          <w:rFonts w:ascii="Courier New" w:cs="Courier New" w:eastAsia="Courier New" w:hAnsi="Courier New"/>
-          <w:color w:val="444444"/>
+        <w:shd w:fill="EFEFEF" w:color="EFEFEF" w:val="solid"/>
+        <w:spacing w:after="0"/>
+        <w:ind w:left="288" w:right="288"/>
+      </w:pPr>
+      <w:r>
+        <w:rPr>
+          <w:rFonts w:ascii="Courier New" w:cs="Courier New" w:eastAsia="Courier New" w:hAnsi="Courier New"/>
+          <w:color w:val="222222"/>
           <w:sz w:val="18"/>
           <w:szCs w:val="18"/>
         </w:rPr>
@@ -1625,14 +1625,14 @@
     </w:p>
     <w:p>
       <w:pPr>
-        <w:shd w:fill="1E1E1E" w:color="1E1E1E" w:val="solid"/>
-        <w:spacing w:after="0"/>
-        <w:ind w:left="288" w:right="288"/>
-      </w:pPr>
-      <w:r>
-        <w:rPr>
-          <w:rFonts w:ascii="Courier New" w:cs="Courier New" w:eastAsia="Courier New" w:hAnsi="Courier New"/>
-          <w:color w:val="444444"/>
+        <w:shd w:fill="EFEFEF" w:color="EFEFEF" w:val="solid"/>
+        <w:spacing w:after="0"/>
+        <w:ind w:left="288" w:right="288"/>
+      </w:pPr>
+      <w:r>
+        <w:rPr>
+          <w:rFonts w:ascii="Courier New" w:cs="Courier New" w:eastAsia="Courier New" w:hAnsi="Courier New"/>
+          <w:color w:val="222222"/>
           <w:sz w:val="18"/>
           <w:szCs w:val="18"/>
         </w:rPr>
@@ -1641,14 +1641,14 @@
     </w:p>
     <w:p>
       <w:pPr>
-        <w:shd w:fill="1E1E1E" w:color="1E1E1E" w:val="solid"/>
-        <w:spacing w:after="0"/>
-        <w:ind w:left="288" w:right="288"/>
-      </w:pPr>
-      <w:r>
-        <w:rPr>
-          <w:rFonts w:ascii="Courier New" w:cs="Courier New" w:eastAsia="Courier New" w:hAnsi="Courier New"/>
-          <w:color w:val="444444"/>
+        <w:shd w:fill="EFEFEF" w:color="EFEFEF" w:val="solid"/>
+        <w:spacing w:after="0"/>
+        <w:ind w:left="288" w:right="288"/>
+      </w:pPr>
+      <w:r>
+        <w:rPr>
+          <w:rFonts w:ascii="Courier New" w:cs="Courier New" w:eastAsia="Courier New" w:hAnsi="Courier New"/>
+          <w:color w:val="222222"/>
           <w:sz w:val="18"/>
           <w:szCs w:val="18"/>
         </w:rPr>
@@ -1657,14 +1657,14 @@
     </w:p>
     <w:p>
       <w:pPr>
-        <w:shd w:fill="1E1E1E" w:color="1E1E1E" w:val="solid"/>
-        <w:spacing w:after="0"/>
-        <w:ind w:left="288" w:right="288"/>
-      </w:pPr>
-      <w:r>
-        <w:rPr>
-          <w:rFonts w:ascii="Courier New" w:cs="Courier New" w:eastAsia="Courier New" w:hAnsi="Courier New"/>
-          <w:color w:val="444444"/>
+        <w:shd w:fill="EFEFEF" w:color="EFEFEF" w:val="solid"/>
+        <w:spacing w:after="0"/>
+        <w:ind w:left="288" w:right="288"/>
+      </w:pPr>
+      <w:r>
+        <w:rPr>
+          <w:rFonts w:ascii="Courier New" w:cs="Courier New" w:eastAsia="Courier New" w:hAnsi="Courier New"/>
+          <w:color w:val="222222"/>
           <w:sz w:val="18"/>
           <w:szCs w:val="18"/>
         </w:rPr>
@@ -1673,14 +1673,14 @@
     </w:p>
     <w:p>
       <w:pPr>
-        <w:shd w:fill="1E1E1E" w:color="1E1E1E" w:val="solid"/>
-        <w:spacing w:after="0"/>
-        <w:ind w:left="288" w:right="288"/>
-      </w:pPr>
-      <w:r>
-        <w:rPr>
-          <w:rFonts w:ascii="Courier New" w:cs="Courier New" w:eastAsia="Courier New" w:hAnsi="Courier New"/>
-          <w:color w:val="444444"/>
+        <w:shd w:fill="EFEFEF" w:color="EFEFEF" w:val="solid"/>
+        <w:spacing w:after="0"/>
+        <w:ind w:left="288" w:right="288"/>
+      </w:pPr>
+      <w:r>
+        <w:rPr>
+          <w:rFonts w:ascii="Courier New" w:cs="Courier New" w:eastAsia="Courier New" w:hAnsi="Courier New"/>
+          <w:color w:val="222222"/>
           <w:sz w:val="18"/>
           <w:szCs w:val="18"/>
         </w:rPr>
@@ -1689,14 +1689,14 @@
     </w:p>
     <w:p>
       <w:pPr>
-        <w:shd w:fill="1E1E1E" w:color="1E1E1E" w:val="solid"/>
-        <w:spacing w:after="0"/>
-        <w:ind w:left="288" w:right="288"/>
-      </w:pPr>
-      <w:r>
-        <w:rPr>
-          <w:rFonts w:ascii="Courier New" w:cs="Courier New" w:eastAsia="Courier New" w:hAnsi="Courier New"/>
-          <w:color w:val="444444"/>
+        <w:shd w:fill="EFEFEF" w:color="EFEFEF" w:val="solid"/>
+        <w:spacing w:after="0"/>
+        <w:ind w:left="288" w:right="288"/>
+      </w:pPr>
+      <w:r>
+        <w:rPr>
+          <w:rFonts w:ascii="Courier New" w:cs="Courier New" w:eastAsia="Courier New" w:hAnsi="Courier New"/>
+          <w:color w:val="222222"/>
           <w:sz w:val="18"/>
           <w:szCs w:val="18"/>
         </w:rPr>
@@ -1705,14 +1705,14 @@
     </w:p>
     <w:p>
       <w:pPr>
-        <w:shd w:fill="1E1E1E" w:color="1E1E1E" w:val="solid"/>
-        <w:spacing w:after="0"/>
-        <w:ind w:left="288" w:right="288"/>
-      </w:pPr>
-      <w:r>
-        <w:rPr>
-          <w:rFonts w:ascii="Courier New" w:cs="Courier New" w:eastAsia="Courier New" w:hAnsi="Courier New"/>
-          <w:color w:val="444444"/>
+        <w:shd w:fill="EFEFEF" w:color="EFEFEF" w:val="solid"/>
+        <w:spacing w:after="0"/>
+        <w:ind w:left="288" w:right="288"/>
+      </w:pPr>
+      <w:r>
+        <w:rPr>
+          <w:rFonts w:ascii="Courier New" w:cs="Courier New" w:eastAsia="Courier New" w:hAnsi="Courier New"/>
+          <w:color w:val="222222"/>
           <w:sz w:val="18"/>
           <w:szCs w:val="18"/>
         </w:rPr>
@@ -1721,14 +1721,14 @@
     </w:p>
     <w:p>
       <w:pPr>
-        <w:shd w:fill="1E1E1E" w:color="1E1E1E" w:val="solid"/>
-        <w:spacing w:after="0"/>
-        <w:ind w:left="288" w:right="288"/>
-      </w:pPr>
-      <w:r>
-        <w:rPr>
-          <w:rFonts w:ascii="Courier New" w:cs="Courier New" w:eastAsia="Courier New" w:hAnsi="Courier New"/>
-          <w:color w:val="444444"/>
+        <w:shd w:fill="EFEFEF" w:color="EFEFEF" w:val="solid"/>
+        <w:spacing w:after="0"/>
+        <w:ind w:left="288" w:right="288"/>
+      </w:pPr>
+      <w:r>
+        <w:rPr>
+          <w:rFonts w:ascii="Courier New" w:cs="Courier New" w:eastAsia="Courier New" w:hAnsi="Courier New"/>
+          <w:color w:val="222222"/>
           <w:sz w:val="18"/>
           <w:szCs w:val="18"/>
         </w:rPr>
@@ -1737,14 +1737,14 @@
     </w:p>
     <w:p>
       <w:pPr>
-        <w:shd w:fill="1E1E1E" w:color="1E1E1E" w:val="solid"/>
-        <w:spacing w:after="0"/>
-        <w:ind w:left="288" w:right="288"/>
-      </w:pPr>
-      <w:r>
-        <w:rPr>
-          <w:rFonts w:ascii="Courier New" w:cs="Courier New" w:eastAsia="Courier New" w:hAnsi="Courier New"/>
-          <w:color w:val="444444"/>
+        <w:shd w:fill="EFEFEF" w:color="EFEFEF" w:val="solid"/>
+        <w:spacing w:after="0"/>
+        <w:ind w:left="288" w:right="288"/>
+      </w:pPr>
+      <w:r>
+        <w:rPr>
+          <w:rFonts w:ascii="Courier New" w:cs="Courier New" w:eastAsia="Courier New" w:hAnsi="Courier New"/>
+          <w:color w:val="222222"/>
           <w:sz w:val="18"/>
           <w:szCs w:val="18"/>
         </w:rPr>
@@ -1753,14 +1753,14 @@
     </w:p>
     <w:p>
       <w:pPr>
-        <w:shd w:fill="1E1E1E" w:color="1E1E1E" w:val="solid"/>
-        <w:spacing w:after="0"/>
-        <w:ind w:left="288" w:right="288"/>
-      </w:pPr>
-      <w:r>
-        <w:rPr>
-          <w:rFonts w:ascii="Courier New" w:cs="Courier New" w:eastAsia="Courier New" w:hAnsi="Courier New"/>
-          <w:color w:val="444444"/>
+        <w:shd w:fill="EFEFEF" w:color="EFEFEF" w:val="solid"/>
+        <w:spacing w:after="0"/>
+        <w:ind w:left="288" w:right="288"/>
+      </w:pPr>
+      <w:r>
+        <w:rPr>
+          <w:rFonts w:ascii="Courier New" w:cs="Courier New" w:eastAsia="Courier New" w:hAnsi="Courier New"/>
+          <w:color w:val="222222"/>
           <w:sz w:val="18"/>
           <w:szCs w:val="18"/>
         </w:rPr>
@@ -1769,14 +1769,14 @@
     </w:p>
     <w:p>
       <w:pPr>
-        <w:shd w:fill="1E1E1E" w:color="1E1E1E" w:val="solid"/>
-        <w:spacing w:after="0"/>
-        <w:ind w:left="288" w:right="288"/>
-      </w:pPr>
-      <w:r>
-        <w:rPr>
-          <w:rFonts w:ascii="Courier New" w:cs="Courier New" w:eastAsia="Courier New" w:hAnsi="Courier New"/>
-          <w:color w:val="444444"/>
+        <w:shd w:fill="EFEFEF" w:color="EFEFEF" w:val="solid"/>
+        <w:spacing w:after="0"/>
+        <w:ind w:left="288" w:right="288"/>
+      </w:pPr>
+      <w:r>
+        <w:rPr>
+          <w:rFonts w:ascii="Courier New" w:cs="Courier New" w:eastAsia="Courier New" w:hAnsi="Courier New"/>
+          <w:color w:val="222222"/>
           <w:sz w:val="18"/>
           <w:szCs w:val="18"/>
         </w:rPr>
@@ -1785,14 +1785,14 @@
     </w:p>
     <w:p>
       <w:pPr>
-        <w:shd w:fill="1E1E1E" w:color="1E1E1E" w:val="solid"/>
-        <w:spacing w:after="0"/>
-        <w:ind w:left="288" w:right="288"/>
-      </w:pPr>
-      <w:r>
-        <w:rPr>
-          <w:rFonts w:ascii="Courier New" w:cs="Courier New" w:eastAsia="Courier New" w:hAnsi="Courier New"/>
-          <w:color w:val="444444"/>
+        <w:shd w:fill="EFEFEF" w:color="EFEFEF" w:val="solid"/>
+        <w:spacing w:after="0"/>
+        <w:ind w:left="288" w:right="288"/>
+      </w:pPr>
+      <w:r>
+        <w:rPr>
+          <w:rFonts w:ascii="Courier New" w:cs="Courier New" w:eastAsia="Courier New" w:hAnsi="Courier New"/>
+          <w:color w:val="222222"/>
           <w:sz w:val="18"/>
           <w:szCs w:val="18"/>
         </w:rPr>
@@ -1801,14 +1801,14 @@
     </w:p>
     <w:p>
       <w:pPr>
-        <w:shd w:fill="1E1E1E" w:color="1E1E1E" w:val="solid"/>
-        <w:spacing w:after="0"/>
-        <w:ind w:left="288" w:right="288"/>
-      </w:pPr>
-      <w:r>
-        <w:rPr>
-          <w:rFonts w:ascii="Courier New" w:cs="Courier New" w:eastAsia="Courier New" w:hAnsi="Courier New"/>
-          <w:color w:val="444444"/>
+        <w:shd w:fill="EFEFEF" w:color="EFEFEF" w:val="solid"/>
+        <w:spacing w:after="0"/>
+        <w:ind w:left="288" w:right="288"/>
+      </w:pPr>
+      <w:r>
+        <w:rPr>
+          <w:rFonts w:ascii="Courier New" w:cs="Courier New" w:eastAsia="Courier New" w:hAnsi="Courier New"/>
+          <w:color w:val="222222"/>
           <w:sz w:val="18"/>
           <w:szCs w:val="18"/>
         </w:rPr>
@@ -1817,14 +1817,14 @@
     </w:p>
     <w:p>
       <w:pPr>
-        <w:shd w:fill="1E1E1E" w:color="1E1E1E" w:val="solid"/>
-        <w:spacing w:after="0"/>
-        <w:ind w:left="288" w:right="288"/>
-      </w:pPr>
-      <w:r>
-        <w:rPr>
-          <w:rFonts w:ascii="Courier New" w:cs="Courier New" w:eastAsia="Courier New" w:hAnsi="Courier New"/>
-          <w:color w:val="444444"/>
+        <w:shd w:fill="EFEFEF" w:color="EFEFEF" w:val="solid"/>
+        <w:spacing w:after="0"/>
+        <w:ind w:left="288" w:right="288"/>
+      </w:pPr>
+      <w:r>
+        <w:rPr>
+          <w:rFonts w:ascii="Courier New" w:cs="Courier New" w:eastAsia="Courier New" w:hAnsi="Courier New"/>
+          <w:color w:val="222222"/>
           <w:sz w:val="18"/>
           <w:szCs w:val="18"/>
         </w:rPr>
@@ -1833,14 +1833,14 @@
     </w:p>
     <w:p>
       <w:pPr>
-        <w:shd w:fill="1E1E1E" w:color="1E1E1E" w:val="solid"/>
-        <w:spacing w:after="0"/>
-        <w:ind w:left="288" w:right="288"/>
-      </w:pPr>
-      <w:r>
-        <w:rPr>
-          <w:rFonts w:ascii="Courier New" w:cs="Courier New" w:eastAsia="Courier New" w:hAnsi="Courier New"/>
-          <w:color w:val="444444"/>
+        <w:shd w:fill="EFEFEF" w:color="EFEFEF" w:val="solid"/>
+        <w:spacing w:after="0"/>
+        <w:ind w:left="288" w:right="288"/>
+      </w:pPr>
+      <w:r>
+        <w:rPr>
+          <w:rFonts w:ascii="Courier New" w:cs="Courier New" w:eastAsia="Courier New" w:hAnsi="Courier New"/>
+          <w:color w:val="222222"/>
           <w:sz w:val="18"/>
           <w:szCs w:val="18"/>
         </w:rPr>
@@ -1849,14 +1849,14 @@
     </w:p>
     <w:p>
       <w:pPr>
-        <w:shd w:fill="1E1E1E" w:color="1E1E1E" w:val="solid"/>
-        <w:spacing w:after="0"/>
-        <w:ind w:left="288" w:right="288"/>
-      </w:pPr>
-      <w:r>
-        <w:rPr>
-          <w:rFonts w:ascii="Courier New" w:cs="Courier New" w:eastAsia="Courier New" w:hAnsi="Courier New"/>
-          <w:color w:val="444444"/>
+        <w:shd w:fill="EFEFEF" w:color="EFEFEF" w:val="solid"/>
+        <w:spacing w:after="0"/>
+        <w:ind w:left="288" w:right="288"/>
+      </w:pPr>
+      <w:r>
+        <w:rPr>
+          <w:rFonts w:ascii="Courier New" w:cs="Courier New" w:eastAsia="Courier New" w:hAnsi="Courier New"/>
+          <w:color w:val="222222"/>
           <w:sz w:val="18"/>
           <w:szCs w:val="18"/>
         </w:rPr>
@@ -1865,14 +1865,14 @@
     </w:p>
     <w:p>
       <w:pPr>
-        <w:shd w:fill="1E1E1E" w:color="1E1E1E" w:val="solid"/>
-        <w:spacing w:after="0"/>
-        <w:ind w:left="288" w:right="288"/>
-      </w:pPr>
-      <w:r>
-        <w:rPr>
-          <w:rFonts w:ascii="Courier New" w:cs="Courier New" w:eastAsia="Courier New" w:hAnsi="Courier New"/>
-          <w:color w:val="444444"/>
+        <w:shd w:fill="EFEFEF" w:color="EFEFEF" w:val="solid"/>
+        <w:spacing w:after="0"/>
+        <w:ind w:left="288" w:right="288"/>
+      </w:pPr>
+      <w:r>
+        <w:rPr>
+          <w:rFonts w:ascii="Courier New" w:cs="Courier New" w:eastAsia="Courier New" w:hAnsi="Courier New"/>
+          <w:color w:val="222222"/>
           <w:sz w:val="18"/>
           <w:szCs w:val="18"/>
         </w:rPr>
@@ -1881,14 +1881,14 @@
     </w:p>
     <w:p>
       <w:pPr>
-        <w:shd w:fill="1E1E1E" w:color="1E1E1E" w:val="solid"/>
-        <w:spacing w:after="0"/>
-        <w:ind w:left="288" w:right="288"/>
-      </w:pPr>
-      <w:r>
-        <w:rPr>
-          <w:rFonts w:ascii="Courier New" w:cs="Courier New" w:eastAsia="Courier New" w:hAnsi="Courier New"/>
-          <w:color w:val="444444"/>
+        <w:shd w:fill="EFEFEF" w:color="EFEFEF" w:val="solid"/>
+        <w:spacing w:after="0"/>
+        <w:ind w:left="288" w:right="288"/>
+      </w:pPr>
+      <w:r>
+        <w:rPr>
+          <w:rFonts w:ascii="Courier New" w:cs="Courier New" w:eastAsia="Courier New" w:hAnsi="Courier New"/>
+          <w:color w:val="222222"/>
           <w:sz w:val="18"/>
           <w:szCs w:val="18"/>
         </w:rPr>
@@ -1897,14 +1897,14 @@
     </w:p>
     <w:p>
       <w:pPr>
-        <w:shd w:fill="1E1E1E" w:color="1E1E1E" w:val="solid"/>
-        <w:spacing w:after="0"/>
-        <w:ind w:left="288" w:right="288"/>
-      </w:pPr>
-      <w:r>
-        <w:rPr>
-          <w:rFonts w:ascii="Courier New" w:cs="Courier New" w:eastAsia="Courier New" w:hAnsi="Courier New"/>
-          <w:color w:val="444444"/>
+        <w:shd w:fill="EFEFEF" w:color="EFEFEF" w:val="solid"/>
+        <w:spacing w:after="0"/>
+        <w:ind w:left="288" w:right="288"/>
+      </w:pPr>
+      <w:r>
+        <w:rPr>
+          <w:rFonts w:ascii="Courier New" w:cs="Courier New" w:eastAsia="Courier New" w:hAnsi="Courier New"/>
+          <w:color w:val="222222"/>
           <w:sz w:val="18"/>
           <w:szCs w:val="18"/>
         </w:rPr>
@@ -1913,7 +1913,7 @@
     </w:p>
     <w:p>
       <w:pPr>
-        <w:shd w:fill="1E1E1E" w:color="1E1E1E" w:val="solid"/>
+        <w:shd w:fill="EFEFEF" w:color="EFEFEF" w:val="solid"/>
         <w:spacing w:after="120"/>
       </w:pPr>
     </w:p>
@@ -1979,20 +1979,20 @@
     </w:p>
     <w:p>
       <w:pPr>
-        <w:shd w:fill="1E1E1E" w:color="1E1E1E" w:val="solid"/>
-        <w:spacing w:after="0"/>
-      </w:pPr>
-    </w:p>
-    <w:p>
-      <w:pPr>
-        <w:shd w:fill="1E1E1E" w:color="1E1E1E" w:val="solid"/>
-        <w:spacing w:after="0"/>
-        <w:ind w:left="288" w:right="288"/>
-      </w:pPr>
-      <w:r>
-        <w:rPr>
-          <w:rFonts w:ascii="Courier New" w:cs="Courier New" w:eastAsia="Courier New" w:hAnsi="Courier New"/>
-          <w:color w:val="444444"/>
+        <w:shd w:fill="EFEFEF" w:color="EFEFEF" w:val="solid"/>
+        <w:spacing w:after="0"/>
+      </w:pPr>
+    </w:p>
+    <w:p>
+      <w:pPr>
+        <w:shd w:fill="EFEFEF" w:color="EFEFEF" w:val="solid"/>
+        <w:spacing w:after="0"/>
+        <w:ind w:left="288" w:right="288"/>
+      </w:pPr>
+      <w:r>
+        <w:rPr>
+          <w:rFonts w:ascii="Courier New" w:cs="Courier New" w:eastAsia="Courier New" w:hAnsi="Courier New"/>
+          <w:color w:val="222222"/>
           <w:sz w:val="18"/>
           <w:szCs w:val="18"/>
         </w:rPr>
@@ -2001,14 +2001,14 @@
     </w:p>
     <w:p>
       <w:pPr>
-        <w:shd w:fill="1E1E1E" w:color="1E1E1E" w:val="solid"/>
-        <w:spacing w:after="0"/>
-        <w:ind w:left="288" w:right="288"/>
-      </w:pPr>
-      <w:r>
-        <w:rPr>
-          <w:rFonts w:ascii="Courier New" w:cs="Courier New" w:eastAsia="Courier New" w:hAnsi="Courier New"/>
-          <w:color w:val="444444"/>
+        <w:shd w:fill="EFEFEF" w:color="EFEFEF" w:val="solid"/>
+        <w:spacing w:after="0"/>
+        <w:ind w:left="288" w:right="288"/>
+      </w:pPr>
+      <w:r>
+        <w:rPr>
+          <w:rFonts w:ascii="Courier New" w:cs="Courier New" w:eastAsia="Courier New" w:hAnsi="Courier New"/>
+          <w:color w:val="222222"/>
           <w:sz w:val="18"/>
           <w:szCs w:val="18"/>
         </w:rPr>
@@ -2017,14 +2017,14 @@
     </w:p>
     <w:p>
       <w:pPr>
-        <w:shd w:fill="1E1E1E" w:color="1E1E1E" w:val="solid"/>
-        <w:spacing w:after="0"/>
-        <w:ind w:left="288" w:right="288"/>
-      </w:pPr>
-      <w:r>
-        <w:rPr>
-          <w:rFonts w:ascii="Courier New" w:cs="Courier New" w:eastAsia="Courier New" w:hAnsi="Courier New"/>
-          <w:color w:val="444444"/>
+        <w:shd w:fill="EFEFEF" w:color="EFEFEF" w:val="solid"/>
+        <w:spacing w:after="0"/>
+        <w:ind w:left="288" w:right="288"/>
+      </w:pPr>
+      <w:r>
+        <w:rPr>
+          <w:rFonts w:ascii="Courier New" w:cs="Courier New" w:eastAsia="Courier New" w:hAnsi="Courier New"/>
+          <w:color w:val="222222"/>
           <w:sz w:val="18"/>
           <w:szCs w:val="18"/>
         </w:rPr>
@@ -2033,14 +2033,14 @@
     </w:p>
     <w:p>
       <w:pPr>
-        <w:shd w:fill="1E1E1E" w:color="1E1E1E" w:val="solid"/>
-        <w:spacing w:after="0"/>
-        <w:ind w:left="288" w:right="288"/>
-      </w:pPr>
-      <w:r>
-        <w:rPr>
-          <w:rFonts w:ascii="Courier New" w:cs="Courier New" w:eastAsia="Courier New" w:hAnsi="Courier New"/>
-          <w:color w:val="444444"/>
+        <w:shd w:fill="EFEFEF" w:color="EFEFEF" w:val="solid"/>
+        <w:spacing w:after="0"/>
+        <w:ind w:left="288" w:right="288"/>
+      </w:pPr>
+      <w:r>
+        <w:rPr>
+          <w:rFonts w:ascii="Courier New" w:cs="Courier New" w:eastAsia="Courier New" w:hAnsi="Courier New"/>
+          <w:color w:val="222222"/>
           <w:sz w:val="18"/>
           <w:szCs w:val="18"/>
         </w:rPr>
@@ -2049,14 +2049,14 @@
     </w:p>
     <w:p>
       <w:pPr>
-        <w:shd w:fill="1E1E1E" w:color="1E1E1E" w:val="solid"/>
-        <w:spacing w:after="0"/>
-        <w:ind w:left="288" w:right="288"/>
-      </w:pPr>
-      <w:r>
-        <w:rPr>
-          <w:rFonts w:ascii="Courier New" w:cs="Courier New" w:eastAsia="Courier New" w:hAnsi="Courier New"/>
-          <w:color w:val="444444"/>
+        <w:shd w:fill="EFEFEF" w:color="EFEFEF" w:val="solid"/>
+        <w:spacing w:after="0"/>
+        <w:ind w:left="288" w:right="288"/>
+      </w:pPr>
+      <w:r>
+        <w:rPr>
+          <w:rFonts w:ascii="Courier New" w:cs="Courier New" w:eastAsia="Courier New" w:hAnsi="Courier New"/>
+          <w:color w:val="222222"/>
           <w:sz w:val="18"/>
           <w:szCs w:val="18"/>
         </w:rPr>
@@ -2065,14 +2065,14 @@
     </w:p>
     <w:p>
       <w:pPr>
-        <w:shd w:fill="1E1E1E" w:color="1E1E1E" w:val="solid"/>
-        <w:spacing w:after="0"/>
-        <w:ind w:left="288" w:right="288"/>
-      </w:pPr>
-      <w:r>
-        <w:rPr>
-          <w:rFonts w:ascii="Courier New" w:cs="Courier New" w:eastAsia="Courier New" w:hAnsi="Courier New"/>
-          <w:color w:val="444444"/>
+        <w:shd w:fill="EFEFEF" w:color="EFEFEF" w:val="solid"/>
+        <w:spacing w:after="0"/>
+        <w:ind w:left="288" w:right="288"/>
+      </w:pPr>
+      <w:r>
+        <w:rPr>
+          <w:rFonts w:ascii="Courier New" w:cs="Courier New" w:eastAsia="Courier New" w:hAnsi="Courier New"/>
+          <w:color w:val="222222"/>
           <w:sz w:val="18"/>
           <w:szCs w:val="18"/>
         </w:rPr>
@@ -2081,14 +2081,14 @@
     </w:p>
     <w:p>
       <w:pPr>
-        <w:shd w:fill="1E1E1E" w:color="1E1E1E" w:val="solid"/>
-        <w:spacing w:after="0"/>
-        <w:ind w:left="288" w:right="288"/>
-      </w:pPr>
-      <w:r>
-        <w:rPr>
-          <w:rFonts w:ascii="Courier New" w:cs="Courier New" w:eastAsia="Courier New" w:hAnsi="Courier New"/>
-          <w:color w:val="444444"/>
+        <w:shd w:fill="EFEFEF" w:color="EFEFEF" w:val="solid"/>
+        <w:spacing w:after="0"/>
+        <w:ind w:left="288" w:right="288"/>
+      </w:pPr>
+      <w:r>
+        <w:rPr>
+          <w:rFonts w:ascii="Courier New" w:cs="Courier New" w:eastAsia="Courier New" w:hAnsi="Courier New"/>
+          <w:color w:val="222222"/>
           <w:sz w:val="18"/>
           <w:szCs w:val="18"/>
         </w:rPr>
@@ -2097,14 +2097,14 @@
     </w:p>
     <w:p>
       <w:pPr>
-        <w:shd w:fill="1E1E1E" w:color="1E1E1E" w:val="solid"/>
-        <w:spacing w:after="0"/>
-        <w:ind w:left="288" w:right="288"/>
-      </w:pPr>
-      <w:r>
-        <w:rPr>
-          <w:rFonts w:ascii="Courier New" w:cs="Courier New" w:eastAsia="Courier New" w:hAnsi="Courier New"/>
-          <w:color w:val="444444"/>
+        <w:shd w:fill="EFEFEF" w:color="EFEFEF" w:val="solid"/>
+        <w:spacing w:after="0"/>
+        <w:ind w:left="288" w:right="288"/>
+      </w:pPr>
+      <w:r>
+        <w:rPr>
+          <w:rFonts w:ascii="Courier New" w:cs="Courier New" w:eastAsia="Courier New" w:hAnsi="Courier New"/>
+          <w:color w:val="222222"/>
           <w:sz w:val="18"/>
           <w:szCs w:val="18"/>
         </w:rPr>
@@ -2113,7 +2113,7 @@
     </w:p>
     <w:p>
       <w:pPr>
-        <w:shd w:fill="1E1E1E" w:color="1E1E1E" w:val="solid"/>
+        <w:shd w:fill="EFEFEF" w:color="EFEFEF" w:val="solid"/>
         <w:spacing w:after="120"/>
       </w:pPr>
     </w:p>
@@ -2141,20 +2141,20 @@
     </w:p>
     <w:p>
       <w:pPr>
-        <w:shd w:fill="1E1E1E" w:color="1E1E1E" w:val="solid"/>
-        <w:spacing w:after="0"/>
-      </w:pPr>
-    </w:p>
-    <w:p>
-      <w:pPr>
-        <w:shd w:fill="1E1E1E" w:color="1E1E1E" w:val="solid"/>
-        <w:spacing w:after="0"/>
-        <w:ind w:left="288" w:right="288"/>
-      </w:pPr>
-      <w:r>
-        <w:rPr>
-          <w:rFonts w:ascii="Courier New" w:cs="Courier New" w:eastAsia="Courier New" w:hAnsi="Courier New"/>
-          <w:color w:val="444444"/>
+        <w:shd w:fill="EFEFEF" w:color="EFEFEF" w:val="solid"/>
+        <w:spacing w:after="0"/>
+      </w:pPr>
+    </w:p>
+    <w:p>
+      <w:pPr>
+        <w:shd w:fill="EFEFEF" w:color="EFEFEF" w:val="solid"/>
+        <w:spacing w:after="0"/>
+        <w:ind w:left="288" w:right="288"/>
+      </w:pPr>
+      <w:r>
+        <w:rPr>
+          <w:rFonts w:ascii="Courier New" w:cs="Courier New" w:eastAsia="Courier New" w:hAnsi="Courier New"/>
+          <w:color w:val="222222"/>
           <w:sz w:val="18"/>
           <w:szCs w:val="18"/>
         </w:rPr>
@@ -2163,14 +2163,14 @@
     </w:p>
     <w:p>
       <w:pPr>
-        <w:shd w:fill="1E1E1E" w:color="1E1E1E" w:val="solid"/>
-        <w:spacing w:after="0"/>
-        <w:ind w:left="288" w:right="288"/>
-      </w:pPr>
-      <w:r>
-        <w:rPr>
-          <w:rFonts w:ascii="Courier New" w:cs="Courier New" w:eastAsia="Courier New" w:hAnsi="Courier New"/>
-          <w:color w:val="444444"/>
+        <w:shd w:fill="EFEFEF" w:color="EFEFEF" w:val="solid"/>
+        <w:spacing w:after="0"/>
+        <w:ind w:left="288" w:right="288"/>
+      </w:pPr>
+      <w:r>
+        <w:rPr>
+          <w:rFonts w:ascii="Courier New" w:cs="Courier New" w:eastAsia="Courier New" w:hAnsi="Courier New"/>
+          <w:color w:val="222222"/>
           <w:sz w:val="18"/>
           <w:szCs w:val="18"/>
         </w:rPr>
@@ -2179,14 +2179,14 @@
     </w:p>
     <w:p>
       <w:pPr>
-        <w:shd w:fill="1E1E1E" w:color="1E1E1E" w:val="solid"/>
-        <w:spacing w:after="0"/>
-        <w:ind w:left="288" w:right="288"/>
-      </w:pPr>
-      <w:r>
-        <w:rPr>
-          <w:rFonts w:ascii="Courier New" w:cs="Courier New" w:eastAsia="Courier New" w:hAnsi="Courier New"/>
-          <w:color w:val="444444"/>
+        <w:shd w:fill="EFEFEF" w:color="EFEFEF" w:val="solid"/>
+        <w:spacing w:after="0"/>
+        <w:ind w:left="288" w:right="288"/>
+      </w:pPr>
+      <w:r>
+        <w:rPr>
+          <w:rFonts w:ascii="Courier New" w:cs="Courier New" w:eastAsia="Courier New" w:hAnsi="Courier New"/>
+          <w:color w:val="222222"/>
           <w:sz w:val="18"/>
           <w:szCs w:val="18"/>
         </w:rPr>
@@ -2195,14 +2195,14 @@
     </w:p>
     <w:p>
       <w:pPr>
-        <w:shd w:fill="1E1E1E" w:color="1E1E1E" w:val="solid"/>
-        <w:spacing w:after="0"/>
-        <w:ind w:left="288" w:right="288"/>
-      </w:pPr>
-      <w:r>
-        <w:rPr>
-          <w:rFonts w:ascii="Courier New" w:cs="Courier New" w:eastAsia="Courier New" w:hAnsi="Courier New"/>
-          <w:color w:val="444444"/>
+        <w:shd w:fill="EFEFEF" w:color="EFEFEF" w:val="solid"/>
+        <w:spacing w:after="0"/>
+        <w:ind w:left="288" w:right="288"/>
+      </w:pPr>
+      <w:r>
+        <w:rPr>
+          <w:rFonts w:ascii="Courier New" w:cs="Courier New" w:eastAsia="Courier New" w:hAnsi="Courier New"/>
+          <w:color w:val="222222"/>
           <w:sz w:val="18"/>
           <w:szCs w:val="18"/>
         </w:rPr>
@@ -2211,7 +2211,7 @@
     </w:p>
     <w:p>
       <w:pPr>
-        <w:shd w:fill="1E1E1E" w:color="1E1E1E" w:val="solid"/>
+        <w:shd w:fill="EFEFEF" w:color="EFEFEF" w:val="solid"/>
         <w:spacing w:after="120"/>
       </w:pPr>
     </w:p>
@@ -2239,20 +2239,20 @@
     </w:p>
     <w:p>
       <w:pPr>
-        <w:shd w:fill="1E1E1E" w:color="1E1E1E" w:val="solid"/>
-        <w:spacing w:after="0"/>
-      </w:pPr>
-    </w:p>
-    <w:p>
-      <w:pPr>
-        <w:shd w:fill="1E1E1E" w:color="1E1E1E" w:val="solid"/>
-        <w:spacing w:after="0"/>
-        <w:ind w:left="288" w:right="288"/>
-      </w:pPr>
-      <w:r>
-        <w:rPr>
-          <w:rFonts w:ascii="Courier New" w:cs="Courier New" w:eastAsia="Courier New" w:hAnsi="Courier New"/>
-          <w:color w:val="444444"/>
+        <w:shd w:fill="EFEFEF" w:color="EFEFEF" w:val="solid"/>
+        <w:spacing w:after="0"/>
+      </w:pPr>
+    </w:p>
+    <w:p>
+      <w:pPr>
+        <w:shd w:fill="EFEFEF" w:color="EFEFEF" w:val="solid"/>
+        <w:spacing w:after="0"/>
+        <w:ind w:left="288" w:right="288"/>
+      </w:pPr>
+      <w:r>
+        <w:rPr>
+          <w:rFonts w:ascii="Courier New" w:cs="Courier New" w:eastAsia="Courier New" w:hAnsi="Courier New"/>
+          <w:color w:val="222222"/>
           <w:sz w:val="18"/>
           <w:szCs w:val="18"/>
         </w:rPr>
@@ -2261,14 +2261,14 @@
     </w:p>
     <w:p>
       <w:pPr>
-        <w:shd w:fill="1E1E1E" w:color="1E1E1E" w:val="solid"/>
-        <w:spacing w:after="0"/>
-        <w:ind w:left="288" w:right="288"/>
-      </w:pPr>
-      <w:r>
-        <w:rPr>
-          <w:rFonts w:ascii="Courier New" w:cs="Courier New" w:eastAsia="Courier New" w:hAnsi="Courier New"/>
-          <w:color w:val="444444"/>
+        <w:shd w:fill="EFEFEF" w:color="EFEFEF" w:val="solid"/>
+        <w:spacing w:after="0"/>
+        <w:ind w:left="288" w:right="288"/>
+      </w:pPr>
+      <w:r>
+        <w:rPr>
+          <w:rFonts w:ascii="Courier New" w:cs="Courier New" w:eastAsia="Courier New" w:hAnsi="Courier New"/>
+          <w:color w:val="222222"/>
           <w:sz w:val="18"/>
           <w:szCs w:val="18"/>
         </w:rPr>
@@ -2277,14 +2277,14 @@
     </w:p>
     <w:p>
       <w:pPr>
-        <w:shd w:fill="1E1E1E" w:color="1E1E1E" w:val="solid"/>
-        <w:spacing w:after="0"/>
-        <w:ind w:left="288" w:right="288"/>
-      </w:pPr>
-      <w:r>
-        <w:rPr>
-          <w:rFonts w:ascii="Courier New" w:cs="Courier New" w:eastAsia="Courier New" w:hAnsi="Courier New"/>
-          <w:color w:val="444444"/>
+        <w:shd w:fill="EFEFEF" w:color="EFEFEF" w:val="solid"/>
+        <w:spacing w:after="0"/>
+        <w:ind w:left="288" w:right="288"/>
+      </w:pPr>
+      <w:r>
+        <w:rPr>
+          <w:rFonts w:ascii="Courier New" w:cs="Courier New" w:eastAsia="Courier New" w:hAnsi="Courier New"/>
+          <w:color w:val="222222"/>
           <w:sz w:val="18"/>
           <w:szCs w:val="18"/>
         </w:rPr>
@@ -2293,14 +2293,14 @@
     </w:p>
     <w:p>
       <w:pPr>
-        <w:shd w:fill="1E1E1E" w:color="1E1E1E" w:val="solid"/>
-        <w:spacing w:after="0"/>
-        <w:ind w:left="288" w:right="288"/>
-      </w:pPr>
-      <w:r>
-        <w:rPr>
-          <w:rFonts w:ascii="Courier New" w:cs="Courier New" w:eastAsia="Courier New" w:hAnsi="Courier New"/>
-          <w:color w:val="444444"/>
+        <w:shd w:fill="EFEFEF" w:color="EFEFEF" w:val="solid"/>
+        <w:spacing w:after="0"/>
+        <w:ind w:left="288" w:right="288"/>
+      </w:pPr>
+      <w:r>
+        <w:rPr>
+          <w:rFonts w:ascii="Courier New" w:cs="Courier New" w:eastAsia="Courier New" w:hAnsi="Courier New"/>
+          <w:color w:val="222222"/>
           <w:sz w:val="18"/>
           <w:szCs w:val="18"/>
         </w:rPr>
@@ -2309,7 +2309,7 @@
     </w:p>
     <w:p>
       <w:pPr>
-        <w:shd w:fill="1E1E1E" w:color="1E1E1E" w:val="solid"/>
+        <w:shd w:fill="EFEFEF" w:color="EFEFEF" w:val="solid"/>
         <w:spacing w:after="120"/>
       </w:pPr>
     </w:p>
@@ -2375,20 +2375,20 @@
     </w:p>
     <w:p>
       <w:pPr>
-        <w:shd w:fill="1E1E1E" w:color="1E1E1E" w:val="solid"/>
-        <w:spacing w:after="0"/>
-      </w:pPr>
-    </w:p>
-    <w:p>
-      <w:pPr>
-        <w:shd w:fill="1E1E1E" w:color="1E1E1E" w:val="solid"/>
-        <w:spacing w:after="0"/>
-        <w:ind w:left="288" w:right="288"/>
-      </w:pPr>
-      <w:r>
-        <w:rPr>
-          <w:rFonts w:ascii="Courier New" w:cs="Courier New" w:eastAsia="Courier New" w:hAnsi="Courier New"/>
-          <w:color w:val="444444"/>
+        <w:shd w:fill="EFEFEF" w:color="EFEFEF" w:val="solid"/>
+        <w:spacing w:after="0"/>
+      </w:pPr>
+    </w:p>
+    <w:p>
+      <w:pPr>
+        <w:shd w:fill="EFEFEF" w:color="EFEFEF" w:val="solid"/>
+        <w:spacing w:after="0"/>
+        <w:ind w:left="288" w:right="288"/>
+      </w:pPr>
+      <w:r>
+        <w:rPr>
+          <w:rFonts w:ascii="Courier New" w:cs="Courier New" w:eastAsia="Courier New" w:hAnsi="Courier New"/>
+          <w:color w:val="222222"/>
           <w:sz w:val="18"/>
           <w:szCs w:val="18"/>
         </w:rPr>
@@ -2397,14 +2397,14 @@
     </w:p>
     <w:p>
       <w:pPr>
-        <w:shd w:fill="1E1E1E" w:color="1E1E1E" w:val="solid"/>
-        <w:spacing w:after="0"/>
-        <w:ind w:left="288" w:right="288"/>
-      </w:pPr>
-      <w:r>
-        <w:rPr>
-          <w:rFonts w:ascii="Courier New" w:cs="Courier New" w:eastAsia="Courier New" w:hAnsi="Courier New"/>
-          <w:color w:val="444444"/>
+        <w:shd w:fill="EFEFEF" w:color="EFEFEF" w:val="solid"/>
+        <w:spacing w:after="0"/>
+        <w:ind w:left="288" w:right="288"/>
+      </w:pPr>
+      <w:r>
+        <w:rPr>
+          <w:rFonts w:ascii="Courier New" w:cs="Courier New" w:eastAsia="Courier New" w:hAnsi="Courier New"/>
+          <w:color w:val="222222"/>
           <w:sz w:val="18"/>
           <w:szCs w:val="18"/>
         </w:rPr>
@@ -2413,14 +2413,14 @@
     </w:p>
     <w:p>
       <w:pPr>
-        <w:shd w:fill="1E1E1E" w:color="1E1E1E" w:val="solid"/>
-        <w:spacing w:after="0"/>
-        <w:ind w:left="288" w:right="288"/>
-      </w:pPr>
-      <w:r>
-        <w:rPr>
-          <w:rFonts w:ascii="Courier New" w:cs="Courier New" w:eastAsia="Courier New" w:hAnsi="Courier New"/>
-          <w:color w:val="444444"/>
+        <w:shd w:fill="EFEFEF" w:color="EFEFEF" w:val="solid"/>
+        <w:spacing w:after="0"/>
+        <w:ind w:left="288" w:right="288"/>
+      </w:pPr>
+      <w:r>
+        <w:rPr>
+          <w:rFonts w:ascii="Courier New" w:cs="Courier New" w:eastAsia="Courier New" w:hAnsi="Courier New"/>
+          <w:color w:val="222222"/>
           <w:sz w:val="18"/>
           <w:szCs w:val="18"/>
         </w:rPr>
@@ -2429,14 +2429,14 @@
     </w:p>
     <w:p>
       <w:pPr>
-        <w:shd w:fill="1E1E1E" w:color="1E1E1E" w:val="solid"/>
-        <w:spacing w:after="0"/>
-        <w:ind w:left="288" w:right="288"/>
-      </w:pPr>
-      <w:r>
-        <w:rPr>
-          <w:rFonts w:ascii="Courier New" w:cs="Courier New" w:eastAsia="Courier New" w:hAnsi="Courier New"/>
-          <w:color w:val="444444"/>
+        <w:shd w:fill="EFEFEF" w:color="EFEFEF" w:val="solid"/>
+        <w:spacing w:after="0"/>
+        <w:ind w:left="288" w:right="288"/>
+      </w:pPr>
+      <w:r>
+        <w:rPr>
+          <w:rFonts w:ascii="Courier New" w:cs="Courier New" w:eastAsia="Courier New" w:hAnsi="Courier New"/>
+          <w:color w:val="222222"/>
           <w:sz w:val="18"/>
           <w:szCs w:val="18"/>
         </w:rPr>
@@ -2445,14 +2445,14 @@
     </w:p>
     <w:p>
       <w:pPr>
-        <w:shd w:fill="1E1E1E" w:color="1E1E1E" w:val="solid"/>
-        <w:spacing w:after="0"/>
-        <w:ind w:left="288" w:right="288"/>
-      </w:pPr>
-      <w:r>
-        <w:rPr>
-          <w:rFonts w:ascii="Courier New" w:cs="Courier New" w:eastAsia="Courier New" w:hAnsi="Courier New"/>
-          <w:color w:val="444444"/>
+        <w:shd w:fill="EFEFEF" w:color="EFEFEF" w:val="solid"/>
+        <w:spacing w:after="0"/>
+        <w:ind w:left="288" w:right="288"/>
+      </w:pPr>
+      <w:r>
+        <w:rPr>
+          <w:rFonts w:ascii="Courier New" w:cs="Courier New" w:eastAsia="Courier New" w:hAnsi="Courier New"/>
+          <w:color w:val="222222"/>
           <w:sz w:val="18"/>
           <w:szCs w:val="18"/>
         </w:rPr>
@@ -2461,7 +2461,7 @@
     </w:p>
     <w:p>
       <w:pPr>
-        <w:shd w:fill="1E1E1E" w:color="1E1E1E" w:val="solid"/>
+        <w:shd w:fill="EFEFEF" w:color="EFEFEF" w:val="solid"/>
         <w:spacing w:after="120"/>
       </w:pPr>
     </w:p>
@@ -2668,20 +2668,20 @@
     </w:p>
     <w:p>
       <w:pPr>
-        <w:shd w:fill="1E1E1E" w:color="1E1E1E" w:val="solid"/>
-        <w:spacing w:after="0"/>
-      </w:pPr>
-    </w:p>
-    <w:p>
-      <w:pPr>
-        <w:shd w:fill="1E1E1E" w:color="1E1E1E" w:val="solid"/>
-        <w:spacing w:after="0"/>
-        <w:ind w:left="288" w:right="288"/>
-      </w:pPr>
-      <w:r>
-        <w:rPr>
-          <w:rFonts w:ascii="Courier New" w:cs="Courier New" w:eastAsia="Courier New" w:hAnsi="Courier New"/>
-          <w:color w:val="444444"/>
+        <w:shd w:fill="EFEFEF" w:color="EFEFEF" w:val="solid"/>
+        <w:spacing w:after="0"/>
+      </w:pPr>
+    </w:p>
+    <w:p>
+      <w:pPr>
+        <w:shd w:fill="EFEFEF" w:color="EFEFEF" w:val="solid"/>
+        <w:spacing w:after="0"/>
+        <w:ind w:left="288" w:right="288"/>
+      </w:pPr>
+      <w:r>
+        <w:rPr>
+          <w:rFonts w:ascii="Courier New" w:cs="Courier New" w:eastAsia="Courier New" w:hAnsi="Courier New"/>
+          <w:color w:val="222222"/>
           <w:sz w:val="18"/>
           <w:szCs w:val="18"/>
         </w:rPr>
@@ -2690,14 +2690,14 @@
     </w:p>
     <w:p>
       <w:pPr>
-        <w:shd w:fill="1E1E1E" w:color="1E1E1E" w:val="solid"/>
-        <w:spacing w:after="0"/>
-        <w:ind w:left="288" w:right="288"/>
-      </w:pPr>
-      <w:r>
-        <w:rPr>
-          <w:rFonts w:ascii="Courier New" w:cs="Courier New" w:eastAsia="Courier New" w:hAnsi="Courier New"/>
-          <w:color w:val="444444"/>
+        <w:shd w:fill="EFEFEF" w:color="EFEFEF" w:val="solid"/>
+        <w:spacing w:after="0"/>
+        <w:ind w:left="288" w:right="288"/>
+      </w:pPr>
+      <w:r>
+        <w:rPr>
+          <w:rFonts w:ascii="Courier New" w:cs="Courier New" w:eastAsia="Courier New" w:hAnsi="Courier New"/>
+          <w:color w:val="222222"/>
           <w:sz w:val="18"/>
           <w:szCs w:val="18"/>
         </w:rPr>
@@ -2706,14 +2706,14 @@
     </w:p>
     <w:p>
       <w:pPr>
-        <w:shd w:fill="1E1E1E" w:color="1E1E1E" w:val="solid"/>
-        <w:spacing w:after="0"/>
-        <w:ind w:left="288" w:right="288"/>
-      </w:pPr>
-      <w:r>
-        <w:rPr>
-          <w:rFonts w:ascii="Courier New" w:cs="Courier New" w:eastAsia="Courier New" w:hAnsi="Courier New"/>
-          <w:color w:val="444444"/>
+        <w:shd w:fill="EFEFEF" w:color="EFEFEF" w:val="solid"/>
+        <w:spacing w:after="0"/>
+        <w:ind w:left="288" w:right="288"/>
+      </w:pPr>
+      <w:r>
+        <w:rPr>
+          <w:rFonts w:ascii="Courier New" w:cs="Courier New" w:eastAsia="Courier New" w:hAnsi="Courier New"/>
+          <w:color w:val="222222"/>
           <w:sz w:val="18"/>
           <w:szCs w:val="18"/>
         </w:rPr>
@@ -2722,7 +2722,7 @@
     </w:p>
     <w:p>
       <w:pPr>
-        <w:shd w:fill="1E1E1E" w:color="1E1E1E" w:val="solid"/>
+        <w:shd w:fill="EFEFEF" w:color="EFEFEF" w:val="solid"/>
         <w:spacing w:after="120"/>
       </w:pPr>
     </w:p>
@@ -2776,20 +2776,20 @@
     </w:p>
     <w:p>
       <w:pPr>
-        <w:shd w:fill="1E1E1E" w:color="1E1E1E" w:val="solid"/>
-        <w:spacing w:after="0"/>
-      </w:pPr>
-    </w:p>
-    <w:p>
-      <w:pPr>
-        <w:shd w:fill="1E1E1E" w:color="1E1E1E" w:val="solid"/>
-        <w:spacing w:after="0"/>
-        <w:ind w:left="288" w:right="288"/>
-      </w:pPr>
-      <w:r>
-        <w:rPr>
-          <w:rFonts w:ascii="Courier New" w:cs="Courier New" w:eastAsia="Courier New" w:hAnsi="Courier New"/>
-          <w:color w:val="444444"/>
+        <w:shd w:fill="EFEFEF" w:color="EFEFEF" w:val="solid"/>
+        <w:spacing w:after="0"/>
+      </w:pPr>
+    </w:p>
+    <w:p>
+      <w:pPr>
+        <w:shd w:fill="EFEFEF" w:color="EFEFEF" w:val="solid"/>
+        <w:spacing w:after="0"/>
+        <w:ind w:left="288" w:right="288"/>
+      </w:pPr>
+      <w:r>
+        <w:rPr>
+          <w:rFonts w:ascii="Courier New" w:cs="Courier New" w:eastAsia="Courier New" w:hAnsi="Courier New"/>
+          <w:color w:val="222222"/>
           <w:sz w:val="18"/>
           <w:szCs w:val="18"/>
         </w:rPr>
@@ -2798,14 +2798,14 @@
     </w:p>
     <w:p>
       <w:pPr>
-        <w:shd w:fill="1E1E1E" w:color="1E1E1E" w:val="solid"/>
-        <w:spacing w:after="0"/>
-        <w:ind w:left="288" w:right="288"/>
-      </w:pPr>
-      <w:r>
-        <w:rPr>
-          <w:rFonts w:ascii="Courier New" w:cs="Courier New" w:eastAsia="Courier New" w:hAnsi="Courier New"/>
-          <w:color w:val="444444"/>
+        <w:shd w:fill="EFEFEF" w:color="EFEFEF" w:val="solid"/>
+        <w:spacing w:after="0"/>
+        <w:ind w:left="288" w:right="288"/>
+      </w:pPr>
+      <w:r>
+        <w:rPr>
+          <w:rFonts w:ascii="Courier New" w:cs="Courier New" w:eastAsia="Courier New" w:hAnsi="Courier New"/>
+          <w:color w:val="222222"/>
           <w:sz w:val="18"/>
           <w:szCs w:val="18"/>
         </w:rPr>
@@ -2814,14 +2814,14 @@
     </w:p>
     <w:p>
       <w:pPr>
-        <w:shd w:fill="1E1E1E" w:color="1E1E1E" w:val="solid"/>
-        <w:spacing w:after="0"/>
-        <w:ind w:left="288" w:right="288"/>
-      </w:pPr>
-      <w:r>
-        <w:rPr>
-          <w:rFonts w:ascii="Courier New" w:cs="Courier New" w:eastAsia="Courier New" w:hAnsi="Courier New"/>
-          <w:color w:val="444444"/>
+        <w:shd w:fill="EFEFEF" w:color="EFEFEF" w:val="solid"/>
+        <w:spacing w:after="0"/>
+        <w:ind w:left="288" w:right="288"/>
+      </w:pPr>
+      <w:r>
+        <w:rPr>
+          <w:rFonts w:ascii="Courier New" w:cs="Courier New" w:eastAsia="Courier New" w:hAnsi="Courier New"/>
+          <w:color w:val="222222"/>
           <w:sz w:val="18"/>
           <w:szCs w:val="18"/>
         </w:rPr>
@@ -2830,14 +2830,14 @@
     </w:p>
     <w:p>
       <w:pPr>
-        <w:shd w:fill="1E1E1E" w:color="1E1E1E" w:val="solid"/>
-        <w:spacing w:after="0"/>
-        <w:ind w:left="288" w:right="288"/>
-      </w:pPr>
-      <w:r>
-        <w:rPr>
-          <w:rFonts w:ascii="Courier New" w:cs="Courier New" w:eastAsia="Courier New" w:hAnsi="Courier New"/>
-          <w:color w:val="444444"/>
+        <w:shd w:fill="EFEFEF" w:color="EFEFEF" w:val="solid"/>
+        <w:spacing w:after="0"/>
+        <w:ind w:left="288" w:right="288"/>
+      </w:pPr>
+      <w:r>
+        <w:rPr>
+          <w:rFonts w:ascii="Courier New" w:cs="Courier New" w:eastAsia="Courier New" w:hAnsi="Courier New"/>
+          <w:color w:val="222222"/>
           <w:sz w:val="18"/>
           <w:szCs w:val="18"/>
         </w:rPr>
@@ -2846,7 +2846,7 @@
     </w:p>
     <w:p>
       <w:pPr>
-        <w:shd w:fill="1E1E1E" w:color="1E1E1E" w:val="solid"/>
+        <w:shd w:fill="EFEFEF" w:color="EFEFEF" w:val="solid"/>
         <w:spacing w:after="120"/>
       </w:pPr>
     </w:p>
@@ -2961,7 +2961,7 @@
             <w:r>
               <w:rPr>
                 <w:rFonts w:ascii="Courier New" w:cs="Courier New" w:eastAsia="Courier New" w:hAnsi="Courier New"/>
-                <w:color w:val="444444"/>
+                <w:color w:val="222222"/>
                 <w:sz w:val="18"/>
                 <w:szCs w:val="18"/>
               </w:rPr>
@@ -3005,7 +3005,7 @@
             <w:r>
               <w:rPr>
                 <w:rFonts w:ascii="Courier New" w:cs="Courier New" w:eastAsia="Courier New" w:hAnsi="Courier New"/>
-                <w:color w:val="444444"/>
+                <w:color w:val="222222"/>
                 <w:sz w:val="18"/>
                 <w:szCs w:val="18"/>
               </w:rPr>
@@ -3049,7 +3049,7 @@
             <w:r>
               <w:rPr>
                 <w:rFonts w:ascii="Courier New" w:cs="Courier New" w:eastAsia="Courier New" w:hAnsi="Courier New"/>
-                <w:color w:val="444444"/>
+                <w:color w:val="222222"/>
                 <w:sz w:val="18"/>
                 <w:szCs w:val="18"/>
               </w:rPr>
@@ -3093,7 +3093,7 @@
             <w:r>
               <w:rPr>
                 <w:rFonts w:ascii="Courier New" w:cs="Courier New" w:eastAsia="Courier New" w:hAnsi="Courier New"/>
-                <w:color w:val="444444"/>
+                <w:color w:val="222222"/>
                 <w:sz w:val="18"/>
                 <w:szCs w:val="18"/>
               </w:rPr>
@@ -3137,7 +3137,7 @@
             <w:r>
               <w:rPr>
                 <w:rFonts w:ascii="Courier New" w:cs="Courier New" w:eastAsia="Courier New" w:hAnsi="Courier New"/>
-                <w:color w:val="444444"/>
+                <w:color w:val="222222"/>
                 <w:sz w:val="18"/>
                 <w:szCs w:val="18"/>
               </w:rPr>
@@ -3184,20 +3184,20 @@
     </w:p>
     <w:p>
       <w:pPr>
-        <w:shd w:fill="1E1E1E" w:color="1E1E1E" w:val="solid"/>
-        <w:spacing w:after="0"/>
-      </w:pPr>
-    </w:p>
-    <w:p>
-      <w:pPr>
-        <w:shd w:fill="1E1E1E" w:color="1E1E1E" w:val="solid"/>
-        <w:spacing w:after="0"/>
-        <w:ind w:left="288" w:right="288"/>
-      </w:pPr>
-      <w:r>
-        <w:rPr>
-          <w:rFonts w:ascii="Courier New" w:cs="Courier New" w:eastAsia="Courier New" w:hAnsi="Courier New"/>
-          <w:color w:val="444444"/>
+        <w:shd w:fill="EFEFEF" w:color="EFEFEF" w:val="solid"/>
+        <w:spacing w:after="0"/>
+      </w:pPr>
+    </w:p>
+    <w:p>
+      <w:pPr>
+        <w:shd w:fill="EFEFEF" w:color="EFEFEF" w:val="solid"/>
+        <w:spacing w:after="0"/>
+        <w:ind w:left="288" w:right="288"/>
+      </w:pPr>
+      <w:r>
+        <w:rPr>
+          <w:rFonts w:ascii="Courier New" w:cs="Courier New" w:eastAsia="Courier New" w:hAnsi="Courier New"/>
+          <w:color w:val="222222"/>
           <w:sz w:val="18"/>
           <w:szCs w:val="18"/>
         </w:rPr>
@@ -3206,14 +3206,14 @@
     </w:p>
     <w:p>
       <w:pPr>
-        <w:shd w:fill="1E1E1E" w:color="1E1E1E" w:val="solid"/>
-        <w:spacing w:after="0"/>
-        <w:ind w:left="288" w:right="288"/>
-      </w:pPr>
-      <w:r>
-        <w:rPr>
-          <w:rFonts w:ascii="Courier New" w:cs="Courier New" w:eastAsia="Courier New" w:hAnsi="Courier New"/>
-          <w:color w:val="444444"/>
+        <w:shd w:fill="EFEFEF" w:color="EFEFEF" w:val="solid"/>
+        <w:spacing w:after="0"/>
+        <w:ind w:left="288" w:right="288"/>
+      </w:pPr>
+      <w:r>
+        <w:rPr>
+          <w:rFonts w:ascii="Courier New" w:cs="Courier New" w:eastAsia="Courier New" w:hAnsi="Courier New"/>
+          <w:color w:val="222222"/>
           <w:sz w:val="18"/>
           <w:szCs w:val="18"/>
         </w:rPr>
@@ -3222,14 +3222,14 @@
     </w:p>
     <w:p>
       <w:pPr>
-        <w:shd w:fill="1E1E1E" w:color="1E1E1E" w:val="solid"/>
-        <w:spacing w:after="0"/>
-        <w:ind w:left="288" w:right="288"/>
-      </w:pPr>
-      <w:r>
-        <w:rPr>
-          <w:rFonts w:ascii="Courier New" w:cs="Courier New" w:eastAsia="Courier New" w:hAnsi="Courier New"/>
-          <w:color w:val="444444"/>
+        <w:shd w:fill="EFEFEF" w:color="EFEFEF" w:val="solid"/>
+        <w:spacing w:after="0"/>
+        <w:ind w:left="288" w:right="288"/>
+      </w:pPr>
+      <w:r>
+        <w:rPr>
+          <w:rFonts w:ascii="Courier New" w:cs="Courier New" w:eastAsia="Courier New" w:hAnsi="Courier New"/>
+          <w:color w:val="222222"/>
           <w:sz w:val="18"/>
           <w:szCs w:val="18"/>
         </w:rPr>
@@ -3238,14 +3238,14 @@
     </w:p>
     <w:p>
       <w:pPr>
-        <w:shd w:fill="1E1E1E" w:color="1E1E1E" w:val="solid"/>
-        <w:spacing w:after="0"/>
-        <w:ind w:left="288" w:right="288"/>
-      </w:pPr>
-      <w:r>
-        <w:rPr>
-          <w:rFonts w:ascii="Courier New" w:cs="Courier New" w:eastAsia="Courier New" w:hAnsi="Courier New"/>
-          <w:color w:val="444444"/>
+        <w:shd w:fill="EFEFEF" w:color="EFEFEF" w:val="solid"/>
+        <w:spacing w:after="0"/>
+        <w:ind w:left="288" w:right="288"/>
+      </w:pPr>
+      <w:r>
+        <w:rPr>
+          <w:rFonts w:ascii="Courier New" w:cs="Courier New" w:eastAsia="Courier New" w:hAnsi="Courier New"/>
+          <w:color w:val="222222"/>
           <w:sz w:val="18"/>
           <w:szCs w:val="18"/>
         </w:rPr>
@@ -3254,14 +3254,14 @@
     </w:p>
     <w:p>
       <w:pPr>
-        <w:shd w:fill="1E1E1E" w:color="1E1E1E" w:val="solid"/>
-        <w:spacing w:after="0"/>
-        <w:ind w:left="288" w:right="288"/>
-      </w:pPr>
-      <w:r>
-        <w:rPr>
-          <w:rFonts w:ascii="Courier New" w:cs="Courier New" w:eastAsia="Courier New" w:hAnsi="Courier New"/>
-          <w:color w:val="444444"/>
+        <w:shd w:fill="EFEFEF" w:color="EFEFEF" w:val="solid"/>
+        <w:spacing w:after="0"/>
+        <w:ind w:left="288" w:right="288"/>
+      </w:pPr>
+      <w:r>
+        <w:rPr>
+          <w:rFonts w:ascii="Courier New" w:cs="Courier New" w:eastAsia="Courier New" w:hAnsi="Courier New"/>
+          <w:color w:val="222222"/>
           <w:sz w:val="18"/>
           <w:szCs w:val="18"/>
         </w:rPr>
@@ -3270,14 +3270,14 @@
     </w:p>
     <w:p>
       <w:pPr>
-        <w:shd w:fill="1E1E1E" w:color="1E1E1E" w:val="solid"/>
-        <w:spacing w:after="0"/>
-        <w:ind w:left="288" w:right="288"/>
-      </w:pPr>
-      <w:r>
-        <w:rPr>
-          <w:rFonts w:ascii="Courier New" w:cs="Courier New" w:eastAsia="Courier New" w:hAnsi="Courier New"/>
-          <w:color w:val="444444"/>
+        <w:shd w:fill="EFEFEF" w:color="EFEFEF" w:val="solid"/>
+        <w:spacing w:after="0"/>
+        <w:ind w:left="288" w:right="288"/>
+      </w:pPr>
+      <w:r>
+        <w:rPr>
+          <w:rFonts w:ascii="Courier New" w:cs="Courier New" w:eastAsia="Courier New" w:hAnsi="Courier New"/>
+          <w:color w:val="222222"/>
           <w:sz w:val="18"/>
           <w:szCs w:val="18"/>
         </w:rPr>
@@ -3286,14 +3286,14 @@
     </w:p>
     <w:p>
       <w:pPr>
-        <w:shd w:fill="1E1E1E" w:color="1E1E1E" w:val="solid"/>
-        <w:spacing w:after="0"/>
-        <w:ind w:left="288" w:right="288"/>
-      </w:pPr>
-      <w:r>
-        <w:rPr>
-          <w:rFonts w:ascii="Courier New" w:cs="Courier New" w:eastAsia="Courier New" w:hAnsi="Courier New"/>
-          <w:color w:val="444444"/>
+        <w:shd w:fill="EFEFEF" w:color="EFEFEF" w:val="solid"/>
+        <w:spacing w:after="0"/>
+        <w:ind w:left="288" w:right="288"/>
+      </w:pPr>
+      <w:r>
+        <w:rPr>
+          <w:rFonts w:ascii="Courier New" w:cs="Courier New" w:eastAsia="Courier New" w:hAnsi="Courier New"/>
+          <w:color w:val="222222"/>
           <w:sz w:val="18"/>
           <w:szCs w:val="18"/>
         </w:rPr>
@@ -3302,14 +3302,14 @@
     </w:p>
     <w:p>
       <w:pPr>
-        <w:shd w:fill="1E1E1E" w:color="1E1E1E" w:val="solid"/>
-        <w:spacing w:after="0"/>
-        <w:ind w:left="288" w:right="288"/>
-      </w:pPr>
-      <w:r>
-        <w:rPr>
-          <w:rFonts w:ascii="Courier New" w:cs="Courier New" w:eastAsia="Courier New" w:hAnsi="Courier New"/>
-          <w:color w:val="444444"/>
+        <w:shd w:fill="EFEFEF" w:color="EFEFEF" w:val="solid"/>
+        <w:spacing w:after="0"/>
+        <w:ind w:left="288" w:right="288"/>
+      </w:pPr>
+      <w:r>
+        <w:rPr>
+          <w:rFonts w:ascii="Courier New" w:cs="Courier New" w:eastAsia="Courier New" w:hAnsi="Courier New"/>
+          <w:color w:val="222222"/>
           <w:sz w:val="18"/>
           <w:szCs w:val="18"/>
         </w:rPr>
@@ -3318,7 +3318,7 @@
     </w:p>
     <w:p>
       <w:pPr>
-        <w:shd w:fill="1E1E1E" w:color="1E1E1E" w:val="solid"/>
+        <w:shd w:fill="EFEFEF" w:color="EFEFEF" w:val="solid"/>
         <w:spacing w:after="120"/>
       </w:pPr>
     </w:p>
@@ -3409,20 +3409,20 @@
     </w:p>
     <w:p>
       <w:pPr>
-        <w:shd w:fill="1E1E1E" w:color="1E1E1E" w:val="solid"/>
-        <w:spacing w:after="0"/>
-      </w:pPr>
-    </w:p>
-    <w:p>
-      <w:pPr>
-        <w:shd w:fill="1E1E1E" w:color="1E1E1E" w:val="solid"/>
-        <w:spacing w:after="0"/>
-        <w:ind w:left="288" w:right="288"/>
-      </w:pPr>
-      <w:r>
-        <w:rPr>
-          <w:rFonts w:ascii="Courier New" w:cs="Courier New" w:eastAsia="Courier New" w:hAnsi="Courier New"/>
-          <w:color w:val="444444"/>
+        <w:shd w:fill="EFEFEF" w:color="EFEFEF" w:val="solid"/>
+        <w:spacing w:after="0"/>
+      </w:pPr>
+    </w:p>
+    <w:p>
+      <w:pPr>
+        <w:shd w:fill="EFEFEF" w:color="EFEFEF" w:val="solid"/>
+        <w:spacing w:after="0"/>
+        <w:ind w:left="288" w:right="288"/>
+      </w:pPr>
+      <w:r>
+        <w:rPr>
+          <w:rFonts w:ascii="Courier New" w:cs="Courier New" w:eastAsia="Courier New" w:hAnsi="Courier New"/>
+          <w:color w:val="222222"/>
           <w:sz w:val="18"/>
           <w:szCs w:val="18"/>
         </w:rPr>
@@ -3431,14 +3431,14 @@
     </w:p>
     <w:p>
       <w:pPr>
-        <w:shd w:fill="1E1E1E" w:color="1E1E1E" w:val="solid"/>
-        <w:spacing w:after="0"/>
-        <w:ind w:left="288" w:right="288"/>
-      </w:pPr>
-      <w:r>
-        <w:rPr>
-          <w:rFonts w:ascii="Courier New" w:cs="Courier New" w:eastAsia="Courier New" w:hAnsi="Courier New"/>
-          <w:color w:val="444444"/>
+        <w:shd w:fill="EFEFEF" w:color="EFEFEF" w:val="solid"/>
+        <w:spacing w:after="0"/>
+        <w:ind w:left="288" w:right="288"/>
+      </w:pPr>
+      <w:r>
+        <w:rPr>
+          <w:rFonts w:ascii="Courier New" w:cs="Courier New" w:eastAsia="Courier New" w:hAnsi="Courier New"/>
+          <w:color w:val="222222"/>
           <w:sz w:val="18"/>
           <w:szCs w:val="18"/>
         </w:rPr>
@@ -3447,14 +3447,14 @@
     </w:p>
     <w:p>
       <w:pPr>
-        <w:shd w:fill="1E1E1E" w:color="1E1E1E" w:val="solid"/>
-        <w:spacing w:after="0"/>
-        <w:ind w:left="288" w:right="288"/>
-      </w:pPr>
-      <w:r>
-        <w:rPr>
-          <w:rFonts w:ascii="Courier New" w:cs="Courier New" w:eastAsia="Courier New" w:hAnsi="Courier New"/>
-          <w:color w:val="444444"/>
+        <w:shd w:fill="EFEFEF" w:color="EFEFEF" w:val="solid"/>
+        <w:spacing w:after="0"/>
+        <w:ind w:left="288" w:right="288"/>
+      </w:pPr>
+      <w:r>
+        <w:rPr>
+          <w:rFonts w:ascii="Courier New" w:cs="Courier New" w:eastAsia="Courier New" w:hAnsi="Courier New"/>
+          <w:color w:val="222222"/>
           <w:sz w:val="18"/>
           <w:szCs w:val="18"/>
         </w:rPr>
@@ -3463,14 +3463,14 @@
     </w:p>
     <w:p>
       <w:pPr>
-        <w:shd w:fill="1E1E1E" w:color="1E1E1E" w:val="solid"/>
-        <w:spacing w:after="0"/>
-        <w:ind w:left="288" w:right="288"/>
-      </w:pPr>
-      <w:r>
-        <w:rPr>
-          <w:rFonts w:ascii="Courier New" w:cs="Courier New" w:eastAsia="Courier New" w:hAnsi="Courier New"/>
-          <w:color w:val="444444"/>
+        <w:shd w:fill="EFEFEF" w:color="EFEFEF" w:val="solid"/>
+        <w:spacing w:after="0"/>
+        <w:ind w:left="288" w:right="288"/>
+      </w:pPr>
+      <w:r>
+        <w:rPr>
+          <w:rFonts w:ascii="Courier New" w:cs="Courier New" w:eastAsia="Courier New" w:hAnsi="Courier New"/>
+          <w:color w:val="222222"/>
           <w:sz w:val="18"/>
           <w:szCs w:val="18"/>
         </w:rPr>
@@ -3479,7 +3479,7 @@
     </w:p>
     <w:p>
       <w:pPr>
-        <w:shd w:fill="1E1E1E" w:color="1E1E1E" w:val="solid"/>
+        <w:shd w:fill="EFEFEF" w:color="EFEFEF" w:val="solid"/>
         <w:spacing w:after="120"/>
       </w:pPr>
     </w:p>
@@ -3499,20 +3499,20 @@
     </w:p>
     <w:p>
       <w:pPr>
-        <w:shd w:fill="1E1E1E" w:color="1E1E1E" w:val="solid"/>
-        <w:spacing w:after="0"/>
-      </w:pPr>
-    </w:p>
-    <w:p>
-      <w:pPr>
-        <w:shd w:fill="1E1E1E" w:color="1E1E1E" w:val="solid"/>
-        <w:spacing w:after="0"/>
-        <w:ind w:left="288" w:right="288"/>
-      </w:pPr>
-      <w:r>
-        <w:rPr>
-          <w:rFonts w:ascii="Courier New" w:cs="Courier New" w:eastAsia="Courier New" w:hAnsi="Courier New"/>
-          <w:color w:val="444444"/>
+        <w:shd w:fill="EFEFEF" w:color="EFEFEF" w:val="solid"/>
+        <w:spacing w:after="0"/>
+      </w:pPr>
+    </w:p>
+    <w:p>
+      <w:pPr>
+        <w:shd w:fill="EFEFEF" w:color="EFEFEF" w:val="solid"/>
+        <w:spacing w:after="0"/>
+        <w:ind w:left="288" w:right="288"/>
+      </w:pPr>
+      <w:r>
+        <w:rPr>
+          <w:rFonts w:ascii="Courier New" w:cs="Courier New" w:eastAsia="Courier New" w:hAnsi="Courier New"/>
+          <w:color w:val="222222"/>
           <w:sz w:val="18"/>
           <w:szCs w:val="18"/>
         </w:rPr>
@@ -3521,14 +3521,14 @@
     </w:p>
     <w:p>
       <w:pPr>
-        <w:shd w:fill="1E1E1E" w:color="1E1E1E" w:val="solid"/>
-        <w:spacing w:after="0"/>
-        <w:ind w:left="288" w:right="288"/>
-      </w:pPr>
-      <w:r>
-        <w:rPr>
-          <w:rFonts w:ascii="Courier New" w:cs="Courier New" w:eastAsia="Courier New" w:hAnsi="Courier New"/>
-          <w:color w:val="444444"/>
+        <w:shd w:fill="EFEFEF" w:color="EFEFEF" w:val="solid"/>
+        <w:spacing w:after="0"/>
+        <w:ind w:left="288" w:right="288"/>
+      </w:pPr>
+      <w:r>
+        <w:rPr>
+          <w:rFonts w:ascii="Courier New" w:cs="Courier New" w:eastAsia="Courier New" w:hAnsi="Courier New"/>
+          <w:color w:val="222222"/>
           <w:sz w:val="18"/>
           <w:szCs w:val="18"/>
         </w:rPr>
@@ -3537,14 +3537,14 @@
     </w:p>
     <w:p>
       <w:pPr>
-        <w:shd w:fill="1E1E1E" w:color="1E1E1E" w:val="solid"/>
-        <w:spacing w:after="0"/>
-        <w:ind w:left="288" w:right="288"/>
-      </w:pPr>
-      <w:r>
-        <w:rPr>
-          <w:rFonts w:ascii="Courier New" w:cs="Courier New" w:eastAsia="Courier New" w:hAnsi="Courier New"/>
-          <w:color w:val="444444"/>
+        <w:shd w:fill="EFEFEF" w:color="EFEFEF" w:val="solid"/>
+        <w:spacing w:after="0"/>
+        <w:ind w:left="288" w:right="288"/>
+      </w:pPr>
+      <w:r>
+        <w:rPr>
+          <w:rFonts w:ascii="Courier New" w:cs="Courier New" w:eastAsia="Courier New" w:hAnsi="Courier New"/>
+          <w:color w:val="222222"/>
           <w:sz w:val="18"/>
           <w:szCs w:val="18"/>
         </w:rPr>
@@ -3553,14 +3553,14 @@
     </w:p>
     <w:p>
       <w:pPr>
-        <w:shd w:fill="1E1E1E" w:color="1E1E1E" w:val="solid"/>
-        <w:spacing w:after="0"/>
-        <w:ind w:left="288" w:right="288"/>
-      </w:pPr>
-      <w:r>
-        <w:rPr>
-          <w:rFonts w:ascii="Courier New" w:cs="Courier New" w:eastAsia="Courier New" w:hAnsi="Courier New"/>
-          <w:color w:val="444444"/>
+        <w:shd w:fill="EFEFEF" w:color="EFEFEF" w:val="solid"/>
+        <w:spacing w:after="0"/>
+        <w:ind w:left="288" w:right="288"/>
+      </w:pPr>
+      <w:r>
+        <w:rPr>
+          <w:rFonts w:ascii="Courier New" w:cs="Courier New" w:eastAsia="Courier New" w:hAnsi="Courier New"/>
+          <w:color w:val="222222"/>
           <w:sz w:val="18"/>
           <w:szCs w:val="18"/>
         </w:rPr>
@@ -3569,14 +3569,14 @@
     </w:p>
     <w:p>
       <w:pPr>
-        <w:shd w:fill="1E1E1E" w:color="1E1E1E" w:val="solid"/>
-        <w:spacing w:after="0"/>
-        <w:ind w:left="288" w:right="288"/>
-      </w:pPr>
-      <w:r>
-        <w:rPr>
-          <w:rFonts w:ascii="Courier New" w:cs="Courier New" w:eastAsia="Courier New" w:hAnsi="Courier New"/>
-          <w:color w:val="444444"/>
+        <w:shd w:fill="EFEFEF" w:color="EFEFEF" w:val="solid"/>
+        <w:spacing w:after="0"/>
+        <w:ind w:left="288" w:right="288"/>
+      </w:pPr>
+      <w:r>
+        <w:rPr>
+          <w:rFonts w:ascii="Courier New" w:cs="Courier New" w:eastAsia="Courier New" w:hAnsi="Courier New"/>
+          <w:color w:val="222222"/>
           <w:sz w:val="18"/>
           <w:szCs w:val="18"/>
         </w:rPr>
@@ -3585,14 +3585,14 @@
     </w:p>
     <w:p>
       <w:pPr>
-        <w:shd w:fill="1E1E1E" w:color="1E1E1E" w:val="solid"/>
-        <w:spacing w:after="0"/>
-        <w:ind w:left="288" w:right="288"/>
-      </w:pPr>
-      <w:r>
-        <w:rPr>
-          <w:rFonts w:ascii="Courier New" w:cs="Courier New" w:eastAsia="Courier New" w:hAnsi="Courier New"/>
-          <w:color w:val="444444"/>
+        <w:shd w:fill="EFEFEF" w:color="EFEFEF" w:val="solid"/>
+        <w:spacing w:after="0"/>
+        <w:ind w:left="288" w:right="288"/>
+      </w:pPr>
+      <w:r>
+        <w:rPr>
+          <w:rFonts w:ascii="Courier New" w:cs="Courier New" w:eastAsia="Courier New" w:hAnsi="Courier New"/>
+          <w:color w:val="222222"/>
           <w:sz w:val="18"/>
           <w:szCs w:val="18"/>
         </w:rPr>
@@ -3601,7 +3601,7 @@
     </w:p>
     <w:p>
       <w:pPr>
-        <w:shd w:fill="1E1E1E" w:color="1E1E1E" w:val="solid"/>
+        <w:shd w:fill="EFEFEF" w:color="EFEFEF" w:val="solid"/>
         <w:spacing w:after="120"/>
       </w:pPr>
     </w:p>
@@ -3642,20 +3642,20 @@
     </w:p>
     <w:p>
       <w:pPr>
-        <w:shd w:fill="1E1E1E" w:color="1E1E1E" w:val="solid"/>
-        <w:spacing w:after="0"/>
-      </w:pPr>
-    </w:p>
-    <w:p>
-      <w:pPr>
-        <w:shd w:fill="1E1E1E" w:color="1E1E1E" w:val="solid"/>
-        <w:spacing w:after="0"/>
-        <w:ind w:left="288" w:right="288"/>
-      </w:pPr>
-      <w:r>
-        <w:rPr>
-          <w:rFonts w:ascii="Courier New" w:cs="Courier New" w:eastAsia="Courier New" w:hAnsi="Courier New"/>
-          <w:color w:val="444444"/>
+        <w:shd w:fill="EFEFEF" w:color="EFEFEF" w:val="solid"/>
+        <w:spacing w:after="0"/>
+      </w:pPr>
+    </w:p>
+    <w:p>
+      <w:pPr>
+        <w:shd w:fill="EFEFEF" w:color="EFEFEF" w:val="solid"/>
+        <w:spacing w:after="0"/>
+        <w:ind w:left="288" w:right="288"/>
+      </w:pPr>
+      <w:r>
+        <w:rPr>
+          <w:rFonts w:ascii="Courier New" w:cs="Courier New" w:eastAsia="Courier New" w:hAnsi="Courier New"/>
+          <w:color w:val="222222"/>
           <w:sz w:val="18"/>
           <w:szCs w:val="18"/>
         </w:rPr>
@@ -3664,14 +3664,14 @@
     </w:p>
     <w:p>
       <w:pPr>
-        <w:shd w:fill="1E1E1E" w:color="1E1E1E" w:val="solid"/>
-        <w:spacing w:after="0"/>
-        <w:ind w:left="288" w:right="288"/>
-      </w:pPr>
-      <w:r>
-        <w:rPr>
-          <w:rFonts w:ascii="Courier New" w:cs="Courier New" w:eastAsia="Courier New" w:hAnsi="Courier New"/>
-          <w:color w:val="444444"/>
+        <w:shd w:fill="EFEFEF" w:color="EFEFEF" w:val="solid"/>
+        <w:spacing w:after="0"/>
+        <w:ind w:left="288" w:right="288"/>
+      </w:pPr>
+      <w:r>
+        <w:rPr>
+          <w:rFonts w:ascii="Courier New" w:cs="Courier New" w:eastAsia="Courier New" w:hAnsi="Courier New"/>
+          <w:color w:val="222222"/>
           <w:sz w:val="18"/>
           <w:szCs w:val="18"/>
         </w:rPr>
@@ -3680,14 +3680,14 @@
     </w:p>
     <w:p>
       <w:pPr>
-        <w:shd w:fill="1E1E1E" w:color="1E1E1E" w:val="solid"/>
-        <w:spacing w:after="0"/>
-        <w:ind w:left="288" w:right="288"/>
-      </w:pPr>
-      <w:r>
-        <w:rPr>
-          <w:rFonts w:ascii="Courier New" w:cs="Courier New" w:eastAsia="Courier New" w:hAnsi="Courier New"/>
-          <w:color w:val="444444"/>
+        <w:shd w:fill="EFEFEF" w:color="EFEFEF" w:val="solid"/>
+        <w:spacing w:after="0"/>
+        <w:ind w:left="288" w:right="288"/>
+      </w:pPr>
+      <w:r>
+        <w:rPr>
+          <w:rFonts w:ascii="Courier New" w:cs="Courier New" w:eastAsia="Courier New" w:hAnsi="Courier New"/>
+          <w:color w:val="222222"/>
           <w:sz w:val="18"/>
           <w:szCs w:val="18"/>
         </w:rPr>
@@ -3696,14 +3696,14 @@
     </w:p>
     <w:p>
       <w:pPr>
-        <w:shd w:fill="1E1E1E" w:color="1E1E1E" w:val="solid"/>
-        <w:spacing w:after="0"/>
-        <w:ind w:left="288" w:right="288"/>
-      </w:pPr>
-      <w:r>
-        <w:rPr>
-          <w:rFonts w:ascii="Courier New" w:cs="Courier New" w:eastAsia="Courier New" w:hAnsi="Courier New"/>
-          <w:color w:val="444444"/>
+        <w:shd w:fill="EFEFEF" w:color="EFEFEF" w:val="solid"/>
+        <w:spacing w:after="0"/>
+        <w:ind w:left="288" w:right="288"/>
+      </w:pPr>
+      <w:r>
+        <w:rPr>
+          <w:rFonts w:ascii="Courier New" w:cs="Courier New" w:eastAsia="Courier New" w:hAnsi="Courier New"/>
+          <w:color w:val="222222"/>
           <w:sz w:val="18"/>
           <w:szCs w:val="18"/>
         </w:rPr>
@@ -3712,14 +3712,14 @@
     </w:p>
     <w:p>
       <w:pPr>
-        <w:shd w:fill="1E1E1E" w:color="1E1E1E" w:val="solid"/>
-        <w:spacing w:after="0"/>
-        <w:ind w:left="288" w:right="288"/>
-      </w:pPr>
-      <w:r>
-        <w:rPr>
-          <w:rFonts w:ascii="Courier New" w:cs="Courier New" w:eastAsia="Courier New" w:hAnsi="Courier New"/>
-          <w:color w:val="444444"/>
+        <w:shd w:fill="EFEFEF" w:color="EFEFEF" w:val="solid"/>
+        <w:spacing w:after="0"/>
+        <w:ind w:left="288" w:right="288"/>
+      </w:pPr>
+      <w:r>
+        <w:rPr>
+          <w:rFonts w:ascii="Courier New" w:cs="Courier New" w:eastAsia="Courier New" w:hAnsi="Courier New"/>
+          <w:color w:val="222222"/>
           <w:sz w:val="18"/>
           <w:szCs w:val="18"/>
         </w:rPr>
@@ -3728,14 +3728,14 @@
     </w:p>
     <w:p>
       <w:pPr>
-        <w:shd w:fill="1E1E1E" w:color="1E1E1E" w:val="solid"/>
-        <w:spacing w:after="0"/>
-        <w:ind w:left="288" w:right="288"/>
-      </w:pPr>
-      <w:r>
-        <w:rPr>
-          <w:rFonts w:ascii="Courier New" w:cs="Courier New" w:eastAsia="Courier New" w:hAnsi="Courier New"/>
-          <w:color w:val="444444"/>
+        <w:shd w:fill="EFEFEF" w:color="EFEFEF" w:val="solid"/>
+        <w:spacing w:after="0"/>
+        <w:ind w:left="288" w:right="288"/>
+      </w:pPr>
+      <w:r>
+        <w:rPr>
+          <w:rFonts w:ascii="Courier New" w:cs="Courier New" w:eastAsia="Courier New" w:hAnsi="Courier New"/>
+          <w:color w:val="222222"/>
           <w:sz w:val="18"/>
           <w:szCs w:val="18"/>
         </w:rPr>
@@ -3744,14 +3744,14 @@
     </w:p>
     <w:p>
       <w:pPr>
-        <w:shd w:fill="1E1E1E" w:color="1E1E1E" w:val="solid"/>
-        <w:spacing w:after="0"/>
-        <w:ind w:left="288" w:right="288"/>
-      </w:pPr>
-      <w:r>
-        <w:rPr>
-          <w:rFonts w:ascii="Courier New" w:cs="Courier New" w:eastAsia="Courier New" w:hAnsi="Courier New"/>
-          <w:color w:val="444444"/>
+        <w:shd w:fill="EFEFEF" w:color="EFEFEF" w:val="solid"/>
+        <w:spacing w:after="0"/>
+        <w:ind w:left="288" w:right="288"/>
+      </w:pPr>
+      <w:r>
+        <w:rPr>
+          <w:rFonts w:ascii="Courier New" w:cs="Courier New" w:eastAsia="Courier New" w:hAnsi="Courier New"/>
+          <w:color w:val="222222"/>
           <w:sz w:val="18"/>
           <w:szCs w:val="18"/>
         </w:rPr>
@@ -3760,14 +3760,14 @@
     </w:p>
     <w:p>
       <w:pPr>
-        <w:shd w:fill="1E1E1E" w:color="1E1E1E" w:val="solid"/>
-        <w:spacing w:after="0"/>
-        <w:ind w:left="288" w:right="288"/>
-      </w:pPr>
-      <w:r>
-        <w:rPr>
-          <w:rFonts w:ascii="Courier New" w:cs="Courier New" w:eastAsia="Courier New" w:hAnsi="Courier New"/>
-          <w:color w:val="444444"/>
+        <w:shd w:fill="EFEFEF" w:color="EFEFEF" w:val="solid"/>
+        <w:spacing w:after="0"/>
+        <w:ind w:left="288" w:right="288"/>
+      </w:pPr>
+      <w:r>
+        <w:rPr>
+          <w:rFonts w:ascii="Courier New" w:cs="Courier New" w:eastAsia="Courier New" w:hAnsi="Courier New"/>
+          <w:color w:val="222222"/>
           <w:sz w:val="18"/>
           <w:szCs w:val="18"/>
         </w:rPr>
@@ -3776,14 +3776,14 @@
     </w:p>
     <w:p>
       <w:pPr>
-        <w:shd w:fill="1E1E1E" w:color="1E1E1E" w:val="solid"/>
-        <w:spacing w:after="0"/>
-        <w:ind w:left="288" w:right="288"/>
-      </w:pPr>
-      <w:r>
-        <w:rPr>
-          <w:rFonts w:ascii="Courier New" w:cs="Courier New" w:eastAsia="Courier New" w:hAnsi="Courier New"/>
-          <w:color w:val="444444"/>
+        <w:shd w:fill="EFEFEF" w:color="EFEFEF" w:val="solid"/>
+        <w:spacing w:after="0"/>
+        <w:ind w:left="288" w:right="288"/>
+      </w:pPr>
+      <w:r>
+        <w:rPr>
+          <w:rFonts w:ascii="Courier New" w:cs="Courier New" w:eastAsia="Courier New" w:hAnsi="Courier New"/>
+          <w:color w:val="222222"/>
           <w:sz w:val="18"/>
           <w:szCs w:val="18"/>
         </w:rPr>
@@ -3792,14 +3792,14 @@
     </w:p>
     <w:p>
       <w:pPr>
-        <w:shd w:fill="1E1E1E" w:color="1E1E1E" w:val="solid"/>
-        <w:spacing w:after="0"/>
-        <w:ind w:left="288" w:right="288"/>
-      </w:pPr>
-      <w:r>
-        <w:rPr>
-          <w:rFonts w:ascii="Courier New" w:cs="Courier New" w:eastAsia="Courier New" w:hAnsi="Courier New"/>
-          <w:color w:val="444444"/>
+        <w:shd w:fill="EFEFEF" w:color="EFEFEF" w:val="solid"/>
+        <w:spacing w:after="0"/>
+        <w:ind w:left="288" w:right="288"/>
+      </w:pPr>
+      <w:r>
+        <w:rPr>
+          <w:rFonts w:ascii="Courier New" w:cs="Courier New" w:eastAsia="Courier New" w:hAnsi="Courier New"/>
+          <w:color w:val="222222"/>
           <w:sz w:val="18"/>
           <w:szCs w:val="18"/>
         </w:rPr>
@@ -3808,14 +3808,14 @@
     </w:p>
     <w:p>
       <w:pPr>
-        <w:shd w:fill="1E1E1E" w:color="1E1E1E" w:val="solid"/>
-        <w:spacing w:after="0"/>
-        <w:ind w:left="288" w:right="288"/>
-      </w:pPr>
-      <w:r>
-        <w:rPr>
-          <w:rFonts w:ascii="Courier New" w:cs="Courier New" w:eastAsia="Courier New" w:hAnsi="Courier New"/>
-          <w:color w:val="444444"/>
+        <w:shd w:fill="EFEFEF" w:color="EFEFEF" w:val="solid"/>
+        <w:spacing w:after="0"/>
+        <w:ind w:left="288" w:right="288"/>
+      </w:pPr>
+      <w:r>
+        <w:rPr>
+          <w:rFonts w:ascii="Courier New" w:cs="Courier New" w:eastAsia="Courier New" w:hAnsi="Courier New"/>
+          <w:color w:val="222222"/>
           <w:sz w:val="18"/>
           <w:szCs w:val="18"/>
         </w:rPr>
@@ -3824,14 +3824,14 @@
     </w:p>
     <w:p>
       <w:pPr>
-        <w:shd w:fill="1E1E1E" w:color="1E1E1E" w:val="solid"/>
-        <w:spacing w:after="0"/>
-        <w:ind w:left="288" w:right="288"/>
-      </w:pPr>
-      <w:r>
-        <w:rPr>
-          <w:rFonts w:ascii="Courier New" w:cs="Courier New" w:eastAsia="Courier New" w:hAnsi="Courier New"/>
-          <w:color w:val="444444"/>
+        <w:shd w:fill="EFEFEF" w:color="EFEFEF" w:val="solid"/>
+        <w:spacing w:after="0"/>
+        <w:ind w:left="288" w:right="288"/>
+      </w:pPr>
+      <w:r>
+        <w:rPr>
+          <w:rFonts w:ascii="Courier New" w:cs="Courier New" w:eastAsia="Courier New" w:hAnsi="Courier New"/>
+          <w:color w:val="222222"/>
           <w:sz w:val="18"/>
           <w:szCs w:val="18"/>
         </w:rPr>
@@ -3840,14 +3840,14 @@
     </w:p>
     <w:p>
       <w:pPr>
-        <w:shd w:fill="1E1E1E" w:color="1E1E1E" w:val="solid"/>
-        <w:spacing w:after="0"/>
-        <w:ind w:left="288" w:right="288"/>
-      </w:pPr>
-      <w:r>
-        <w:rPr>
-          <w:rFonts w:ascii="Courier New" w:cs="Courier New" w:eastAsia="Courier New" w:hAnsi="Courier New"/>
-          <w:color w:val="444444"/>
+        <w:shd w:fill="EFEFEF" w:color="EFEFEF" w:val="solid"/>
+        <w:spacing w:after="0"/>
+        <w:ind w:left="288" w:right="288"/>
+      </w:pPr>
+      <w:r>
+        <w:rPr>
+          <w:rFonts w:ascii="Courier New" w:cs="Courier New" w:eastAsia="Courier New" w:hAnsi="Courier New"/>
+          <w:color w:val="222222"/>
           <w:sz w:val="18"/>
           <w:szCs w:val="18"/>
         </w:rPr>
@@ -3856,14 +3856,14 @@
     </w:p>
     <w:p>
       <w:pPr>
-        <w:shd w:fill="1E1E1E" w:color="1E1E1E" w:val="solid"/>
-        <w:spacing w:after="0"/>
-        <w:ind w:left="288" w:right="288"/>
-      </w:pPr>
-      <w:r>
-        <w:rPr>
-          <w:rFonts w:ascii="Courier New" w:cs="Courier New" w:eastAsia="Courier New" w:hAnsi="Courier New"/>
-          <w:color w:val="444444"/>
+        <w:shd w:fill="EFEFEF" w:color="EFEFEF" w:val="solid"/>
+        <w:spacing w:after="0"/>
+        <w:ind w:left="288" w:right="288"/>
+      </w:pPr>
+      <w:r>
+        <w:rPr>
+          <w:rFonts w:ascii="Courier New" w:cs="Courier New" w:eastAsia="Courier New" w:hAnsi="Courier New"/>
+          <w:color w:val="222222"/>
           <w:sz w:val="18"/>
           <w:szCs w:val="18"/>
         </w:rPr>
@@ -3872,14 +3872,14 @@
     </w:p>
     <w:p>
       <w:pPr>
-        <w:shd w:fill="1E1E1E" w:color="1E1E1E" w:val="solid"/>
-        <w:spacing w:after="0"/>
-        <w:ind w:left="288" w:right="288"/>
-      </w:pPr>
-      <w:r>
-        <w:rPr>
-          <w:rFonts w:ascii="Courier New" w:cs="Courier New" w:eastAsia="Courier New" w:hAnsi="Courier New"/>
-          <w:color w:val="444444"/>
+        <w:shd w:fill="EFEFEF" w:color="EFEFEF" w:val="solid"/>
+        <w:spacing w:after="0"/>
+        <w:ind w:left="288" w:right="288"/>
+      </w:pPr>
+      <w:r>
+        <w:rPr>
+          <w:rFonts w:ascii="Courier New" w:cs="Courier New" w:eastAsia="Courier New" w:hAnsi="Courier New"/>
+          <w:color w:val="222222"/>
           <w:sz w:val="18"/>
           <w:szCs w:val="18"/>
         </w:rPr>
@@ -3888,14 +3888,14 @@
     </w:p>
     <w:p>
       <w:pPr>
-        <w:shd w:fill="1E1E1E" w:color="1E1E1E" w:val="solid"/>
-        <w:spacing w:after="0"/>
-        <w:ind w:left="288" w:right="288"/>
-      </w:pPr>
-      <w:r>
-        <w:rPr>
-          <w:rFonts w:ascii="Courier New" w:cs="Courier New" w:eastAsia="Courier New" w:hAnsi="Courier New"/>
-          <w:color w:val="444444"/>
+        <w:shd w:fill="EFEFEF" w:color="EFEFEF" w:val="solid"/>
+        <w:spacing w:after="0"/>
+        <w:ind w:left="288" w:right="288"/>
+      </w:pPr>
+      <w:r>
+        <w:rPr>
+          <w:rFonts w:ascii="Courier New" w:cs="Courier New" w:eastAsia="Courier New" w:hAnsi="Courier New"/>
+          <w:color w:val="222222"/>
           <w:sz w:val="18"/>
           <w:szCs w:val="18"/>
         </w:rPr>
@@ -3904,7 +3904,7 @@
     </w:p>
     <w:p>
       <w:pPr>
-        <w:shd w:fill="1E1E1E" w:color="1E1E1E" w:val="solid"/>
+        <w:shd w:fill="EFEFEF" w:color="EFEFEF" w:val="solid"/>
         <w:spacing w:after="120"/>
       </w:pPr>
     </w:p>
@@ -3945,20 +3945,20 @@
     </w:p>
     <w:p>
       <w:pPr>
-        <w:shd w:fill="1E1E1E" w:color="1E1E1E" w:val="solid"/>
-        <w:spacing w:after="0"/>
-      </w:pPr>
-    </w:p>
-    <w:p>
-      <w:pPr>
-        <w:shd w:fill="1E1E1E" w:color="1E1E1E" w:val="solid"/>
-        <w:spacing w:after="0"/>
-        <w:ind w:left="288" w:right="288"/>
-      </w:pPr>
-      <w:r>
-        <w:rPr>
-          <w:rFonts w:ascii="Courier New" w:cs="Courier New" w:eastAsia="Courier New" w:hAnsi="Courier New"/>
-          <w:color w:val="444444"/>
+        <w:shd w:fill="EFEFEF" w:color="EFEFEF" w:val="solid"/>
+        <w:spacing w:after="0"/>
+      </w:pPr>
+    </w:p>
+    <w:p>
+      <w:pPr>
+        <w:shd w:fill="EFEFEF" w:color="EFEFEF" w:val="solid"/>
+        <w:spacing w:after="0"/>
+        <w:ind w:left="288" w:right="288"/>
+      </w:pPr>
+      <w:r>
+        <w:rPr>
+          <w:rFonts w:ascii="Courier New" w:cs="Courier New" w:eastAsia="Courier New" w:hAnsi="Courier New"/>
+          <w:color w:val="222222"/>
           <w:sz w:val="18"/>
           <w:szCs w:val="18"/>
         </w:rPr>
@@ -3967,14 +3967,14 @@
     </w:p>
     <w:p>
       <w:pPr>
-        <w:shd w:fill="1E1E1E" w:color="1E1E1E" w:val="solid"/>
-        <w:spacing w:after="0"/>
-        <w:ind w:left="288" w:right="288"/>
-      </w:pPr>
-      <w:r>
-        <w:rPr>
-          <w:rFonts w:ascii="Courier New" w:cs="Courier New" w:eastAsia="Courier New" w:hAnsi="Courier New"/>
-          <w:color w:val="444444"/>
+        <w:shd w:fill="EFEFEF" w:color="EFEFEF" w:val="solid"/>
+        <w:spacing w:after="0"/>
+        <w:ind w:left="288" w:right="288"/>
+      </w:pPr>
+      <w:r>
+        <w:rPr>
+          <w:rFonts w:ascii="Courier New" w:cs="Courier New" w:eastAsia="Courier New" w:hAnsi="Courier New"/>
+          <w:color w:val="222222"/>
           <w:sz w:val="18"/>
           <w:szCs w:val="18"/>
         </w:rPr>
@@ -3983,14 +3983,14 @@
     </w:p>
     <w:p>
       <w:pPr>
-        <w:shd w:fill="1E1E1E" w:color="1E1E1E" w:val="solid"/>
-        <w:spacing w:after="0"/>
-        <w:ind w:left="288" w:right="288"/>
-      </w:pPr>
-      <w:r>
-        <w:rPr>
-          <w:rFonts w:ascii="Courier New" w:cs="Courier New" w:eastAsia="Courier New" w:hAnsi="Courier New"/>
-          <w:color w:val="444444"/>
+        <w:shd w:fill="EFEFEF" w:color="EFEFEF" w:val="solid"/>
+        <w:spacing w:after="0"/>
+        <w:ind w:left="288" w:right="288"/>
+      </w:pPr>
+      <w:r>
+        <w:rPr>
+          <w:rFonts w:ascii="Courier New" w:cs="Courier New" w:eastAsia="Courier New" w:hAnsi="Courier New"/>
+          <w:color w:val="222222"/>
           <w:sz w:val="18"/>
           <w:szCs w:val="18"/>
         </w:rPr>
@@ -3999,14 +3999,14 @@
     </w:p>
     <w:p>
       <w:pPr>
-        <w:shd w:fill="1E1E1E" w:color="1E1E1E" w:val="solid"/>
-        <w:spacing w:after="0"/>
-        <w:ind w:left="288" w:right="288"/>
-      </w:pPr>
-      <w:r>
-        <w:rPr>
-          <w:rFonts w:ascii="Courier New" w:cs="Courier New" w:eastAsia="Courier New" w:hAnsi="Courier New"/>
-          <w:color w:val="444444"/>
+        <w:shd w:fill="EFEFEF" w:color="EFEFEF" w:val="solid"/>
+        <w:spacing w:after="0"/>
+        <w:ind w:left="288" w:right="288"/>
+      </w:pPr>
+      <w:r>
+        <w:rPr>
+          <w:rFonts w:ascii="Courier New" w:cs="Courier New" w:eastAsia="Courier New" w:hAnsi="Courier New"/>
+          <w:color w:val="222222"/>
           <w:sz w:val="18"/>
           <w:szCs w:val="18"/>
         </w:rPr>
@@ -4015,14 +4015,14 @@
     </w:p>
     <w:p>
       <w:pPr>
-        <w:shd w:fill="1E1E1E" w:color="1E1E1E" w:val="solid"/>
-        <w:spacing w:after="0"/>
-        <w:ind w:left="288" w:right="288"/>
-      </w:pPr>
-      <w:r>
-        <w:rPr>
-          <w:rFonts w:ascii="Courier New" w:cs="Courier New" w:eastAsia="Courier New" w:hAnsi="Courier New"/>
-          <w:color w:val="444444"/>
+        <w:shd w:fill="EFEFEF" w:color="EFEFEF" w:val="solid"/>
+        <w:spacing w:after="0"/>
+        <w:ind w:left="288" w:right="288"/>
+      </w:pPr>
+      <w:r>
+        <w:rPr>
+          <w:rFonts w:ascii="Courier New" w:cs="Courier New" w:eastAsia="Courier New" w:hAnsi="Courier New"/>
+          <w:color w:val="222222"/>
           <w:sz w:val="18"/>
           <w:szCs w:val="18"/>
         </w:rPr>
@@ -4031,14 +4031,14 @@
     </w:p>
     <w:p>
       <w:pPr>
-        <w:shd w:fill="1E1E1E" w:color="1E1E1E" w:val="solid"/>
-        <w:spacing w:after="0"/>
-        <w:ind w:left="288" w:right="288"/>
-      </w:pPr>
-      <w:r>
-        <w:rPr>
-          <w:rFonts w:ascii="Courier New" w:cs="Courier New" w:eastAsia="Courier New" w:hAnsi="Courier New"/>
-          <w:color w:val="444444"/>
+        <w:shd w:fill="EFEFEF" w:color="EFEFEF" w:val="solid"/>
+        <w:spacing w:after="0"/>
+        <w:ind w:left="288" w:right="288"/>
+      </w:pPr>
+      <w:r>
+        <w:rPr>
+          <w:rFonts w:ascii="Courier New" w:cs="Courier New" w:eastAsia="Courier New" w:hAnsi="Courier New"/>
+          <w:color w:val="222222"/>
           <w:sz w:val="18"/>
           <w:szCs w:val="18"/>
         </w:rPr>
@@ -4047,14 +4047,14 @@
     </w:p>
     <w:p>
       <w:pPr>
-        <w:shd w:fill="1E1E1E" w:color="1E1E1E" w:val="solid"/>
-        <w:spacing w:after="0"/>
-        <w:ind w:left="288" w:right="288"/>
-      </w:pPr>
-      <w:r>
-        <w:rPr>
-          <w:rFonts w:ascii="Courier New" w:cs="Courier New" w:eastAsia="Courier New" w:hAnsi="Courier New"/>
-          <w:color w:val="444444"/>
+        <w:shd w:fill="EFEFEF" w:color="EFEFEF" w:val="solid"/>
+        <w:spacing w:after="0"/>
+        <w:ind w:left="288" w:right="288"/>
+      </w:pPr>
+      <w:r>
+        <w:rPr>
+          <w:rFonts w:ascii="Courier New" w:cs="Courier New" w:eastAsia="Courier New" w:hAnsi="Courier New"/>
+          <w:color w:val="222222"/>
           <w:sz w:val="18"/>
           <w:szCs w:val="18"/>
         </w:rPr>
@@ -4063,14 +4063,14 @@
     </w:p>
     <w:p>
       <w:pPr>
-        <w:shd w:fill="1E1E1E" w:color="1E1E1E" w:val="solid"/>
-        <w:spacing w:after="0"/>
-        <w:ind w:left="288" w:right="288"/>
-      </w:pPr>
-      <w:r>
-        <w:rPr>
-          <w:rFonts w:ascii="Courier New" w:cs="Courier New" w:eastAsia="Courier New" w:hAnsi="Courier New"/>
-          <w:color w:val="444444"/>
+        <w:shd w:fill="EFEFEF" w:color="EFEFEF" w:val="solid"/>
+        <w:spacing w:after="0"/>
+        <w:ind w:left="288" w:right="288"/>
+      </w:pPr>
+      <w:r>
+        <w:rPr>
+          <w:rFonts w:ascii="Courier New" w:cs="Courier New" w:eastAsia="Courier New" w:hAnsi="Courier New"/>
+          <w:color w:val="222222"/>
           <w:sz w:val="18"/>
           <w:szCs w:val="18"/>
         </w:rPr>
@@ -4079,14 +4079,14 @@
     </w:p>
     <w:p>
       <w:pPr>
-        <w:shd w:fill="1E1E1E" w:color="1E1E1E" w:val="solid"/>
-        <w:spacing w:after="0"/>
-        <w:ind w:left="288" w:right="288"/>
-      </w:pPr>
-      <w:r>
-        <w:rPr>
-          <w:rFonts w:ascii="Courier New" w:cs="Courier New" w:eastAsia="Courier New" w:hAnsi="Courier New"/>
-          <w:color w:val="444444"/>
+        <w:shd w:fill="EFEFEF" w:color="EFEFEF" w:val="solid"/>
+        <w:spacing w:after="0"/>
+        <w:ind w:left="288" w:right="288"/>
+      </w:pPr>
+      <w:r>
+        <w:rPr>
+          <w:rFonts w:ascii="Courier New" w:cs="Courier New" w:eastAsia="Courier New" w:hAnsi="Courier New"/>
+          <w:color w:val="222222"/>
           <w:sz w:val="18"/>
           <w:szCs w:val="18"/>
         </w:rPr>
@@ -4095,14 +4095,14 @@
     </w:p>
     <w:p>
       <w:pPr>
-        <w:shd w:fill="1E1E1E" w:color="1E1E1E" w:val="solid"/>
-        <w:spacing w:after="0"/>
-        <w:ind w:left="288" w:right="288"/>
-      </w:pPr>
-      <w:r>
-        <w:rPr>
-          <w:rFonts w:ascii="Courier New" w:cs="Courier New" w:eastAsia="Courier New" w:hAnsi="Courier New"/>
-          <w:color w:val="444444"/>
+        <w:shd w:fill="EFEFEF" w:color="EFEFEF" w:val="solid"/>
+        <w:spacing w:after="0"/>
+        <w:ind w:left="288" w:right="288"/>
+      </w:pPr>
+      <w:r>
+        <w:rPr>
+          <w:rFonts w:ascii="Courier New" w:cs="Courier New" w:eastAsia="Courier New" w:hAnsi="Courier New"/>
+          <w:color w:val="222222"/>
           <w:sz w:val="18"/>
           <w:szCs w:val="18"/>
         </w:rPr>
@@ -4111,14 +4111,14 @@
     </w:p>
     <w:p>
       <w:pPr>
-        <w:shd w:fill="1E1E1E" w:color="1E1E1E" w:val="solid"/>
-        <w:spacing w:after="0"/>
-        <w:ind w:left="288" w:right="288"/>
-      </w:pPr>
-      <w:r>
-        <w:rPr>
-          <w:rFonts w:ascii="Courier New" w:cs="Courier New" w:eastAsia="Courier New" w:hAnsi="Courier New"/>
-          <w:color w:val="444444"/>
+        <w:shd w:fill="EFEFEF" w:color="EFEFEF" w:val="solid"/>
+        <w:spacing w:after="0"/>
+        <w:ind w:left="288" w:right="288"/>
+      </w:pPr>
+      <w:r>
+        <w:rPr>
+          <w:rFonts w:ascii="Courier New" w:cs="Courier New" w:eastAsia="Courier New" w:hAnsi="Courier New"/>
+          <w:color w:val="222222"/>
           <w:sz w:val="18"/>
           <w:szCs w:val="18"/>
         </w:rPr>
@@ -4127,14 +4127,14 @@
     </w:p>
     <w:p>
       <w:pPr>
-        <w:shd w:fill="1E1E1E" w:color="1E1E1E" w:val="solid"/>
-        <w:spacing w:after="0"/>
-        <w:ind w:left="288" w:right="288"/>
-      </w:pPr>
-      <w:r>
-        <w:rPr>
-          <w:rFonts w:ascii="Courier New" w:cs="Courier New" w:eastAsia="Courier New" w:hAnsi="Courier New"/>
-          <w:color w:val="444444"/>
+        <w:shd w:fill="EFEFEF" w:color="EFEFEF" w:val="solid"/>
+        <w:spacing w:after="0"/>
+        <w:ind w:left="288" w:right="288"/>
+      </w:pPr>
+      <w:r>
+        <w:rPr>
+          <w:rFonts w:ascii="Courier New" w:cs="Courier New" w:eastAsia="Courier New" w:hAnsi="Courier New"/>
+          <w:color w:val="222222"/>
           <w:sz w:val="18"/>
           <w:szCs w:val="18"/>
         </w:rPr>
@@ -4143,14 +4143,14 @@
     </w:p>
     <w:p>
       <w:pPr>
-        <w:shd w:fill="1E1E1E" w:color="1E1E1E" w:val="solid"/>
-        <w:spacing w:after="0"/>
-        <w:ind w:left="288" w:right="288"/>
-      </w:pPr>
-      <w:r>
-        <w:rPr>
-          <w:rFonts w:ascii="Courier New" w:cs="Courier New" w:eastAsia="Courier New" w:hAnsi="Courier New"/>
-          <w:color w:val="444444"/>
+        <w:shd w:fill="EFEFEF" w:color="EFEFEF" w:val="solid"/>
+        <w:spacing w:after="0"/>
+        <w:ind w:left="288" w:right="288"/>
+      </w:pPr>
+      <w:r>
+        <w:rPr>
+          <w:rFonts w:ascii="Courier New" w:cs="Courier New" w:eastAsia="Courier New" w:hAnsi="Courier New"/>
+          <w:color w:val="222222"/>
           <w:sz w:val="18"/>
           <w:szCs w:val="18"/>
         </w:rPr>
@@ -4159,14 +4159,14 @@
     </w:p>
     <w:p>
       <w:pPr>
-        <w:shd w:fill="1E1E1E" w:color="1E1E1E" w:val="solid"/>
-        <w:spacing w:after="0"/>
-        <w:ind w:left="288" w:right="288"/>
-      </w:pPr>
-      <w:r>
-        <w:rPr>
-          <w:rFonts w:ascii="Courier New" w:cs="Courier New" w:eastAsia="Courier New" w:hAnsi="Courier New"/>
-          <w:color w:val="444444"/>
+        <w:shd w:fill="EFEFEF" w:color="EFEFEF" w:val="solid"/>
+        <w:spacing w:after="0"/>
+        <w:ind w:left="288" w:right="288"/>
+      </w:pPr>
+      <w:r>
+        <w:rPr>
+          <w:rFonts w:ascii="Courier New" w:cs="Courier New" w:eastAsia="Courier New" w:hAnsi="Courier New"/>
+          <w:color w:val="222222"/>
           <w:sz w:val="18"/>
           <w:szCs w:val="18"/>
         </w:rPr>
@@ -4175,14 +4175,14 @@
     </w:p>
     <w:p>
       <w:pPr>
-        <w:shd w:fill="1E1E1E" w:color="1E1E1E" w:val="solid"/>
-        <w:spacing w:after="0"/>
-        <w:ind w:left="288" w:right="288"/>
-      </w:pPr>
-      <w:r>
-        <w:rPr>
-          <w:rFonts w:ascii="Courier New" w:cs="Courier New" w:eastAsia="Courier New" w:hAnsi="Courier New"/>
-          <w:color w:val="444444"/>
+        <w:shd w:fill="EFEFEF" w:color="EFEFEF" w:val="solid"/>
+        <w:spacing w:after="0"/>
+        <w:ind w:left="288" w:right="288"/>
+      </w:pPr>
+      <w:r>
+        <w:rPr>
+          <w:rFonts w:ascii="Courier New" w:cs="Courier New" w:eastAsia="Courier New" w:hAnsi="Courier New"/>
+          <w:color w:val="222222"/>
           <w:sz w:val="18"/>
           <w:szCs w:val="18"/>
         </w:rPr>
@@ -4191,14 +4191,14 @@
     </w:p>
     <w:p>
       <w:pPr>
-        <w:shd w:fill="1E1E1E" w:color="1E1E1E" w:val="solid"/>
-        <w:spacing w:after="0"/>
-        <w:ind w:left="288" w:right="288"/>
-      </w:pPr>
-      <w:r>
-        <w:rPr>
-          <w:rFonts w:ascii="Courier New" w:cs="Courier New" w:eastAsia="Courier New" w:hAnsi="Courier New"/>
-          <w:color w:val="444444"/>
+        <w:shd w:fill="EFEFEF" w:color="EFEFEF" w:val="solid"/>
+        <w:spacing w:after="0"/>
+        <w:ind w:left="288" w:right="288"/>
+      </w:pPr>
+      <w:r>
+        <w:rPr>
+          <w:rFonts w:ascii="Courier New" w:cs="Courier New" w:eastAsia="Courier New" w:hAnsi="Courier New"/>
+          <w:color w:val="222222"/>
           <w:sz w:val="18"/>
           <w:szCs w:val="18"/>
         </w:rPr>
@@ -4207,14 +4207,14 @@
     </w:p>
     <w:p>
       <w:pPr>
-        <w:shd w:fill="1E1E1E" w:color="1E1E1E" w:val="solid"/>
-        <w:spacing w:after="0"/>
-        <w:ind w:left="288" w:right="288"/>
-      </w:pPr>
-      <w:r>
-        <w:rPr>
-          <w:rFonts w:ascii="Courier New" w:cs="Courier New" w:eastAsia="Courier New" w:hAnsi="Courier New"/>
-          <w:color w:val="444444"/>
+        <w:shd w:fill="EFEFEF" w:color="EFEFEF" w:val="solid"/>
+        <w:spacing w:after="0"/>
+        <w:ind w:left="288" w:right="288"/>
+      </w:pPr>
+      <w:r>
+        <w:rPr>
+          <w:rFonts w:ascii="Courier New" w:cs="Courier New" w:eastAsia="Courier New" w:hAnsi="Courier New"/>
+          <w:color w:val="222222"/>
           <w:sz w:val="18"/>
           <w:szCs w:val="18"/>
         </w:rPr>
@@ -4223,14 +4223,14 @@
     </w:p>
     <w:p>
       <w:pPr>
-        <w:shd w:fill="1E1E1E" w:color="1E1E1E" w:val="solid"/>
-        <w:spacing w:after="0"/>
-        <w:ind w:left="288" w:right="288"/>
-      </w:pPr>
-      <w:r>
-        <w:rPr>
-          <w:rFonts w:ascii="Courier New" w:cs="Courier New" w:eastAsia="Courier New" w:hAnsi="Courier New"/>
-          <w:color w:val="444444"/>
+        <w:shd w:fill="EFEFEF" w:color="EFEFEF" w:val="solid"/>
+        <w:spacing w:after="0"/>
+        <w:ind w:left="288" w:right="288"/>
+      </w:pPr>
+      <w:r>
+        <w:rPr>
+          <w:rFonts w:ascii="Courier New" w:cs="Courier New" w:eastAsia="Courier New" w:hAnsi="Courier New"/>
+          <w:color w:val="222222"/>
           <w:sz w:val="18"/>
           <w:szCs w:val="18"/>
         </w:rPr>
@@ -4239,14 +4239,14 @@
     </w:p>
     <w:p>
       <w:pPr>
-        <w:shd w:fill="1E1E1E" w:color="1E1E1E" w:val="solid"/>
-        <w:spacing w:after="0"/>
-        <w:ind w:left="288" w:right="288"/>
-      </w:pPr>
-      <w:r>
-        <w:rPr>
-          <w:rFonts w:ascii="Courier New" w:cs="Courier New" w:eastAsia="Courier New" w:hAnsi="Courier New"/>
-          <w:color w:val="444444"/>
+        <w:shd w:fill="EFEFEF" w:color="EFEFEF" w:val="solid"/>
+        <w:spacing w:after="0"/>
+        <w:ind w:left="288" w:right="288"/>
+      </w:pPr>
+      <w:r>
+        <w:rPr>
+          <w:rFonts w:ascii="Courier New" w:cs="Courier New" w:eastAsia="Courier New" w:hAnsi="Courier New"/>
+          <w:color w:val="222222"/>
           <w:sz w:val="18"/>
           <w:szCs w:val="18"/>
         </w:rPr>
@@ -4255,14 +4255,14 @@
     </w:p>
     <w:p>
       <w:pPr>
-        <w:shd w:fill="1E1E1E" w:color="1E1E1E" w:val="solid"/>
-        <w:spacing w:after="0"/>
-        <w:ind w:left="288" w:right="288"/>
-      </w:pPr>
-      <w:r>
-        <w:rPr>
-          <w:rFonts w:ascii="Courier New" w:cs="Courier New" w:eastAsia="Courier New" w:hAnsi="Courier New"/>
-          <w:color w:val="444444"/>
+        <w:shd w:fill="EFEFEF" w:color="EFEFEF" w:val="solid"/>
+        <w:spacing w:after="0"/>
+        <w:ind w:left="288" w:right="288"/>
+      </w:pPr>
+      <w:r>
+        <w:rPr>
+          <w:rFonts w:ascii="Courier New" w:cs="Courier New" w:eastAsia="Courier New" w:hAnsi="Courier New"/>
+          <w:color w:val="222222"/>
           <w:sz w:val="18"/>
           <w:szCs w:val="18"/>
         </w:rPr>
@@ -4271,14 +4271,14 @@
     </w:p>
     <w:p>
       <w:pPr>
-        <w:shd w:fill="1E1E1E" w:color="1E1E1E" w:val="solid"/>
-        <w:spacing w:after="0"/>
-        <w:ind w:left="288" w:right="288"/>
-      </w:pPr>
-      <w:r>
-        <w:rPr>
-          <w:rFonts w:ascii="Courier New" w:cs="Courier New" w:eastAsia="Courier New" w:hAnsi="Courier New"/>
-          <w:color w:val="444444"/>
+        <w:shd w:fill="EFEFEF" w:color="EFEFEF" w:val="solid"/>
+        <w:spacing w:after="0"/>
+        <w:ind w:left="288" w:right="288"/>
+      </w:pPr>
+      <w:r>
+        <w:rPr>
+          <w:rFonts w:ascii="Courier New" w:cs="Courier New" w:eastAsia="Courier New" w:hAnsi="Courier New"/>
+          <w:color w:val="222222"/>
           <w:sz w:val="18"/>
           <w:szCs w:val="18"/>
         </w:rPr>
@@ -4287,14 +4287,14 @@
     </w:p>
     <w:p>
       <w:pPr>
-        <w:shd w:fill="1E1E1E" w:color="1E1E1E" w:val="solid"/>
-        <w:spacing w:after="0"/>
-        <w:ind w:left="288" w:right="288"/>
-      </w:pPr>
-      <w:r>
-        <w:rPr>
-          <w:rFonts w:ascii="Courier New" w:cs="Courier New" w:eastAsia="Courier New" w:hAnsi="Courier New"/>
-          <w:color w:val="444444"/>
+        <w:shd w:fill="EFEFEF" w:color="EFEFEF" w:val="solid"/>
+        <w:spacing w:after="0"/>
+        <w:ind w:left="288" w:right="288"/>
+      </w:pPr>
+      <w:r>
+        <w:rPr>
+          <w:rFonts w:ascii="Courier New" w:cs="Courier New" w:eastAsia="Courier New" w:hAnsi="Courier New"/>
+          <w:color w:val="222222"/>
           <w:sz w:val="18"/>
           <w:szCs w:val="18"/>
         </w:rPr>
@@ -4303,14 +4303,14 @@
     </w:p>
     <w:p>
       <w:pPr>
-        <w:shd w:fill="1E1E1E" w:color="1E1E1E" w:val="solid"/>
-        <w:spacing w:after="0"/>
-        <w:ind w:left="288" w:right="288"/>
-      </w:pPr>
-      <w:r>
-        <w:rPr>
-          <w:rFonts w:ascii="Courier New" w:cs="Courier New" w:eastAsia="Courier New" w:hAnsi="Courier New"/>
-          <w:color w:val="444444"/>
+        <w:shd w:fill="EFEFEF" w:color="EFEFEF" w:val="solid"/>
+        <w:spacing w:after="0"/>
+        <w:ind w:left="288" w:right="288"/>
+      </w:pPr>
+      <w:r>
+        <w:rPr>
+          <w:rFonts w:ascii="Courier New" w:cs="Courier New" w:eastAsia="Courier New" w:hAnsi="Courier New"/>
+          <w:color w:val="222222"/>
           <w:sz w:val="18"/>
           <w:szCs w:val="18"/>
         </w:rPr>
@@ -4319,14 +4319,14 @@
     </w:p>
     <w:p>
       <w:pPr>
-        <w:shd w:fill="1E1E1E" w:color="1E1E1E" w:val="solid"/>
-        <w:spacing w:after="0"/>
-        <w:ind w:left="288" w:right="288"/>
-      </w:pPr>
-      <w:r>
-        <w:rPr>
-          <w:rFonts w:ascii="Courier New" w:cs="Courier New" w:eastAsia="Courier New" w:hAnsi="Courier New"/>
-          <w:color w:val="444444"/>
+        <w:shd w:fill="EFEFEF" w:color="EFEFEF" w:val="solid"/>
+        <w:spacing w:after="0"/>
+        <w:ind w:left="288" w:right="288"/>
+      </w:pPr>
+      <w:r>
+        <w:rPr>
+          <w:rFonts w:ascii="Courier New" w:cs="Courier New" w:eastAsia="Courier New" w:hAnsi="Courier New"/>
+          <w:color w:val="222222"/>
           <w:sz w:val="18"/>
           <w:szCs w:val="18"/>
         </w:rPr>
@@ -4335,26 +4335,26 @@
     </w:p>
     <w:p>
       <w:pPr>
-        <w:shd w:fill="1E1E1E" w:color="1E1E1E" w:val="solid"/>
+        <w:shd w:fill="EFEFEF" w:color="EFEFEF" w:val="solid"/>
         <w:spacing w:after="120"/>
       </w:pPr>
     </w:p>
     <w:p>
       <w:pPr>
-        <w:shd w:fill="1E1E1E" w:color="1E1E1E" w:val="solid"/>
-        <w:spacing w:after="0"/>
-      </w:pPr>
-    </w:p>
-    <w:p>
-      <w:pPr>
-        <w:shd w:fill="1E1E1E" w:color="1E1E1E" w:val="solid"/>
-        <w:spacing w:after="0"/>
-        <w:ind w:left="288" w:right="288"/>
-      </w:pPr>
-      <w:r>
-        <w:rPr>
-          <w:rFonts w:ascii="Courier New" w:cs="Courier New" w:eastAsia="Courier New" w:hAnsi="Courier New"/>
-          <w:color w:val="444444"/>
+        <w:shd w:fill="EFEFEF" w:color="EFEFEF" w:val="solid"/>
+        <w:spacing w:after="0"/>
+      </w:pPr>
+    </w:p>
+    <w:p>
+      <w:pPr>
+        <w:shd w:fill="EFEFEF" w:color="EFEFEF" w:val="solid"/>
+        <w:spacing w:after="0"/>
+        <w:ind w:left="288" w:right="288"/>
+      </w:pPr>
+      <w:r>
+        <w:rPr>
+          <w:rFonts w:ascii="Courier New" w:cs="Courier New" w:eastAsia="Courier New" w:hAnsi="Courier New"/>
+          <w:color w:val="222222"/>
           <w:sz w:val="18"/>
           <w:szCs w:val="18"/>
         </w:rPr>
@@ -4363,14 +4363,14 @@
     </w:p>
     <w:p>
       <w:pPr>
-        <w:shd w:fill="1E1E1E" w:color="1E1E1E" w:val="solid"/>
-        <w:spacing w:after="0"/>
-        <w:ind w:left="288" w:right="288"/>
-      </w:pPr>
-      <w:r>
-        <w:rPr>
-          <w:rFonts w:ascii="Courier New" w:cs="Courier New" w:eastAsia="Courier New" w:hAnsi="Courier New"/>
-          <w:color w:val="444444"/>
+        <w:shd w:fill="EFEFEF" w:color="EFEFEF" w:val="solid"/>
+        <w:spacing w:after="0"/>
+        <w:ind w:left="288" w:right="288"/>
+      </w:pPr>
+      <w:r>
+        <w:rPr>
+          <w:rFonts w:ascii="Courier New" w:cs="Courier New" w:eastAsia="Courier New" w:hAnsi="Courier New"/>
+          <w:color w:val="222222"/>
           <w:sz w:val="18"/>
           <w:szCs w:val="18"/>
         </w:rPr>
@@ -4379,7 +4379,7 @@
     </w:p>
     <w:p>
       <w:pPr>
-        <w:shd w:fill="1E1E1E" w:color="1E1E1E" w:val="solid"/>
+        <w:shd w:fill="EFEFEF" w:color="EFEFEF" w:val="solid"/>
         <w:spacing w:after="120"/>
       </w:pPr>
     </w:p>
@@ -4433,20 +4433,20 @@
     </w:p>
     <w:p>
       <w:pPr>
-        <w:shd w:fill="1E1E1E" w:color="1E1E1E" w:val="solid"/>
-        <w:spacing w:after="0"/>
-      </w:pPr>
-    </w:p>
-    <w:p>
-      <w:pPr>
-        <w:shd w:fill="1E1E1E" w:color="1E1E1E" w:val="solid"/>
-        <w:spacing w:after="0"/>
-        <w:ind w:left="288" w:right="288"/>
-      </w:pPr>
-      <w:r>
-        <w:rPr>
-          <w:rFonts w:ascii="Courier New" w:cs="Courier New" w:eastAsia="Courier New" w:hAnsi="Courier New"/>
-          <w:color w:val="444444"/>
+        <w:shd w:fill="EFEFEF" w:color="EFEFEF" w:val="solid"/>
+        <w:spacing w:after="0"/>
+      </w:pPr>
+    </w:p>
+    <w:p>
+      <w:pPr>
+        <w:shd w:fill="EFEFEF" w:color="EFEFEF" w:val="solid"/>
+        <w:spacing w:after="0"/>
+        <w:ind w:left="288" w:right="288"/>
+      </w:pPr>
+      <w:r>
+        <w:rPr>
+          <w:rFonts w:ascii="Courier New" w:cs="Courier New" w:eastAsia="Courier New" w:hAnsi="Courier New"/>
+          <w:color w:val="222222"/>
           <w:sz w:val="18"/>
           <w:szCs w:val="18"/>
         </w:rPr>
@@ -4455,14 +4455,14 @@
     </w:p>
     <w:p>
       <w:pPr>
-        <w:shd w:fill="1E1E1E" w:color="1E1E1E" w:val="solid"/>
-        <w:spacing w:after="0"/>
-        <w:ind w:left="288" w:right="288"/>
-      </w:pPr>
-      <w:r>
-        <w:rPr>
-          <w:rFonts w:ascii="Courier New" w:cs="Courier New" w:eastAsia="Courier New" w:hAnsi="Courier New"/>
-          <w:color w:val="444444"/>
+        <w:shd w:fill="EFEFEF" w:color="EFEFEF" w:val="solid"/>
+        <w:spacing w:after="0"/>
+        <w:ind w:left="288" w:right="288"/>
+      </w:pPr>
+      <w:r>
+        <w:rPr>
+          <w:rFonts w:ascii="Courier New" w:cs="Courier New" w:eastAsia="Courier New" w:hAnsi="Courier New"/>
+          <w:color w:val="222222"/>
           <w:sz w:val="18"/>
           <w:szCs w:val="18"/>
         </w:rPr>
@@ -4471,14 +4471,14 @@
     </w:p>
     <w:p>
       <w:pPr>
-        <w:shd w:fill="1E1E1E" w:color="1E1E1E" w:val="solid"/>
-        <w:spacing w:after="0"/>
-        <w:ind w:left="288" w:right="288"/>
-      </w:pPr>
-      <w:r>
-        <w:rPr>
-          <w:rFonts w:ascii="Courier New" w:cs="Courier New" w:eastAsia="Courier New" w:hAnsi="Courier New"/>
-          <w:color w:val="444444"/>
+        <w:shd w:fill="EFEFEF" w:color="EFEFEF" w:val="solid"/>
+        <w:spacing w:after="0"/>
+        <w:ind w:left="288" w:right="288"/>
+      </w:pPr>
+      <w:r>
+        <w:rPr>
+          <w:rFonts w:ascii="Courier New" w:cs="Courier New" w:eastAsia="Courier New" w:hAnsi="Courier New"/>
+          <w:color w:val="222222"/>
           <w:sz w:val="18"/>
           <w:szCs w:val="18"/>
         </w:rPr>
@@ -4487,14 +4487,14 @@
     </w:p>
     <w:p>
       <w:pPr>
-        <w:shd w:fill="1E1E1E" w:color="1E1E1E" w:val="solid"/>
-        <w:spacing w:after="0"/>
-        <w:ind w:left="288" w:right="288"/>
-      </w:pPr>
-      <w:r>
-        <w:rPr>
-          <w:rFonts w:ascii="Courier New" w:cs="Courier New" w:eastAsia="Courier New" w:hAnsi="Courier New"/>
-          <w:color w:val="444444"/>
+        <w:shd w:fill="EFEFEF" w:color="EFEFEF" w:val="solid"/>
+        <w:spacing w:after="0"/>
+        <w:ind w:left="288" w:right="288"/>
+      </w:pPr>
+      <w:r>
+        <w:rPr>
+          <w:rFonts w:ascii="Courier New" w:cs="Courier New" w:eastAsia="Courier New" w:hAnsi="Courier New"/>
+          <w:color w:val="222222"/>
           <w:sz w:val="18"/>
           <w:szCs w:val="18"/>
         </w:rPr>
@@ -4503,14 +4503,14 @@
     </w:p>
     <w:p>
       <w:pPr>
-        <w:shd w:fill="1E1E1E" w:color="1E1E1E" w:val="solid"/>
-        <w:spacing w:after="0"/>
-        <w:ind w:left="288" w:right="288"/>
-      </w:pPr>
-      <w:r>
-        <w:rPr>
-          <w:rFonts w:ascii="Courier New" w:cs="Courier New" w:eastAsia="Courier New" w:hAnsi="Courier New"/>
-          <w:color w:val="444444"/>
+        <w:shd w:fill="EFEFEF" w:color="EFEFEF" w:val="solid"/>
+        <w:spacing w:after="0"/>
+        <w:ind w:left="288" w:right="288"/>
+      </w:pPr>
+      <w:r>
+        <w:rPr>
+          <w:rFonts w:ascii="Courier New" w:cs="Courier New" w:eastAsia="Courier New" w:hAnsi="Courier New"/>
+          <w:color w:val="222222"/>
           <w:sz w:val="18"/>
           <w:szCs w:val="18"/>
         </w:rPr>
@@ -4519,7 +4519,7 @@
     </w:p>
     <w:p>
       <w:pPr>
-        <w:shd w:fill="1E1E1E" w:color="1E1E1E" w:val="solid"/>
+        <w:shd w:fill="EFEFEF" w:color="EFEFEF" w:val="solid"/>
         <w:spacing w:after="120"/>
       </w:pPr>
     </w:p>
@@ -4539,20 +4539,20 @@
     </w:p>
     <w:p>
       <w:pPr>
-        <w:shd w:fill="1E1E1E" w:color="1E1E1E" w:val="solid"/>
-        <w:spacing w:after="0"/>
-      </w:pPr>
-    </w:p>
-    <w:p>
-      <w:pPr>
-        <w:shd w:fill="1E1E1E" w:color="1E1E1E" w:val="solid"/>
-        <w:spacing w:after="0"/>
-        <w:ind w:left="288" w:right="288"/>
-      </w:pPr>
-      <w:r>
-        <w:rPr>
-          <w:rFonts w:ascii="Courier New" w:cs="Courier New" w:eastAsia="Courier New" w:hAnsi="Courier New"/>
-          <w:color w:val="444444"/>
+        <w:shd w:fill="EFEFEF" w:color="EFEFEF" w:val="solid"/>
+        <w:spacing w:after="0"/>
+      </w:pPr>
+    </w:p>
+    <w:p>
+      <w:pPr>
+        <w:shd w:fill="EFEFEF" w:color="EFEFEF" w:val="solid"/>
+        <w:spacing w:after="0"/>
+        <w:ind w:left="288" w:right="288"/>
+      </w:pPr>
+      <w:r>
+        <w:rPr>
+          <w:rFonts w:ascii="Courier New" w:cs="Courier New" w:eastAsia="Courier New" w:hAnsi="Courier New"/>
+          <w:color w:val="222222"/>
           <w:sz w:val="18"/>
           <w:szCs w:val="18"/>
         </w:rPr>
@@ -4561,14 +4561,14 @@
     </w:p>
     <w:p>
       <w:pPr>
-        <w:shd w:fill="1E1E1E" w:color="1E1E1E" w:val="solid"/>
-        <w:spacing w:after="0"/>
-        <w:ind w:left="288" w:right="288"/>
-      </w:pPr>
-      <w:r>
-        <w:rPr>
-          <w:rFonts w:ascii="Courier New" w:cs="Courier New" w:eastAsia="Courier New" w:hAnsi="Courier New"/>
-          <w:color w:val="444444"/>
+        <w:shd w:fill="EFEFEF" w:color="EFEFEF" w:val="solid"/>
+        <w:spacing w:after="0"/>
+        <w:ind w:left="288" w:right="288"/>
+      </w:pPr>
+      <w:r>
+        <w:rPr>
+          <w:rFonts w:ascii="Courier New" w:cs="Courier New" w:eastAsia="Courier New" w:hAnsi="Courier New"/>
+          <w:color w:val="222222"/>
           <w:sz w:val="18"/>
           <w:szCs w:val="18"/>
         </w:rPr>
@@ -4577,14 +4577,14 @@
     </w:p>
     <w:p>
       <w:pPr>
-        <w:shd w:fill="1E1E1E" w:color="1E1E1E" w:val="solid"/>
-        <w:spacing w:after="0"/>
-        <w:ind w:left="288" w:right="288"/>
-      </w:pPr>
-      <w:r>
-        <w:rPr>
-          <w:rFonts w:ascii="Courier New" w:cs="Courier New" w:eastAsia="Courier New" w:hAnsi="Courier New"/>
-          <w:color w:val="444444"/>
+        <w:shd w:fill="EFEFEF" w:color="EFEFEF" w:val="solid"/>
+        <w:spacing w:after="0"/>
+        <w:ind w:left="288" w:right="288"/>
+      </w:pPr>
+      <w:r>
+        <w:rPr>
+          <w:rFonts w:ascii="Courier New" w:cs="Courier New" w:eastAsia="Courier New" w:hAnsi="Courier New"/>
+          <w:color w:val="222222"/>
           <w:sz w:val="18"/>
           <w:szCs w:val="18"/>
         </w:rPr>
@@ -4593,14 +4593,14 @@
     </w:p>
     <w:p>
       <w:pPr>
-        <w:shd w:fill="1E1E1E" w:color="1E1E1E" w:val="solid"/>
-        <w:spacing w:after="0"/>
-        <w:ind w:left="288" w:right="288"/>
-      </w:pPr>
-      <w:r>
-        <w:rPr>
-          <w:rFonts w:ascii="Courier New" w:cs="Courier New" w:eastAsia="Courier New" w:hAnsi="Courier New"/>
-          <w:color w:val="444444"/>
+        <w:shd w:fill="EFEFEF" w:color="EFEFEF" w:val="solid"/>
+        <w:spacing w:after="0"/>
+        <w:ind w:left="288" w:right="288"/>
+      </w:pPr>
+      <w:r>
+        <w:rPr>
+          <w:rFonts w:ascii="Courier New" w:cs="Courier New" w:eastAsia="Courier New" w:hAnsi="Courier New"/>
+          <w:color w:val="222222"/>
           <w:sz w:val="18"/>
           <w:szCs w:val="18"/>
         </w:rPr>
@@ -4609,7 +4609,7 @@
     </w:p>
     <w:p>
       <w:pPr>
-        <w:shd w:fill="1E1E1E" w:color="1E1E1E" w:val="solid"/>
+        <w:shd w:fill="EFEFEF" w:color="EFEFEF" w:val="solid"/>
         <w:spacing w:after="120"/>
       </w:pPr>
     </w:p>
@@ -4629,20 +4629,20 @@
     </w:p>
     <w:p>
       <w:pPr>
-        <w:shd w:fill="1E1E1E" w:color="1E1E1E" w:val="solid"/>
-        <w:spacing w:after="0"/>
-      </w:pPr>
-    </w:p>
-    <w:p>
-      <w:pPr>
-        <w:shd w:fill="1E1E1E" w:color="1E1E1E" w:val="solid"/>
-        <w:spacing w:after="0"/>
-        <w:ind w:left="288" w:right="288"/>
-      </w:pPr>
-      <w:r>
-        <w:rPr>
-          <w:rFonts w:ascii="Courier New" w:cs="Courier New" w:eastAsia="Courier New" w:hAnsi="Courier New"/>
-          <w:color w:val="444444"/>
+        <w:shd w:fill="EFEFEF" w:color="EFEFEF" w:val="solid"/>
+        <w:spacing w:after="0"/>
+      </w:pPr>
+    </w:p>
+    <w:p>
+      <w:pPr>
+        <w:shd w:fill="EFEFEF" w:color="EFEFEF" w:val="solid"/>
+        <w:spacing w:after="0"/>
+        <w:ind w:left="288" w:right="288"/>
+      </w:pPr>
+      <w:r>
+        <w:rPr>
+          <w:rFonts w:ascii="Courier New" w:cs="Courier New" w:eastAsia="Courier New" w:hAnsi="Courier New"/>
+          <w:color w:val="222222"/>
           <w:sz w:val="18"/>
           <w:szCs w:val="18"/>
         </w:rPr>
@@ -4651,14 +4651,14 @@
     </w:p>
     <w:p>
       <w:pPr>
-        <w:shd w:fill="1E1E1E" w:color="1E1E1E" w:val="solid"/>
-        <w:spacing w:after="0"/>
-        <w:ind w:left="288" w:right="288"/>
-      </w:pPr>
-      <w:r>
-        <w:rPr>
-          <w:rFonts w:ascii="Courier New" w:cs="Courier New" w:eastAsia="Courier New" w:hAnsi="Courier New"/>
-          <w:color w:val="444444"/>
+        <w:shd w:fill="EFEFEF" w:color="EFEFEF" w:val="solid"/>
+        <w:spacing w:after="0"/>
+        <w:ind w:left="288" w:right="288"/>
+      </w:pPr>
+      <w:r>
+        <w:rPr>
+          <w:rFonts w:ascii="Courier New" w:cs="Courier New" w:eastAsia="Courier New" w:hAnsi="Courier New"/>
+          <w:color w:val="222222"/>
           <w:sz w:val="18"/>
           <w:szCs w:val="18"/>
         </w:rPr>
@@ -4667,7 +4667,7 @@
     </w:p>
     <w:p>
       <w:pPr>
-        <w:shd w:fill="1E1E1E" w:color="1E1E1E" w:val="solid"/>
+        <w:shd w:fill="EFEFEF" w:color="EFEFEF" w:val="solid"/>
         <w:spacing w:after="120"/>
       </w:pPr>
     </w:p>
@@ -4687,20 +4687,20 @@
     </w:p>
     <w:p>
       <w:pPr>
-        <w:shd w:fill="1E1E1E" w:color="1E1E1E" w:val="solid"/>
-        <w:spacing w:after="0"/>
-      </w:pPr>
-    </w:p>
-    <w:p>
-      <w:pPr>
-        <w:shd w:fill="1E1E1E" w:color="1E1E1E" w:val="solid"/>
-        <w:spacing w:after="0"/>
-        <w:ind w:left="288" w:right="288"/>
-      </w:pPr>
-      <w:r>
-        <w:rPr>
-          <w:rFonts w:ascii="Courier New" w:cs="Courier New" w:eastAsia="Courier New" w:hAnsi="Courier New"/>
-          <w:color w:val="444444"/>
+        <w:shd w:fill="EFEFEF" w:color="EFEFEF" w:val="solid"/>
+        <w:spacing w:after="0"/>
+      </w:pPr>
+    </w:p>
+    <w:p>
+      <w:pPr>
+        <w:shd w:fill="EFEFEF" w:color="EFEFEF" w:val="solid"/>
+        <w:spacing w:after="0"/>
+        <w:ind w:left="288" w:right="288"/>
+      </w:pPr>
+      <w:r>
+        <w:rPr>
+          <w:rFonts w:ascii="Courier New" w:cs="Courier New" w:eastAsia="Courier New" w:hAnsi="Courier New"/>
+          <w:color w:val="222222"/>
           <w:sz w:val="18"/>
           <w:szCs w:val="18"/>
         </w:rPr>
@@ -4709,14 +4709,14 @@
     </w:p>
     <w:p>
       <w:pPr>
-        <w:shd w:fill="1E1E1E" w:color="1E1E1E" w:val="solid"/>
-        <w:spacing w:after="0"/>
-        <w:ind w:left="288" w:right="288"/>
-      </w:pPr>
-      <w:r>
-        <w:rPr>
-          <w:rFonts w:ascii="Courier New" w:cs="Courier New" w:eastAsia="Courier New" w:hAnsi="Courier New"/>
-          <w:color w:val="444444"/>
+        <w:shd w:fill="EFEFEF" w:color="EFEFEF" w:val="solid"/>
+        <w:spacing w:after="0"/>
+        <w:ind w:left="288" w:right="288"/>
+      </w:pPr>
+      <w:r>
+        <w:rPr>
+          <w:rFonts w:ascii="Courier New" w:cs="Courier New" w:eastAsia="Courier New" w:hAnsi="Courier New"/>
+          <w:color w:val="222222"/>
           <w:sz w:val="18"/>
           <w:szCs w:val="18"/>
         </w:rPr>
@@ -4725,14 +4725,14 @@
     </w:p>
     <w:p>
       <w:pPr>
-        <w:shd w:fill="1E1E1E" w:color="1E1E1E" w:val="solid"/>
-        <w:spacing w:after="0"/>
-        <w:ind w:left="288" w:right="288"/>
-      </w:pPr>
-      <w:r>
-        <w:rPr>
-          <w:rFonts w:ascii="Courier New" w:cs="Courier New" w:eastAsia="Courier New" w:hAnsi="Courier New"/>
-          <w:color w:val="444444"/>
+        <w:shd w:fill="EFEFEF" w:color="EFEFEF" w:val="solid"/>
+        <w:spacing w:after="0"/>
+        <w:ind w:left="288" w:right="288"/>
+      </w:pPr>
+      <w:r>
+        <w:rPr>
+          <w:rFonts w:ascii="Courier New" w:cs="Courier New" w:eastAsia="Courier New" w:hAnsi="Courier New"/>
+          <w:color w:val="222222"/>
           <w:sz w:val="18"/>
           <w:szCs w:val="18"/>
         </w:rPr>
@@ -4741,7 +4741,7 @@
     </w:p>
     <w:p>
       <w:pPr>
-        <w:shd w:fill="1E1E1E" w:color="1E1E1E" w:val="solid"/>
+        <w:shd w:fill="EFEFEF" w:color="EFEFEF" w:val="solid"/>
         <w:spacing w:after="120"/>
       </w:pPr>
     </w:p>
@@ -4761,20 +4761,20 @@
     </w:p>
     <w:p>
       <w:pPr>
-        <w:shd w:fill="1E1E1E" w:color="1E1E1E" w:val="solid"/>
-        <w:spacing w:after="0"/>
-      </w:pPr>
-    </w:p>
-    <w:p>
-      <w:pPr>
-        <w:shd w:fill="1E1E1E" w:color="1E1E1E" w:val="solid"/>
-        <w:spacing w:after="0"/>
-        <w:ind w:left="288" w:right="288"/>
-      </w:pPr>
-      <w:r>
-        <w:rPr>
-          <w:rFonts w:ascii="Courier New" w:cs="Courier New" w:eastAsia="Courier New" w:hAnsi="Courier New"/>
-          <w:color w:val="444444"/>
+        <w:shd w:fill="EFEFEF" w:color="EFEFEF" w:val="solid"/>
+        <w:spacing w:after="0"/>
+      </w:pPr>
+    </w:p>
+    <w:p>
+      <w:pPr>
+        <w:shd w:fill="EFEFEF" w:color="EFEFEF" w:val="solid"/>
+        <w:spacing w:after="0"/>
+        <w:ind w:left="288" w:right="288"/>
+      </w:pPr>
+      <w:r>
+        <w:rPr>
+          <w:rFonts w:ascii="Courier New" w:cs="Courier New" w:eastAsia="Courier New" w:hAnsi="Courier New"/>
+          <w:color w:val="222222"/>
           <w:sz w:val="18"/>
           <w:szCs w:val="18"/>
         </w:rPr>
@@ -4783,14 +4783,14 @@
     </w:p>
     <w:p>
       <w:pPr>
-        <w:shd w:fill="1E1E1E" w:color="1E1E1E" w:val="solid"/>
-        <w:spacing w:after="0"/>
-        <w:ind w:left="288" w:right="288"/>
-      </w:pPr>
-      <w:r>
-        <w:rPr>
-          <w:rFonts w:ascii="Courier New" w:cs="Courier New" w:eastAsia="Courier New" w:hAnsi="Courier New"/>
-          <w:color w:val="444444"/>
+        <w:shd w:fill="EFEFEF" w:color="EFEFEF" w:val="solid"/>
+        <w:spacing w:after="0"/>
+        <w:ind w:left="288" w:right="288"/>
+      </w:pPr>
+      <w:r>
+        <w:rPr>
+          <w:rFonts w:ascii="Courier New" w:cs="Courier New" w:eastAsia="Courier New" w:hAnsi="Courier New"/>
+          <w:color w:val="222222"/>
           <w:sz w:val="18"/>
           <w:szCs w:val="18"/>
         </w:rPr>
@@ -4799,7 +4799,7 @@
     </w:p>
     <w:p>
       <w:pPr>
-        <w:shd w:fill="1E1E1E" w:color="1E1E1E" w:val="solid"/>
+        <w:shd w:fill="EFEFEF" w:color="EFEFEF" w:val="solid"/>
         <w:spacing w:after="120"/>
       </w:pPr>
     </w:p>
@@ -4819,20 +4819,20 @@
     </w:p>
     <w:p>
       <w:pPr>
-        <w:shd w:fill="1E1E1E" w:color="1E1E1E" w:val="solid"/>
-        <w:spacing w:after="0"/>
-      </w:pPr>
-    </w:p>
-    <w:p>
-      <w:pPr>
-        <w:shd w:fill="1E1E1E" w:color="1E1E1E" w:val="solid"/>
-        <w:spacing w:after="0"/>
-        <w:ind w:left="288" w:right="288"/>
-      </w:pPr>
-      <w:r>
-        <w:rPr>
-          <w:rFonts w:ascii="Courier New" w:cs="Courier New" w:eastAsia="Courier New" w:hAnsi="Courier New"/>
-          <w:color w:val="444444"/>
+        <w:shd w:fill="EFEFEF" w:color="EFEFEF" w:val="solid"/>
+        <w:spacing w:after="0"/>
+      </w:pPr>
+    </w:p>
+    <w:p>
+      <w:pPr>
+        <w:shd w:fill="EFEFEF" w:color="EFEFEF" w:val="solid"/>
+        <w:spacing w:after="0"/>
+        <w:ind w:left="288" w:right="288"/>
+      </w:pPr>
+      <w:r>
+        <w:rPr>
+          <w:rFonts w:ascii="Courier New" w:cs="Courier New" w:eastAsia="Courier New" w:hAnsi="Courier New"/>
+          <w:color w:val="222222"/>
           <w:sz w:val="18"/>
           <w:szCs w:val="18"/>
         </w:rPr>
@@ -4841,14 +4841,14 @@
     </w:p>
     <w:p>
       <w:pPr>
-        <w:shd w:fill="1E1E1E" w:color="1E1E1E" w:val="solid"/>
-        <w:spacing w:after="0"/>
-        <w:ind w:left="288" w:right="288"/>
-      </w:pPr>
-      <w:r>
-        <w:rPr>
-          <w:rFonts w:ascii="Courier New" w:cs="Courier New" w:eastAsia="Courier New" w:hAnsi="Courier New"/>
-          <w:color w:val="444444"/>
+        <w:shd w:fill="EFEFEF" w:color="EFEFEF" w:val="solid"/>
+        <w:spacing w:after="0"/>
+        <w:ind w:left="288" w:right="288"/>
+      </w:pPr>
+      <w:r>
+        <w:rPr>
+          <w:rFonts w:ascii="Courier New" w:cs="Courier New" w:eastAsia="Courier New" w:hAnsi="Courier New"/>
+          <w:color w:val="222222"/>
           <w:sz w:val="18"/>
           <w:szCs w:val="18"/>
         </w:rPr>
@@ -4857,14 +4857,14 @@
     </w:p>
     <w:p>
       <w:pPr>
-        <w:shd w:fill="1E1E1E" w:color="1E1E1E" w:val="solid"/>
-        <w:spacing w:after="0"/>
-        <w:ind w:left="288" w:right="288"/>
-      </w:pPr>
-      <w:r>
-        <w:rPr>
-          <w:rFonts w:ascii="Courier New" w:cs="Courier New" w:eastAsia="Courier New" w:hAnsi="Courier New"/>
-          <w:color w:val="444444"/>
+        <w:shd w:fill="EFEFEF" w:color="EFEFEF" w:val="solid"/>
+        <w:spacing w:after="0"/>
+        <w:ind w:left="288" w:right="288"/>
+      </w:pPr>
+      <w:r>
+        <w:rPr>
+          <w:rFonts w:ascii="Courier New" w:cs="Courier New" w:eastAsia="Courier New" w:hAnsi="Courier New"/>
+          <w:color w:val="222222"/>
           <w:sz w:val="18"/>
           <w:szCs w:val="18"/>
         </w:rPr>
@@ -4873,14 +4873,14 @@
     </w:p>
     <w:p>
       <w:pPr>
-        <w:shd w:fill="1E1E1E" w:color="1E1E1E" w:val="solid"/>
-        <w:spacing w:after="0"/>
-        <w:ind w:left="288" w:right="288"/>
-      </w:pPr>
-      <w:r>
-        <w:rPr>
-          <w:rFonts w:ascii="Courier New" w:cs="Courier New" w:eastAsia="Courier New" w:hAnsi="Courier New"/>
-          <w:color w:val="444444"/>
+        <w:shd w:fill="EFEFEF" w:color="EFEFEF" w:val="solid"/>
+        <w:spacing w:after="0"/>
+        <w:ind w:left="288" w:right="288"/>
+      </w:pPr>
+      <w:r>
+        <w:rPr>
+          <w:rFonts w:ascii="Courier New" w:cs="Courier New" w:eastAsia="Courier New" w:hAnsi="Courier New"/>
+          <w:color w:val="222222"/>
           <w:sz w:val="18"/>
           <w:szCs w:val="18"/>
         </w:rPr>
@@ -4889,14 +4889,14 @@
     </w:p>
     <w:p>
       <w:pPr>
-        <w:shd w:fill="1E1E1E" w:color="1E1E1E" w:val="solid"/>
-        <w:spacing w:after="0"/>
-        <w:ind w:left="288" w:right="288"/>
-      </w:pPr>
-      <w:r>
-        <w:rPr>
-          <w:rFonts w:ascii="Courier New" w:cs="Courier New" w:eastAsia="Courier New" w:hAnsi="Courier New"/>
-          <w:color w:val="444444"/>
+        <w:shd w:fill="EFEFEF" w:color="EFEFEF" w:val="solid"/>
+        <w:spacing w:after="0"/>
+        <w:ind w:left="288" w:right="288"/>
+      </w:pPr>
+      <w:r>
+        <w:rPr>
+          <w:rFonts w:ascii="Courier New" w:cs="Courier New" w:eastAsia="Courier New" w:hAnsi="Courier New"/>
+          <w:color w:val="222222"/>
           <w:sz w:val="18"/>
           <w:szCs w:val="18"/>
         </w:rPr>
@@ -4905,7 +4905,7 @@
     </w:p>
     <w:p>
       <w:pPr>
-        <w:shd w:fill="1E1E1E" w:color="1E1E1E" w:val="solid"/>
+        <w:shd w:fill="EFEFEF" w:color="EFEFEF" w:val="solid"/>
         <w:spacing w:after="120"/>
       </w:pPr>
     </w:p>
@@ -4995,7 +4995,7 @@
             <w:r>
               <w:rPr>
                 <w:rFonts w:ascii="Courier New" w:cs="Courier New" w:eastAsia="Courier New" w:hAnsi="Courier New"/>
-                <w:color w:val="444444"/>
+                <w:color w:val="222222"/>
                 <w:sz w:val="18"/>
                 <w:szCs w:val="18"/>
               </w:rPr>
@@ -5039,7 +5039,7 @@
             <w:r>
               <w:rPr>
                 <w:rFonts w:ascii="Courier New" w:cs="Courier New" w:eastAsia="Courier New" w:hAnsi="Courier New"/>
-                <w:color w:val="444444"/>
+                <w:color w:val="222222"/>
                 <w:sz w:val="18"/>
                 <w:szCs w:val="18"/>
               </w:rPr>
@@ -5064,20 +5064,20 @@
     </w:p>
     <w:p>
       <w:pPr>
-        <w:shd w:fill="1E1E1E" w:color="1E1E1E" w:val="solid"/>
-        <w:spacing w:after="0"/>
-      </w:pPr>
-    </w:p>
-    <w:p>
-      <w:pPr>
-        <w:shd w:fill="1E1E1E" w:color="1E1E1E" w:val="solid"/>
-        <w:spacing w:after="0"/>
-        <w:ind w:left="288" w:right="288"/>
-      </w:pPr>
-      <w:r>
-        <w:rPr>
-          <w:rFonts w:ascii="Courier New" w:cs="Courier New" w:eastAsia="Courier New" w:hAnsi="Courier New"/>
-          <w:color w:val="444444"/>
+        <w:shd w:fill="EFEFEF" w:color="EFEFEF" w:val="solid"/>
+        <w:spacing w:after="0"/>
+      </w:pPr>
+    </w:p>
+    <w:p>
+      <w:pPr>
+        <w:shd w:fill="EFEFEF" w:color="EFEFEF" w:val="solid"/>
+        <w:spacing w:after="0"/>
+        <w:ind w:left="288" w:right="288"/>
+      </w:pPr>
+      <w:r>
+        <w:rPr>
+          <w:rFonts w:ascii="Courier New" w:cs="Courier New" w:eastAsia="Courier New" w:hAnsi="Courier New"/>
+          <w:color w:val="222222"/>
           <w:sz w:val="18"/>
           <w:szCs w:val="18"/>
         </w:rPr>
@@ -5086,14 +5086,14 @@
     </w:p>
     <w:p>
       <w:pPr>
-        <w:shd w:fill="1E1E1E" w:color="1E1E1E" w:val="solid"/>
-        <w:spacing w:after="0"/>
-        <w:ind w:left="288" w:right="288"/>
-      </w:pPr>
-      <w:r>
-        <w:rPr>
-          <w:rFonts w:ascii="Courier New" w:cs="Courier New" w:eastAsia="Courier New" w:hAnsi="Courier New"/>
-          <w:color w:val="444444"/>
+        <w:shd w:fill="EFEFEF" w:color="EFEFEF" w:val="solid"/>
+        <w:spacing w:after="0"/>
+        <w:ind w:left="288" w:right="288"/>
+      </w:pPr>
+      <w:r>
+        <w:rPr>
+          <w:rFonts w:ascii="Courier New" w:cs="Courier New" w:eastAsia="Courier New" w:hAnsi="Courier New"/>
+          <w:color w:val="222222"/>
           <w:sz w:val="18"/>
           <w:szCs w:val="18"/>
         </w:rPr>
@@ -5102,7 +5102,7 @@
     </w:p>
     <w:p>
       <w:pPr>
-        <w:shd w:fill="1E1E1E" w:color="1E1E1E" w:val="solid"/>
+        <w:shd w:fill="EFEFEF" w:color="EFEFEF" w:val="solid"/>
         <w:spacing w:after="120"/>
       </w:pPr>
     </w:p>
@@ -5192,7 +5192,7 @@
             <w:r>
               <w:rPr>
                 <w:rFonts w:ascii="Courier New" w:cs="Courier New" w:eastAsia="Courier New" w:hAnsi="Courier New"/>
-                <w:color w:val="444444"/>
+                <w:color w:val="222222"/>
                 <w:sz w:val="18"/>
                 <w:szCs w:val="18"/>
               </w:rPr>
@@ -5236,7 +5236,7 @@
             <w:r>
               <w:rPr>
                 <w:rFonts w:ascii="Courier New" w:cs="Courier New" w:eastAsia="Courier New" w:hAnsi="Courier New"/>
-                <w:color w:val="444444"/>
+                <w:color w:val="222222"/>
                 <w:sz w:val="18"/>
                 <w:szCs w:val="18"/>
               </w:rPr>
@@ -5280,7 +5280,7 @@
             <w:r>
               <w:rPr>
                 <w:rFonts w:ascii="Courier New" w:cs="Courier New" w:eastAsia="Courier New" w:hAnsi="Courier New"/>
-                <w:color w:val="444444"/>
+                <w:color w:val="222222"/>
                 <w:sz w:val="18"/>
                 <w:szCs w:val="18"/>
               </w:rPr>
@@ -5324,7 +5324,7 @@
             <w:r>
               <w:rPr>
                 <w:rFonts w:ascii="Courier New" w:cs="Courier New" w:eastAsia="Courier New" w:hAnsi="Courier New"/>
-                <w:color w:val="444444"/>
+                <w:color w:val="222222"/>
                 <w:sz w:val="18"/>
                 <w:szCs w:val="18"/>
               </w:rPr>
@@ -5368,7 +5368,7 @@
             <w:r>
               <w:rPr>
                 <w:rFonts w:ascii="Courier New" w:cs="Courier New" w:eastAsia="Courier New" w:hAnsi="Courier New"/>
-                <w:color w:val="444444"/>
+                <w:color w:val="222222"/>
                 <w:sz w:val="18"/>
                 <w:szCs w:val="18"/>
               </w:rPr>
@@ -5693,7 +5693,7 @@
             <w:r>
               <w:rPr>
                 <w:rFonts w:ascii="Courier New" w:cs="Courier New" w:eastAsia="Courier New" w:hAnsi="Courier New"/>
-                <w:color w:val="444444"/>
+                <w:color w:val="222222"/>
                 <w:sz w:val="18"/>
                 <w:szCs w:val="18"/>
               </w:rPr>
@@ -5737,7 +5737,7 @@
             <w:r>
               <w:rPr>
                 <w:rFonts w:ascii="Courier New" w:cs="Courier New" w:eastAsia="Courier New" w:hAnsi="Courier New"/>
-                <w:color w:val="444444"/>
+                <w:color w:val="222222"/>
                 <w:sz w:val="18"/>
                 <w:szCs w:val="18"/>
               </w:rPr>
@@ -5781,7 +5781,7 @@
             <w:r>
               <w:rPr>
                 <w:rFonts w:ascii="Courier New" w:cs="Courier New" w:eastAsia="Courier New" w:hAnsi="Courier New"/>
-                <w:color w:val="444444"/>
+                <w:color w:val="222222"/>
                 <w:sz w:val="18"/>
                 <w:szCs w:val="18"/>
               </w:rPr>
@@ -5825,7 +5825,7 @@
             <w:r>
               <w:rPr>
                 <w:rFonts w:ascii="Courier New" w:cs="Courier New" w:eastAsia="Courier New" w:hAnsi="Courier New"/>
-                <w:color w:val="444444"/>
+                <w:color w:val="222222"/>
                 <w:sz w:val="18"/>
                 <w:szCs w:val="18"/>
               </w:rPr>
@@ -5869,7 +5869,7 @@
             <w:r>
               <w:rPr>
                 <w:rFonts w:ascii="Courier New" w:cs="Courier New" w:eastAsia="Courier New" w:hAnsi="Courier New"/>
-                <w:color w:val="444444"/>
+                <w:color w:val="222222"/>
                 <w:sz w:val="18"/>
                 <w:szCs w:val="18"/>
               </w:rPr>
@@ -5913,7 +5913,7 @@
             <w:r>
               <w:rPr>
                 <w:rFonts w:ascii="Courier New" w:cs="Courier New" w:eastAsia="Courier New" w:hAnsi="Courier New"/>
-                <w:color w:val="444444"/>
+                <w:color w:val="222222"/>
                 <w:sz w:val="18"/>
                 <w:szCs w:val="18"/>
               </w:rPr>
@@ -5957,7 +5957,7 @@
             <w:r>
               <w:rPr>
                 <w:rFonts w:ascii="Courier New" w:cs="Courier New" w:eastAsia="Courier New" w:hAnsi="Courier New"/>
-                <w:color w:val="444444"/>
+                <w:color w:val="222222"/>
                 <w:sz w:val="18"/>
                 <w:szCs w:val="18"/>
               </w:rPr>
@@ -6040,7 +6040,7 @@
             <w:r>
               <w:rPr>
                 <w:rFonts w:ascii="Courier New" w:cs="Courier New" w:eastAsia="Courier New" w:hAnsi="Courier New"/>
-                <w:color w:val="444444"/>
+                <w:color w:val="222222"/>
                 <w:sz w:val="18"/>
                 <w:szCs w:val="18"/>
               </w:rPr>
@@ -6084,7 +6084,7 @@
             <w:r>
               <w:rPr>
                 <w:rFonts w:ascii="Courier New" w:cs="Courier New" w:eastAsia="Courier New" w:hAnsi="Courier New"/>
-                <w:color w:val="444444"/>
+                <w:color w:val="222222"/>
                 <w:sz w:val="18"/>
                 <w:szCs w:val="18"/>
               </w:rPr>
@@ -6128,7 +6128,7 @@
             <w:r>
               <w:rPr>
                 <w:rFonts w:ascii="Courier New" w:cs="Courier New" w:eastAsia="Courier New" w:hAnsi="Courier New"/>
-                <w:color w:val="444444"/>
+                <w:color w:val="222222"/>
                 <w:sz w:val="18"/>
                 <w:szCs w:val="18"/>
               </w:rPr>
@@ -6172,7 +6172,7 @@
             <w:r>
               <w:rPr>
                 <w:rFonts w:ascii="Courier New" w:cs="Courier New" w:eastAsia="Courier New" w:hAnsi="Courier New"/>
-                <w:color w:val="444444"/>
+                <w:color w:val="222222"/>
                 <w:sz w:val="18"/>
                 <w:szCs w:val="18"/>
               </w:rPr>
@@ -6245,20 +6245,20 @@
     </w:p>
     <w:p>
       <w:pPr>
-        <w:shd w:fill="1E1E1E" w:color="1E1E1E" w:val="solid"/>
-        <w:spacing w:after="0"/>
-      </w:pPr>
-    </w:p>
-    <w:p>
-      <w:pPr>
-        <w:shd w:fill="1E1E1E" w:color="1E1E1E" w:val="solid"/>
-        <w:spacing w:after="0"/>
-        <w:ind w:left="288" w:right="288"/>
-      </w:pPr>
-      <w:r>
-        <w:rPr>
-          <w:rFonts w:ascii="Courier New" w:cs="Courier New" w:eastAsia="Courier New" w:hAnsi="Courier New"/>
-          <w:color w:val="444444"/>
+        <w:shd w:fill="EFEFEF" w:color="EFEFEF" w:val="solid"/>
+        <w:spacing w:after="0"/>
+      </w:pPr>
+    </w:p>
+    <w:p>
+      <w:pPr>
+        <w:shd w:fill="EFEFEF" w:color="EFEFEF" w:val="solid"/>
+        <w:spacing w:after="0"/>
+        <w:ind w:left="288" w:right="288"/>
+      </w:pPr>
+      <w:r>
+        <w:rPr>
+          <w:rFonts w:ascii="Courier New" w:cs="Courier New" w:eastAsia="Courier New" w:hAnsi="Courier New"/>
+          <w:color w:val="222222"/>
           <w:sz w:val="18"/>
           <w:szCs w:val="18"/>
         </w:rPr>
@@ -6267,14 +6267,14 @@
     </w:p>
     <w:p>
       <w:pPr>
-        <w:shd w:fill="1E1E1E" w:color="1E1E1E" w:val="solid"/>
-        <w:spacing w:after="0"/>
-        <w:ind w:left="288" w:right="288"/>
-      </w:pPr>
-      <w:r>
-        <w:rPr>
-          <w:rFonts w:ascii="Courier New" w:cs="Courier New" w:eastAsia="Courier New" w:hAnsi="Courier New"/>
-          <w:color w:val="444444"/>
+        <w:shd w:fill="EFEFEF" w:color="EFEFEF" w:val="solid"/>
+        <w:spacing w:after="0"/>
+        <w:ind w:left="288" w:right="288"/>
+      </w:pPr>
+      <w:r>
+        <w:rPr>
+          <w:rFonts w:ascii="Courier New" w:cs="Courier New" w:eastAsia="Courier New" w:hAnsi="Courier New"/>
+          <w:color w:val="222222"/>
           <w:sz w:val="18"/>
           <w:szCs w:val="18"/>
         </w:rPr>
@@ -6283,14 +6283,14 @@
     </w:p>
     <w:p>
       <w:pPr>
-        <w:shd w:fill="1E1E1E" w:color="1E1E1E" w:val="solid"/>
-        <w:spacing w:after="0"/>
-        <w:ind w:left="288" w:right="288"/>
-      </w:pPr>
-      <w:r>
-        <w:rPr>
-          <w:rFonts w:ascii="Courier New" w:cs="Courier New" w:eastAsia="Courier New" w:hAnsi="Courier New"/>
-          <w:color w:val="444444"/>
+        <w:shd w:fill="EFEFEF" w:color="EFEFEF" w:val="solid"/>
+        <w:spacing w:after="0"/>
+        <w:ind w:left="288" w:right="288"/>
+      </w:pPr>
+      <w:r>
+        <w:rPr>
+          <w:rFonts w:ascii="Courier New" w:cs="Courier New" w:eastAsia="Courier New" w:hAnsi="Courier New"/>
+          <w:color w:val="222222"/>
           <w:sz w:val="18"/>
           <w:szCs w:val="18"/>
         </w:rPr>
@@ -6299,7 +6299,7 @@
     </w:p>
     <w:p>
       <w:pPr>
-        <w:shd w:fill="1E1E1E" w:color="1E1E1E" w:val="solid"/>
+        <w:shd w:fill="EFEFEF" w:color="EFEFEF" w:val="solid"/>
         <w:spacing w:after="120"/>
       </w:pPr>
     </w:p>
@@ -6353,20 +6353,20 @@
     </w:p>
     <w:p>
       <w:pPr>
-        <w:shd w:fill="1E1E1E" w:color="1E1E1E" w:val="solid"/>
-        <w:spacing w:after="0"/>
-      </w:pPr>
-    </w:p>
-    <w:p>
-      <w:pPr>
-        <w:shd w:fill="1E1E1E" w:color="1E1E1E" w:val="solid"/>
-        <w:spacing w:after="0"/>
-        <w:ind w:left="288" w:right="288"/>
-      </w:pPr>
-      <w:r>
-        <w:rPr>
-          <w:rFonts w:ascii="Courier New" w:cs="Courier New" w:eastAsia="Courier New" w:hAnsi="Courier New"/>
-          <w:color w:val="444444"/>
+        <w:shd w:fill="EFEFEF" w:color="EFEFEF" w:val="solid"/>
+        <w:spacing w:after="0"/>
+      </w:pPr>
+    </w:p>
+    <w:p>
+      <w:pPr>
+        <w:shd w:fill="EFEFEF" w:color="EFEFEF" w:val="solid"/>
+        <w:spacing w:after="0"/>
+        <w:ind w:left="288" w:right="288"/>
+      </w:pPr>
+      <w:r>
+        <w:rPr>
+          <w:rFonts w:ascii="Courier New" w:cs="Courier New" w:eastAsia="Courier New" w:hAnsi="Courier New"/>
+          <w:color w:val="222222"/>
           <w:sz w:val="18"/>
           <w:szCs w:val="18"/>
         </w:rPr>
@@ -6375,7 +6375,7 @@
     </w:p>
     <w:p>
       <w:pPr>
-        <w:shd w:fill="1E1E1E" w:color="1E1E1E" w:val="solid"/>
+        <w:shd w:fill="EFEFEF" w:color="EFEFEF" w:val="solid"/>
         <w:spacing w:after="120"/>
       </w:pPr>
     </w:p>

</xml_diff>